<commit_message>
feat(operat): render pairwise method and preserve legacy signing
</commit_message>
<xml_diff>
--- a/apps/web/templates/operat-szablon.docx
+++ b/apps/web/templates/operat-szablon.docx
@@ -12111,6 +12111,18 @@
     </w:p>
     <w:p>
       <w:pPr>
+        <w:spacing w:after="100"/>
+      </w:pPr>
+      <w:r>
+        <w:rPr>
+          <w:rFonts w:ascii="Calibri" w:hAnsi="Calibri"/>
+          <w:sz w:val="22"/>
+        </w:rPr>
+        <w:t xml:space="preserve">{#metoda_kcs}</w:t>
+      </w:r>
+    </w:p>
+    <w:p>
+      <w:pPr>
         <w:pStyle w:val="Tekstpodstawowy22"/>
         <w:tabs>
           <w:tab w:val="left" w:pos="2268"/>
@@ -12119,213 +12131,17 @@
         <w:jc w:val="both"/>
         <w:rPr>
           <w:rFonts w:ascii="Segoe UI" w:hAnsi="Segoe UI" w:cs="Segoe UI"/>
-          <w:b/>
-          <w:sz w:val="20"/>
-          <w:szCs w:val="20"/>
-        </w:rPr>
-      </w:pPr>
-      <w:r>
-        <w:rPr>
-          <w:rFonts w:ascii="Segoe UI" w:hAnsi="Segoe UI" w:cs="Segoe UI"/>
-          <w:sz w:val="20"/>
-          <w:szCs w:val="20"/>
-        </w:rPr>
-        <w:t>W podejściu porównawczym stosuje się:</w:t>
-      </w:r>
-    </w:p>
-    <w:p>
-      <w:pPr>
-        <w:pStyle w:val="Tekstpodstawowy22"/>
-        <w:numPr>
-          <w:ilvl w:val="0"/>
-          <w:numId w:val="8"/>
-        </w:numPr>
-        <w:tabs>
-          <w:tab w:val="num" w:pos="720"/>
-          <w:tab w:val="left" w:pos="2268"/>
-        </w:tabs>
-        <w:spacing w:after="0" w:line="276" w:lineRule="auto"/>
-        <w:jc w:val="both"/>
-        <w:rPr>
-          <w:rFonts w:ascii="Segoe UI" w:hAnsi="Segoe UI" w:cs="Segoe UI"/>
-          <w:bCs/>
-          <w:sz w:val="20"/>
-          <w:szCs w:val="20"/>
-        </w:rPr>
-      </w:pPr>
-      <w:r>
-        <w:rPr>
-          <w:rFonts w:ascii="Segoe UI" w:hAnsi="Segoe UI" w:cs="Segoe UI"/>
-          <w:bCs/>
-          <w:sz w:val="20"/>
-          <w:szCs w:val="20"/>
-        </w:rPr>
-        <w:t xml:space="preserve">metodę porównywania parami, </w:t>
-      </w:r>
-    </w:p>
-    <w:p>
-      <w:pPr>
-        <w:pStyle w:val="Tekstpodstawowy22"/>
-        <w:numPr>
-          <w:ilvl w:val="0"/>
-          <w:numId w:val="8"/>
-        </w:numPr>
-        <w:tabs>
-          <w:tab w:val="num" w:pos="720"/>
-          <w:tab w:val="left" w:pos="2268"/>
-        </w:tabs>
-        <w:spacing w:after="0" w:line="276" w:lineRule="auto"/>
-        <w:jc w:val="both"/>
-        <w:rPr>
-          <w:rFonts w:ascii="Segoe UI" w:hAnsi="Segoe UI" w:cs="Segoe UI"/>
-          <w:b/>
-          <w:bCs/>
-          <w:sz w:val="20"/>
-          <w:szCs w:val="20"/>
-        </w:rPr>
-      </w:pPr>
-      <w:r>
-        <w:rPr>
-          <w:rFonts w:ascii="Segoe UI" w:hAnsi="Segoe UI" w:cs="Segoe UI"/>
-          <w:b/>
-          <w:bCs/>
-          <w:sz w:val="20"/>
-          <w:szCs w:val="20"/>
-        </w:rPr>
-        <w:t>metodę korygowania ceny średniej,</w:t>
-      </w:r>
-    </w:p>
-    <w:p>
-      <w:pPr>
-        <w:pStyle w:val="Tekstpodstawowy22"/>
-        <w:numPr>
-          <w:ilvl w:val="0"/>
-          <w:numId w:val="8"/>
-        </w:numPr>
-        <w:tabs>
-          <w:tab w:val="num" w:pos="720"/>
-          <w:tab w:val="left" w:pos="2268"/>
-        </w:tabs>
-        <w:spacing w:after="0" w:line="276" w:lineRule="auto"/>
-        <w:jc w:val="both"/>
-        <w:rPr>
-          <w:rFonts w:ascii="Segoe UI" w:hAnsi="Segoe UI" w:cs="Segoe UI"/>
-          <w:sz w:val="20"/>
-          <w:szCs w:val="20"/>
-        </w:rPr>
-      </w:pPr>
-      <w:r>
-        <w:rPr>
-          <w:rFonts w:ascii="Segoe UI" w:hAnsi="Segoe UI" w:cs="Segoe UI"/>
-          <w:sz w:val="20"/>
-          <w:szCs w:val="20"/>
-        </w:rPr>
-        <w:t>metodę analizy statystycznej rynku.</w:t>
-      </w:r>
-    </w:p>
-    <w:p>
-      <w:pPr>
-        <w:pStyle w:val="Tekstpodstawowy22"/>
-        <w:tabs>
-          <w:tab w:val="left" w:pos="2268"/>
-        </w:tabs>
-        <w:spacing w:after="0" w:line="276" w:lineRule="auto"/>
-        <w:jc w:val="both"/>
-        <w:rPr>
-          <w:rFonts w:ascii="Segoe UI" w:hAnsi="Segoe UI" w:cs="Segoe UI"/>
-          <w:sz w:val="20"/>
-          <w:szCs w:val="20"/>
-        </w:rPr>
-      </w:pPr>
-    </w:p>
-    <w:p>
-      <w:pPr>
-        <w:pStyle w:val="Tekstpodstawowy22"/>
-        <w:tabs>
-          <w:tab w:val="left" w:pos="2268"/>
-        </w:tabs>
-        <w:spacing w:after="0" w:line="276" w:lineRule="auto"/>
-        <w:jc w:val="both"/>
-        <w:rPr>
-          <w:rFonts w:ascii="Segoe UI" w:hAnsi="Segoe UI" w:cs="Segoe UI"/>
-          <w:i/>
-          <w:iCs/>
-          <w:sz w:val="20"/>
-          <w:szCs w:val="20"/>
-        </w:rPr>
-      </w:pPr>
-      <w:r>
-        <w:rPr>
-          <w:rFonts w:ascii="Segoe UI" w:hAnsi="Segoe UI" w:cs="Segoe UI"/>
-          <w:bCs/>
+          <w:sz w:val="20"/>
+          <w:szCs w:val="20"/>
+        </w:rPr>
+      </w:pPr>
+      <w:r>
+        <w:rPr>
+          <w:rFonts w:ascii="Segoe UI" w:hAnsi="Segoe UI" w:cs="Segoe UI"/>
           <w:sz w:val="20"/>
           <w:szCs w:val="20"/>
           <w:u w:val="single"/>
         </w:rPr>
-        <w:t>Metoda porównywania parami</w:t>
-      </w:r>
-      <w:r>
-        <w:rPr>
-          <w:rFonts w:ascii="Segoe UI" w:hAnsi="Segoe UI" w:cs="Segoe UI"/>
-          <w:b/>
-          <w:i/>
-          <w:iCs/>
-          <w:sz w:val="20"/>
-          <w:szCs w:val="20"/>
-        </w:rPr>
-        <w:t xml:space="preserve"> </w:t>
-      </w:r>
-      <w:r>
-        <w:rPr>
-          <w:rFonts w:ascii="Segoe UI" w:hAnsi="Segoe UI" w:cs="Segoe UI"/>
-          <w:bCs/>
-          <w:i/>
-          <w:iCs/>
-          <w:sz w:val="20"/>
-          <w:szCs w:val="20"/>
-        </w:rPr>
-        <w:t>–</w:t>
-      </w:r>
-      <w:r>
-        <w:rPr>
-          <w:rFonts w:ascii="Segoe UI" w:hAnsi="Segoe UI" w:cs="Segoe UI"/>
-          <w:i/>
-          <w:iCs/>
-          <w:sz w:val="20"/>
-          <w:szCs w:val="20"/>
-        </w:rPr>
-        <w:t xml:space="preserve"> </w:t>
-      </w:r>
-      <w:r>
-        <w:rPr>
-          <w:rFonts w:ascii="Segoe UI" w:hAnsi="Segoe UI" w:cs="Segoe UI"/>
-          <w:sz w:val="20"/>
-          <w:szCs w:val="20"/>
-        </w:rPr>
-        <w:t>porównuje się nieruchomość będącą przedmiotem wyceny, której cechy są znane, kolejno z nieruchomościami podobnymi, które były przedmiotem obrotu rynkowego               i dla których znane są ceny transakcyjne, warunki zawarcia transakcji oraz cechy tych nieruchomości. Do porównań wybiera się co najmniej trzy nieruchomości ze zbioru nieruchomości podobnych stanowiącego podstawę wyceny. Korekty cen transakcyjnych dokonuje się na podstawie różnic ocen cech rynkowych nieruchomości wycenianej i nieruchomości przyjętych do porównań określonych                     w przyjętych skalach.</w:t>
-      </w:r>
-    </w:p>
-    <w:p>
-      <w:pPr>
-        <w:pStyle w:val="Tekstpodstawowy22"/>
-        <w:tabs>
-          <w:tab w:val="left" w:pos="2268"/>
-        </w:tabs>
-        <w:spacing w:after="0" w:line="276" w:lineRule="auto"/>
-        <w:jc w:val="both"/>
-        <w:rPr>
-          <w:rFonts w:ascii="Segoe UI" w:hAnsi="Segoe UI" w:cs="Segoe UI"/>
-          <w:sz w:val="20"/>
-          <w:szCs w:val="20"/>
-        </w:rPr>
-      </w:pPr>
-      <w:r>
-        <w:rPr>
-          <w:rFonts w:ascii="Segoe UI" w:hAnsi="Segoe UI" w:cs="Segoe UI"/>
-          <w:sz w:val="20"/>
-          <w:szCs w:val="20"/>
-          <w:u w:val="single"/>
-        </w:rPr>
         <w:t>Metoda korygowania ceny średniej</w:t>
       </w:r>
       <w:r>
@@ -12336,52 +12152,6 @@
         </w:rPr>
         <w:t xml:space="preserve"> – przyjmuje się co najmniej kilkanaście nieruchomości podobnych, które były przedmiotem obrotu rynkowego i dla których znane są ceny transakcyjne, warunki zawarcia transakcji oraz cechy tych nieruchomości. Wartość nieruchomości określa się w drodze korekty średniej ceny nieruchomości podobnych w zbiorze stanowiącym podstawę wyceny współczynnikami korygującymi wynikającymi z oceny wycenianej nieruchomości w odniesieniu do przyjętej skali ocen poszczególnych cech rynkowych, z uwzględnieniem położenia ceny średniej w przedziale pomiędzy ceną minimalną i ceną maksymalną.</w:t>
       </w:r>
-    </w:p>
-    <w:p>
-      <w:pPr>
-        <w:pStyle w:val="Tekstpodstawowy22"/>
-        <w:tabs>
-          <w:tab w:val="left" w:pos="2268"/>
-        </w:tabs>
-        <w:spacing w:after="0" w:line="276" w:lineRule="auto"/>
-        <w:jc w:val="both"/>
-        <w:rPr>
-          <w:rFonts w:ascii="Segoe UI" w:hAnsi="Segoe UI" w:cs="Segoe UI"/>
-          <w:sz w:val="20"/>
-          <w:szCs w:val="20"/>
-        </w:rPr>
-      </w:pPr>
-      <w:r>
-        <w:rPr>
-          <w:rFonts w:ascii="Segoe UI" w:hAnsi="Segoe UI" w:cs="Segoe UI"/>
-          <w:sz w:val="20"/>
-          <w:szCs w:val="20"/>
-          <w:u w:val="single"/>
-        </w:rPr>
-        <w:t>Metoda analizy statystycznej rynku</w:t>
-      </w:r>
-      <w:r>
-        <w:rPr>
-          <w:rFonts w:ascii="Segoe UI" w:hAnsi="Segoe UI" w:cs="Segoe UI"/>
-          <w:sz w:val="20"/>
-          <w:szCs w:val="20"/>
-        </w:rPr>
-        <w:t xml:space="preserve"> – przyjmuje się zbiór cen transakcyjnych właściwych do określenia wartości nieruchomości reprezentatywnych, o których mowa w art. 161 ust. 2 ustawy. Wartość nieruchomości określa się przy użyciu metod stosowanych do analiz statystycznych. Przy tworzeniu zbioru cen transakcyjnych właściwych do określenia wartości nieruchomości reprezentatywnych przepis § 5 ust. 2 stosuje się odpowiednio.</w:t>
-      </w:r>
-    </w:p>
-    <w:p>
-      <w:pPr>
-        <w:pStyle w:val="Tekstpodstawowywcity2"/>
-        <w:spacing w:after="0" w:line="276" w:lineRule="auto"/>
-        <w:ind w:left="0"/>
-        <w:jc w:val="both"/>
-        <w:rPr>
-          <w:rFonts w:ascii="Segoe UI" w:hAnsi="Segoe UI" w:cs="Segoe UI"/>
-          <w:sz w:val="20"/>
-          <w:szCs w:val="20"/>
-          <w:u w:val="single"/>
-        </w:rPr>
-      </w:pPr>
     </w:p>
     <w:p>
       <w:pPr>
@@ -13296,6 +13066,66 @@
     </w:p>
     <w:p>
       <w:pPr>
+        <w:spacing w:after="100"/>
+      </w:pPr>
+      <w:r>
+        <w:rPr>
+          <w:rFonts w:ascii="Calibri" w:hAnsi="Calibri"/>
+          <w:sz w:val="22"/>
+        </w:rPr>
+        <w:t xml:space="preserve">{/metoda_kcs}</w:t>
+      </w:r>
+    </w:p>
+    <w:p>
+      <w:pPr>
+        <w:spacing w:after="100"/>
+      </w:pPr>
+      <w:r>
+        <w:rPr>
+          <w:rFonts w:ascii="Calibri" w:hAnsi="Calibri"/>
+          <w:sz w:val="22"/>
+        </w:rPr>
+        <w:t xml:space="preserve">{#metoda_pp}</w:t>
+      </w:r>
+    </w:p>
+    <w:p>
+      <w:pPr>
+        <w:spacing w:after="100"/>
+      </w:pPr>
+      <w:r>
+        <w:rPr>
+          <w:rFonts w:ascii="Calibri" w:hAnsi="Calibri"/>
+          <w:sz w:val="22"/>
+        </w:rPr>
+        <w:t xml:space="preserve">Dla określenia wartości rynkowej {przedmiot_d} zastosowano podejście porównawcze, metodę porównywania parami.</w:t>
+      </w:r>
+    </w:p>
+    <w:p>
+      <w:pPr>
+        <w:spacing w:after="100"/>
+      </w:pPr>
+      <w:r>
+        <w:rPr>
+          <w:rFonts w:ascii="Calibri" w:hAnsi="Calibri"/>
+          <w:sz w:val="22"/>
+        </w:rPr>
+        <w:t xml:space="preserve">Do porównań przyjęto {pp_count} transakcji. Oceniono cechy przedmiotu i każdego porównania na przyjętych skalach. Poprawki kwotowe wynikają z rozstępu cen, wag cech i mnożników przyjętych przez rzeczoznawcę. Dodatnia poprawka oznacza przewagę przedmiotu nad porównaniem. Cenę każdego porównania skorygowano o sumę poprawek; średnią cen skorygowanych pomnożono przez powierzchnię przedmiotu.</w:t>
+      </w:r>
+    </w:p>
+    <w:p>
+      <w:pPr>
+        <w:spacing w:after="100"/>
+      </w:pPr>
+      <w:r>
+        <w:rPr>
+          <w:rFonts w:ascii="Calibri" w:hAnsi="Calibri"/>
+          <w:sz w:val="22"/>
+        </w:rPr>
+        <w:t xml:space="preserve">{/metoda_pp}</w:t>
+      </w:r>
+    </w:p>
+    <w:p>
+      <w:pPr>
         <w:spacing w:line="276" w:lineRule="auto"/>
         <w:contextualSpacing/>
         <w:jc w:val="both"/>
@@ -13457,7 +13287,7 @@
           <w:sz w:val="20"/>
           <w:szCs w:val="20"/>
         </w:rPr>
-        <w:t>korygowania ceny średniej</w:t>
+        <w:t>{metoda_nazwa}</w:t>
       </w:r>
       <w:r>
         <w:rPr>
@@ -13745,7 +13575,7 @@
           <w:sz w:val="20"/>
           <w:szCs w:val="20"/>
         </w:rPr>
-        <w:t>korygowania ceny średniej</w:t>
+        <w:t>{metoda_nazwa}</w:t>
       </w:r>
       <w:r>
         <w:rPr>
@@ -14805,6 +14635,18 @@
     </w:p>
     <w:p>
       <w:pPr>
+        <w:spacing w:after="100"/>
+      </w:pPr>
+      <w:r>
+        <w:rPr>
+          <w:rFonts w:ascii="Calibri" w:hAnsi="Calibri"/>
+          <w:sz w:val="22"/>
+        </w:rPr>
+        <w:t xml:space="preserve">{#metoda_kcs}</w:t>
+      </w:r>
+    </w:p>
+    <w:p>
+      <w:pPr>
         <w:spacing w:line="276" w:lineRule="auto"/>
         <w:rPr>
           <w:rFonts w:ascii="Segoe UI" w:hAnsi="Segoe UI" w:cs="Segoe UI"/>
@@ -16825,7 +16667,7 @@
                 <w:sz w:val="18"/>
                 <w:szCs w:val="18"/>
               </w:rPr>
-              <w:t>100</w:t>
+              <w:t>{suma_wag}</w:t>
             </w:r>
           </w:p>
         </w:tc>
@@ -16886,7 +16728,7 @@
                 <w:sz w:val="18"/>
                 <w:szCs w:val="18"/>
               </w:rPr>
-              <w:t>1,000</w:t>
+              <w:t>{suma_ui_sr}</w:t>
             </w:r>
           </w:p>
         </w:tc>
@@ -16964,6 +16806,18 @@
           <w:szCs w:val="18"/>
         </w:rPr>
         <w:t>Źródło: Opracowanie własne</w:t>
+      </w:r>
+    </w:p>
+    <w:p>
+      <w:pPr>
+        <w:spacing w:after="100"/>
+      </w:pPr>
+      <w:r>
+        <w:rPr>
+          <w:rFonts w:ascii="Calibri" w:hAnsi="Calibri"/>
+          <w:sz w:val="22"/>
+        </w:rPr>
+        <w:t xml:space="preserve">{#skala_mieszana}Kreska w kolumnie środkowej oznacza brak oceny pośredniej w skali dwupoziomowej. Suma środkowa nie jest określona dla zestawu zawierającego taką skalę.{/skala_mieszana}</w:t>
       </w:r>
     </w:p>
     <w:p>
@@ -18331,6 +18185,1365 @@
           <w:szCs w:val="20"/>
         </w:rPr>
       </w:pPr>
+    </w:p>
+    <w:p>
+      <w:pPr>
+        <w:spacing w:after="100"/>
+      </w:pPr>
+      <w:r>
+        <w:rPr>
+          <w:rFonts w:ascii="Calibri" w:hAnsi="Calibri"/>
+          <w:sz w:val="22"/>
+        </w:rPr>
+        <w:t xml:space="preserve">{/metoda_kcs}</w:t>
+      </w:r>
+    </w:p>
+    <w:p>
+      <w:pPr>
+        <w:spacing w:after="100"/>
+      </w:pPr>
+      <w:r>
+        <w:rPr>
+          <w:rFonts w:ascii="Calibri" w:hAnsi="Calibri"/>
+          <w:sz w:val="22"/>
+        </w:rPr>
+        <w:t xml:space="preserve">{#metoda_pp}</w:t>
+      </w:r>
+    </w:p>
+    <w:p>
+      <w:pPr>
+        <w:keepNext/>
+        <w:spacing w:after="100"/>
+      </w:pPr>
+      <w:r>
+        <w:rPr>
+          <w:rFonts w:ascii="Calibri" w:hAnsi="Calibri"/>
+          <w:b/>
+          <w:sz w:val="22"/>
+        </w:rPr>
+        <w:t xml:space="preserve">Tabela 1. Charakterystyka wybranych nieruchomości lokalowych o funkcji mieszkalnej</w:t>
+      </w:r>
+    </w:p>
+    <w:tbl>
+      <w:tblPr>
+        <w:tblCaption w:val="pp-dynamic-2"/>
+        <w:tblW w:w="9000" w:type="dxa"/>
+        <w:tblLayout w:type="fixed"/>
+        <w:tblBorders>
+          <w:top w:val="single" w:sz="4" w:color="888888"/>
+          <w:left w:val="single" w:sz="4" w:color="888888"/>
+          <w:bottom w:val="single" w:sz="4" w:color="888888"/>
+          <w:right w:val="single" w:sz="4" w:color="888888"/>
+          <w:insideH w:val="single" w:sz="4" w:color="888888"/>
+          <w:insideV w:val="single" w:sz="4" w:color="888888"/>
+        </w:tblBorders>
+      </w:tblPr>
+      <w:tblGrid>
+        <w:gridCol w:w="1200"/>
+        <w:gridCol w:w="1200"/>
+        <w:gridCol w:w="1200"/>
+        <w:gridCol w:w="1200"/>
+        <w:gridCol w:w="1200"/>
+        <w:gridCol w:w="1200"/>
+        <w:gridCol w:w="1200"/>
+      </w:tblGrid>
+      <w:tr>
+        <w:trPr>
+          <w:cantSplit/>
+          <w:tblHeader/>
+        </w:trPr>
+        <w:tc>
+          <w:tcPr>
+            <w:tcW w:w="1200" w:type="dxa"/>
+            <w:vAlign w:val="center"/>
+          </w:tcPr>
+          <w:p>
+            <w:pPr>
+              <w:spacing w:after="70" w:before="70"/>
+            </w:pPr>
+            <w:r>
+              <w:rPr>
+                <w:rFonts w:ascii="Calibri" w:hAnsi="Calibri"/>
+                <w:sz w:val="18"/>
+              </w:rPr>
+              <w:t xml:space="preserve">Cecha</w:t>
+            </w:r>
+          </w:p>
+        </w:tc>
+        <w:tc>
+          <w:tcPr>
+            <w:tcW w:w="1200" w:type="dxa"/>
+            <w:vAlign w:val="center"/>
+          </w:tcPr>
+          <w:p>
+            <w:pPr>
+              <w:spacing w:after="70" w:before="70"/>
+            </w:pPr>
+            <w:r>
+              <w:rPr>
+                <w:rFonts w:ascii="Calibri" w:hAnsi="Calibri"/>
+                <w:sz w:val="18"/>
+              </w:rPr>
+              <w:t xml:space="preserve">Przedmiot</w:t>
+            </w:r>
+          </w:p>
+        </w:tc>
+        <w:tc>
+          <w:tcPr>
+            <w:tcW w:w="1200" w:type="dxa"/>
+            <w:vAlign w:val="center"/>
+          </w:tcPr>
+          <w:p>
+            <w:pPr>
+              <w:spacing w:after="70" w:before="70"/>
+            </w:pPr>
+            <w:r>
+              <w:rPr>
+                <w:rFonts w:ascii="Calibri" w:hAnsi="Calibri"/>
+                <w:sz w:val="18"/>
+              </w:rPr>
+              <w:t xml:space="preserve">1</w:t>
+            </w:r>
+          </w:p>
+        </w:tc>
+        <w:tc>
+          <w:tcPr>
+            <w:tcW w:w="1200" w:type="dxa"/>
+            <w:vAlign w:val="center"/>
+          </w:tcPr>
+          <w:p>
+            <w:pPr>
+              <w:spacing w:after="70" w:before="70"/>
+            </w:pPr>
+            <w:r>
+              <w:rPr>
+                <w:rFonts w:ascii="Calibri" w:hAnsi="Calibri"/>
+                <w:sz w:val="18"/>
+              </w:rPr>
+              <w:t xml:space="preserve">2</w:t>
+            </w:r>
+          </w:p>
+        </w:tc>
+        <w:tc>
+          <w:tcPr>
+            <w:tcW w:w="1200" w:type="dxa"/>
+            <w:vAlign w:val="center"/>
+          </w:tcPr>
+          <w:p>
+            <w:pPr>
+              <w:spacing w:after="70" w:before="70"/>
+            </w:pPr>
+            <w:r>
+              <w:rPr>
+                <w:rFonts w:ascii="Calibri" w:hAnsi="Calibri"/>
+                <w:sz w:val="18"/>
+              </w:rPr>
+              <w:t xml:space="preserve">3</w:t>
+            </w:r>
+          </w:p>
+        </w:tc>
+        <w:tc>
+          <w:tcPr>
+            <w:tcW w:w="1200" w:type="dxa"/>
+            <w:vAlign w:val="center"/>
+          </w:tcPr>
+          <w:p>
+            <w:pPr>
+              <w:spacing w:after="70" w:before="70"/>
+            </w:pPr>
+            <w:r>
+              <w:rPr>
+                <w:rFonts w:ascii="Calibri" w:hAnsi="Calibri"/>
+                <w:sz w:val="18"/>
+              </w:rPr>
+              <w:t xml:space="preserve">4</w:t>
+            </w:r>
+          </w:p>
+        </w:tc>
+        <w:tc>
+          <w:tcPr>
+            <w:tcW w:w="1200" w:type="dxa"/>
+            <w:vAlign w:val="center"/>
+          </w:tcPr>
+          <w:p>
+            <w:pPr>
+              <w:spacing w:after="70" w:before="70"/>
+            </w:pPr>
+            <w:r>
+              <w:rPr>
+                <w:rFonts w:ascii="Calibri" w:hAnsi="Calibri"/>
+                <w:sz w:val="18"/>
+              </w:rPr>
+              <w:t xml:space="preserve">5</w:t>
+            </w:r>
+          </w:p>
+        </w:tc>
+      </w:tr>
+      <w:tr>
+        <w:trPr>
+          <w:cantSplit/>
+        </w:trPr>
+        <w:tc>
+          <w:tcPr>
+            <w:tcW w:w="1200" w:type="dxa"/>
+            <w:vAlign w:val="center"/>
+          </w:tcPr>
+          <w:p>
+            <w:pPr>
+              <w:spacing w:after="70" w:before="70"/>
+            </w:pPr>
+            <w:r>
+              <w:rPr>
+                <w:rFonts w:ascii="Calibri" w:hAnsi="Calibri"/>
+                <w:sz w:val="18"/>
+              </w:rPr>
+              <w:t xml:space="preserve">{#pp_rows}{label}</w:t>
+            </w:r>
+          </w:p>
+        </w:tc>
+        <w:tc>
+          <w:tcPr>
+            <w:tcW w:w="1200" w:type="dxa"/>
+            <w:vAlign w:val="center"/>
+          </w:tcPr>
+          <w:p>
+            <w:pPr>
+              <w:spacing w:after="70" w:before="70"/>
+            </w:pPr>
+            <w:r>
+              <w:rPr>
+                <w:rFonts w:ascii="Calibri" w:hAnsi="Calibri"/>
+                <w:sz w:val="18"/>
+              </w:rPr>
+              <w:t xml:space="preserve">{subject}</w:t>
+            </w:r>
+          </w:p>
+        </w:tc>
+        <w:tc>
+          <w:tcPr>
+            <w:tcW w:w="1200" w:type="dxa"/>
+            <w:vAlign w:val="center"/>
+          </w:tcPr>
+          <w:p>
+            <w:pPr>
+              <w:spacing w:after="70" w:before="70"/>
+            </w:pPr>
+            <w:r>
+              <w:rPr>
+                <w:rFonts w:ascii="Calibri" w:hAnsi="Calibri"/>
+                <w:sz w:val="18"/>
+              </w:rPr>
+              <w:t xml:space="preserve">{c1}</w:t>
+            </w:r>
+          </w:p>
+        </w:tc>
+        <w:tc>
+          <w:tcPr>
+            <w:tcW w:w="1200" w:type="dxa"/>
+            <w:vAlign w:val="center"/>
+          </w:tcPr>
+          <w:p>
+            <w:pPr>
+              <w:spacing w:after="70" w:before="70"/>
+            </w:pPr>
+            <w:r>
+              <w:rPr>
+                <w:rFonts w:ascii="Calibri" w:hAnsi="Calibri"/>
+                <w:sz w:val="18"/>
+              </w:rPr>
+              <w:t xml:space="preserve">{c2}</w:t>
+            </w:r>
+          </w:p>
+        </w:tc>
+        <w:tc>
+          <w:tcPr>
+            <w:tcW w:w="1200" w:type="dxa"/>
+            <w:vAlign w:val="center"/>
+          </w:tcPr>
+          <w:p>
+            <w:pPr>
+              <w:spacing w:after="70" w:before="70"/>
+            </w:pPr>
+            <w:r>
+              <w:rPr>
+                <w:rFonts w:ascii="Calibri" w:hAnsi="Calibri"/>
+                <w:sz w:val="18"/>
+              </w:rPr>
+              <w:t xml:space="preserve">{c3}</w:t>
+            </w:r>
+          </w:p>
+        </w:tc>
+        <w:tc>
+          <w:tcPr>
+            <w:tcW w:w="1200" w:type="dxa"/>
+            <w:vAlign w:val="center"/>
+          </w:tcPr>
+          <w:p>
+            <w:pPr>
+              <w:spacing w:after="70" w:before="70"/>
+            </w:pPr>
+            <w:r>
+              <w:rPr>
+                <w:rFonts w:ascii="Calibri" w:hAnsi="Calibri"/>
+                <w:sz w:val="18"/>
+              </w:rPr>
+              <w:t xml:space="preserve">{c4}</w:t>
+            </w:r>
+          </w:p>
+        </w:tc>
+        <w:tc>
+          <w:tcPr>
+            <w:tcW w:w="1200" w:type="dxa"/>
+            <w:vAlign w:val="center"/>
+          </w:tcPr>
+          <w:p>
+            <w:pPr>
+              <w:spacing w:after="70" w:before="70"/>
+            </w:pPr>
+            <w:r>
+              <w:rPr>
+                <w:rFonts w:ascii="Calibri" w:hAnsi="Calibri"/>
+                <w:sz w:val="18"/>
+              </w:rPr>
+              <w:t xml:space="preserve">{c5}{/pp_rows}</w:t>
+            </w:r>
+          </w:p>
+        </w:tc>
+      </w:tr>
+    </w:tbl>
+    <w:p>
+      <w:pPr>
+        <w:keepNext/>
+        <w:spacing w:after="100"/>
+      </w:pPr>
+      <w:r>
+        <w:rPr>
+          <w:rFonts w:ascii="Calibri" w:hAnsi="Calibri"/>
+          <w:b/>
+          <w:sz w:val="22"/>
+        </w:rPr>
+        <w:t xml:space="preserve">12.3. Poprawki i ceny skorygowane</w:t>
+      </w:r>
+    </w:p>
+    <w:p>
+      <w:pPr>
+        <w:spacing w:after="100"/>
+      </w:pPr>
+      <w:r>
+        <w:rPr>
+          <w:rFonts w:ascii="Calibri" w:hAnsi="Calibri"/>
+          <w:sz w:val="22"/>
+        </w:rPr>
+        <w:t xml:space="preserve">Rozstęp cen wybranych transakcji ΔC = {pp_spread} zł/m². Zakres kwotowy cechy = ΔC × waga. Poprawka = zakres × przyjęty mnożnik.</w:t>
+      </w:r>
+    </w:p>
+    <w:p>
+      <w:pPr>
+        <w:keepNext/>
+        <w:spacing w:after="100"/>
+      </w:pPr>
+      <w:r>
+        <w:rPr>
+          <w:rFonts w:ascii="Calibri" w:hAnsi="Calibri"/>
+          <w:b/>
+          <w:sz w:val="22"/>
+        </w:rPr>
+        <w:t xml:space="preserve">Tabela 2. Porównanie nieruchomości wycenianej z nieruchomościami podobnymi</w:t>
+      </w:r>
+    </w:p>
+    <w:tbl>
+      <w:tblPr>
+        <w:tblCaption w:val="pp-dynamic-3"/>
+        <w:tblW w:w="9000" w:type="dxa"/>
+        <w:tblLayout w:type="fixed"/>
+        <w:tblBorders>
+          <w:top w:val="single" w:sz="4" w:color="888888"/>
+          <w:left w:val="single" w:sz="4" w:color="888888"/>
+          <w:bottom w:val="single" w:sz="4" w:color="888888"/>
+          <w:right w:val="single" w:sz="4" w:color="888888"/>
+          <w:insideH w:val="single" w:sz="4" w:color="888888"/>
+          <w:insideV w:val="single" w:sz="4" w:color="888888"/>
+        </w:tblBorders>
+      </w:tblPr>
+      <w:tblGrid>
+        <w:gridCol w:w="1200"/>
+        <w:gridCol w:w="1200"/>
+        <w:gridCol w:w="1200"/>
+        <w:gridCol w:w="1200"/>
+        <w:gridCol w:w="1200"/>
+        <w:gridCol w:w="1200"/>
+        <w:gridCol w:w="1200"/>
+        <w:gridCol w:w="1200"/>
+      </w:tblGrid>
+      <w:tr>
+        <w:trPr>
+          <w:cantSplit/>
+          <w:tblHeader/>
+        </w:trPr>
+        <w:tc>
+          <w:tcPr>
+            <w:tcW w:w="1200" w:type="dxa"/>
+            <w:vAlign w:val="center"/>
+          </w:tcPr>
+          <w:p>
+            <w:pPr>
+              <w:spacing w:after="70" w:before="70"/>
+            </w:pPr>
+            <w:r>
+              <w:rPr>
+                <w:rFonts w:ascii="Calibri" w:hAnsi="Calibri"/>
+                <w:sz w:val="18"/>
+              </w:rPr>
+              <w:t xml:space="preserve">Cecha</w:t>
+            </w:r>
+          </w:p>
+        </w:tc>
+        <w:tc>
+          <w:tcPr>
+            <w:tcW w:w="1200" w:type="dxa"/>
+            <w:vAlign w:val="center"/>
+          </w:tcPr>
+          <w:p>
+            <w:pPr>
+              <w:spacing w:after="70" w:before="70"/>
+            </w:pPr>
+            <w:r>
+              <w:rPr>
+                <w:rFonts w:ascii="Calibri" w:hAnsi="Calibri"/>
+                <w:sz w:val="18"/>
+              </w:rPr>
+              <w:t xml:space="preserve">Waga [%]</w:t>
+            </w:r>
+          </w:p>
+        </w:tc>
+        <w:tc>
+          <w:tcPr>
+            <w:tcW w:w="1200" w:type="dxa"/>
+            <w:vAlign w:val="center"/>
+          </w:tcPr>
+          <w:p>
+            <w:pPr>
+              <w:spacing w:after="70" w:before="70"/>
+            </w:pPr>
+            <w:r>
+              <w:rPr>
+                <w:rFonts w:ascii="Calibri" w:hAnsi="Calibri"/>
+                <w:sz w:val="18"/>
+              </w:rPr>
+              <w:t xml:space="preserve">Zakres [zł/m²]</w:t>
+            </w:r>
+          </w:p>
+        </w:tc>
+        <w:tc>
+          <w:tcPr>
+            <w:tcW w:w="1200" w:type="dxa"/>
+            <w:vAlign w:val="center"/>
+          </w:tcPr>
+          <w:p>
+            <w:pPr>
+              <w:spacing w:after="70" w:before="70"/>
+            </w:pPr>
+            <w:r>
+              <w:rPr>
+                <w:rFonts w:ascii="Calibri" w:hAnsi="Calibri"/>
+                <w:sz w:val="18"/>
+              </w:rPr>
+              <w:t xml:space="preserve">1</w:t>
+            </w:r>
+          </w:p>
+        </w:tc>
+        <w:tc>
+          <w:tcPr>
+            <w:tcW w:w="1200" w:type="dxa"/>
+            <w:vAlign w:val="center"/>
+          </w:tcPr>
+          <w:p>
+            <w:pPr>
+              <w:spacing w:after="70" w:before="70"/>
+            </w:pPr>
+            <w:r>
+              <w:rPr>
+                <w:rFonts w:ascii="Calibri" w:hAnsi="Calibri"/>
+                <w:sz w:val="18"/>
+              </w:rPr>
+              <w:t xml:space="preserve">2</w:t>
+            </w:r>
+          </w:p>
+        </w:tc>
+        <w:tc>
+          <w:tcPr>
+            <w:tcW w:w="1200" w:type="dxa"/>
+            <w:vAlign w:val="center"/>
+          </w:tcPr>
+          <w:p>
+            <w:pPr>
+              <w:spacing w:after="70" w:before="70"/>
+            </w:pPr>
+            <w:r>
+              <w:rPr>
+                <w:rFonts w:ascii="Calibri" w:hAnsi="Calibri"/>
+                <w:sz w:val="18"/>
+              </w:rPr>
+              <w:t xml:space="preserve">3</w:t>
+            </w:r>
+          </w:p>
+        </w:tc>
+        <w:tc>
+          <w:tcPr>
+            <w:tcW w:w="1200" w:type="dxa"/>
+            <w:vAlign w:val="center"/>
+          </w:tcPr>
+          <w:p>
+            <w:pPr>
+              <w:spacing w:after="70" w:before="70"/>
+            </w:pPr>
+            <w:r>
+              <w:rPr>
+                <w:rFonts w:ascii="Calibri" w:hAnsi="Calibri"/>
+                <w:sz w:val="18"/>
+              </w:rPr>
+              <w:t xml:space="preserve">4</w:t>
+            </w:r>
+          </w:p>
+        </w:tc>
+        <w:tc>
+          <w:tcPr>
+            <w:tcW w:w="1200" w:type="dxa"/>
+            <w:vAlign w:val="center"/>
+          </w:tcPr>
+          <w:p>
+            <w:pPr>
+              <w:spacing w:after="70" w:before="70"/>
+            </w:pPr>
+            <w:r>
+              <w:rPr>
+                <w:rFonts w:ascii="Calibri" w:hAnsi="Calibri"/>
+                <w:sz w:val="18"/>
+              </w:rPr>
+              <w:t xml:space="preserve">5</w:t>
+            </w:r>
+          </w:p>
+        </w:tc>
+      </w:tr>
+      <w:tr>
+        <w:trPr>
+          <w:cantSplit/>
+        </w:trPr>
+        <w:tc>
+          <w:tcPr>
+            <w:tcW w:w="1200" w:type="dxa"/>
+            <w:vAlign w:val="center"/>
+          </w:tcPr>
+          <w:p>
+            <w:pPr>
+              <w:spacing w:after="70" w:before="70"/>
+            </w:pPr>
+            <w:r>
+              <w:rPr>
+                <w:rFonts w:ascii="Calibri" w:hAnsi="Calibri"/>
+                <w:sz w:val="18"/>
+              </w:rPr>
+              <w:t xml:space="preserve">{#pp_corrections}{label}</w:t>
+            </w:r>
+          </w:p>
+        </w:tc>
+        <w:tc>
+          <w:tcPr>
+            <w:tcW w:w="1200" w:type="dxa"/>
+            <w:vAlign w:val="center"/>
+          </w:tcPr>
+          <w:p>
+            <w:pPr>
+              <w:spacing w:after="70" w:before="70"/>
+            </w:pPr>
+            <w:r>
+              <w:rPr>
+                <w:rFonts w:ascii="Calibri" w:hAnsi="Calibri"/>
+                <w:sz w:val="18"/>
+              </w:rPr>
+              <w:t xml:space="preserve">{weight}</w:t>
+            </w:r>
+          </w:p>
+        </w:tc>
+        <w:tc>
+          <w:tcPr>
+            <w:tcW w:w="1200" w:type="dxa"/>
+            <w:vAlign w:val="center"/>
+          </w:tcPr>
+          <w:p>
+            <w:pPr>
+              <w:spacing w:after="70" w:before="70"/>
+            </w:pPr>
+            <w:r>
+              <w:rPr>
+                <w:rFonts w:ascii="Calibri" w:hAnsi="Calibri"/>
+                <w:sz w:val="18"/>
+              </w:rPr>
+              <w:t xml:space="preserve">{range}</w:t>
+            </w:r>
+          </w:p>
+        </w:tc>
+        <w:tc>
+          <w:tcPr>
+            <w:tcW w:w="1200" w:type="dxa"/>
+            <w:vAlign w:val="center"/>
+          </w:tcPr>
+          <w:p>
+            <w:pPr>
+              <w:spacing w:after="70" w:before="70"/>
+            </w:pPr>
+            <w:r>
+              <w:rPr>
+                <w:rFonts w:ascii="Calibri" w:hAnsi="Calibri"/>
+                <w:sz w:val="18"/>
+              </w:rPr>
+              <w:t xml:space="preserve">{c1}</w:t>
+            </w:r>
+          </w:p>
+        </w:tc>
+        <w:tc>
+          <w:tcPr>
+            <w:tcW w:w="1200" w:type="dxa"/>
+            <w:vAlign w:val="center"/>
+          </w:tcPr>
+          <w:p>
+            <w:pPr>
+              <w:spacing w:after="70" w:before="70"/>
+            </w:pPr>
+            <w:r>
+              <w:rPr>
+                <w:rFonts w:ascii="Calibri" w:hAnsi="Calibri"/>
+                <w:sz w:val="18"/>
+              </w:rPr>
+              <w:t xml:space="preserve">{c2}</w:t>
+            </w:r>
+          </w:p>
+        </w:tc>
+        <w:tc>
+          <w:tcPr>
+            <w:tcW w:w="1200" w:type="dxa"/>
+            <w:vAlign w:val="center"/>
+          </w:tcPr>
+          <w:p>
+            <w:pPr>
+              <w:spacing w:after="70" w:before="70"/>
+            </w:pPr>
+            <w:r>
+              <w:rPr>
+                <w:rFonts w:ascii="Calibri" w:hAnsi="Calibri"/>
+                <w:sz w:val="18"/>
+              </w:rPr>
+              <w:t xml:space="preserve">{c3}</w:t>
+            </w:r>
+          </w:p>
+        </w:tc>
+        <w:tc>
+          <w:tcPr>
+            <w:tcW w:w="1200" w:type="dxa"/>
+            <w:vAlign w:val="center"/>
+          </w:tcPr>
+          <w:p>
+            <w:pPr>
+              <w:spacing w:after="70" w:before="70"/>
+            </w:pPr>
+            <w:r>
+              <w:rPr>
+                <w:rFonts w:ascii="Calibri" w:hAnsi="Calibri"/>
+                <w:sz w:val="18"/>
+              </w:rPr>
+              <w:t xml:space="preserve">{c4}</w:t>
+            </w:r>
+          </w:p>
+        </w:tc>
+        <w:tc>
+          <w:tcPr>
+            <w:tcW w:w="1200" w:type="dxa"/>
+            <w:vAlign w:val="center"/>
+          </w:tcPr>
+          <w:p>
+            <w:pPr>
+              <w:spacing w:after="70" w:before="70"/>
+            </w:pPr>
+            <w:r>
+              <w:rPr>
+                <w:rFonts w:ascii="Calibri" w:hAnsi="Calibri"/>
+                <w:sz w:val="18"/>
+              </w:rPr>
+              <w:t xml:space="preserve">{c5}{/pp_corrections}</w:t>
+            </w:r>
+          </w:p>
+        </w:tc>
+      </w:tr>
+    </w:tbl>
+    <w:p>
+      <w:pPr>
+        <w:spacing w:after="100"/>
+      </w:pPr>
+      <w:r>
+        <w:rPr>
+          <w:rFonts w:ascii="Calibri" w:hAnsi="Calibri"/>
+          <w:sz w:val="22"/>
+        </w:rPr>
+        <w:t xml:space="preserve">{#pp_overrides}</w:t>
+      </w:r>
+    </w:p>
+    <w:p>
+      <w:pPr>
+        <w:spacing w:after="100"/>
+      </w:pPr>
+      <w:r>
+        <w:rPr>
+          <w:rFonts w:ascii="Calibri" w:hAnsi="Calibri"/>
+          <w:sz w:val="22"/>
+        </w:rPr>
+        <w:t xml:space="preserve">{.}</w:t>
+      </w:r>
+    </w:p>
+    <w:p>
+      <w:pPr>
+        <w:spacing w:after="100"/>
+      </w:pPr>
+      <w:r>
+        <w:rPr>
+          <w:rFonts w:ascii="Calibri" w:hAnsi="Calibri"/>
+          <w:sz w:val="22"/>
+        </w:rPr>
+        <w:t xml:space="preserve">{/pp_overrides}</w:t>
+      </w:r>
+    </w:p>
+    <w:p>
+      <w:pPr>
+        <w:keepNext/>
+        <w:spacing w:after="100"/>
+      </w:pPr>
+      <w:r>
+        <w:rPr>
+          <w:rFonts w:ascii="Calibri" w:hAnsi="Calibri"/>
+          <w:b/>
+          <w:sz w:val="22"/>
+        </w:rPr>
+        <w:t xml:space="preserve">Tabela 3. Obliczenie skorygowanej ceny transakcyjnej każdego lokalu mieszkalnego przyjętego do porównań przy użyciu określonych poprawek</w:t>
+      </w:r>
+    </w:p>
+    <w:tbl>
+      <w:tblPr>
+        <w:tblCaption w:val="pp-dynamic-1"/>
+        <w:tblW w:w="9000" w:type="dxa"/>
+        <w:tblLayout w:type="fixed"/>
+        <w:tblBorders>
+          <w:top w:val="single" w:sz="4" w:color="888888"/>
+          <w:left w:val="single" w:sz="4" w:color="888888"/>
+          <w:bottom w:val="single" w:sz="4" w:color="888888"/>
+          <w:right w:val="single" w:sz="4" w:color="888888"/>
+          <w:insideH w:val="single" w:sz="4" w:color="888888"/>
+          <w:insideV w:val="single" w:sz="4" w:color="888888"/>
+        </w:tblBorders>
+      </w:tblPr>
+      <w:tblGrid>
+        <w:gridCol w:w="1200"/>
+        <w:gridCol w:w="1200"/>
+        <w:gridCol w:w="1200"/>
+        <w:gridCol w:w="1200"/>
+        <w:gridCol w:w="1200"/>
+        <w:gridCol w:w="1200"/>
+      </w:tblGrid>
+      <w:tr>
+        <w:trPr>
+          <w:cantSplit/>
+          <w:tblHeader/>
+        </w:trPr>
+        <w:tc>
+          <w:tcPr>
+            <w:tcW w:w="1200" w:type="dxa"/>
+            <w:vAlign w:val="center"/>
+          </w:tcPr>
+          <w:p>
+            <w:pPr>
+              <w:spacing w:after="70" w:before="70"/>
+            </w:pPr>
+            <w:r>
+              <w:rPr>
+                <w:rFonts w:ascii="Calibri" w:hAnsi="Calibri"/>
+                <w:sz w:val="18"/>
+              </w:rPr>
+              <w:t xml:space="preserve">Cena / poprawka</w:t>
+            </w:r>
+          </w:p>
+        </w:tc>
+        <w:tc>
+          <w:tcPr>
+            <w:tcW w:w="1200" w:type="dxa"/>
+            <w:vAlign w:val="center"/>
+          </w:tcPr>
+          <w:p>
+            <w:pPr>
+              <w:spacing w:after="70" w:before="70"/>
+            </w:pPr>
+            <w:r>
+              <w:rPr>
+                <w:rFonts w:ascii="Calibri" w:hAnsi="Calibri"/>
+                <w:sz w:val="18"/>
+              </w:rPr>
+              <w:t xml:space="preserve">1</w:t>
+            </w:r>
+          </w:p>
+        </w:tc>
+        <w:tc>
+          <w:tcPr>
+            <w:tcW w:w="1200" w:type="dxa"/>
+            <w:vAlign w:val="center"/>
+          </w:tcPr>
+          <w:p>
+            <w:pPr>
+              <w:spacing w:after="70" w:before="70"/>
+            </w:pPr>
+            <w:r>
+              <w:rPr>
+                <w:rFonts w:ascii="Calibri" w:hAnsi="Calibri"/>
+                <w:sz w:val="18"/>
+              </w:rPr>
+              <w:t xml:space="preserve">2</w:t>
+            </w:r>
+          </w:p>
+        </w:tc>
+        <w:tc>
+          <w:tcPr>
+            <w:tcW w:w="1200" w:type="dxa"/>
+            <w:vAlign w:val="center"/>
+          </w:tcPr>
+          <w:p>
+            <w:pPr>
+              <w:spacing w:after="70" w:before="70"/>
+            </w:pPr>
+            <w:r>
+              <w:rPr>
+                <w:rFonts w:ascii="Calibri" w:hAnsi="Calibri"/>
+                <w:sz w:val="18"/>
+              </w:rPr>
+              <w:t xml:space="preserve">3</w:t>
+            </w:r>
+          </w:p>
+        </w:tc>
+        <w:tc>
+          <w:tcPr>
+            <w:tcW w:w="1200" w:type="dxa"/>
+            <w:vAlign w:val="center"/>
+          </w:tcPr>
+          <w:p>
+            <w:pPr>
+              <w:spacing w:after="70" w:before="70"/>
+            </w:pPr>
+            <w:r>
+              <w:rPr>
+                <w:rFonts w:ascii="Calibri" w:hAnsi="Calibri"/>
+                <w:sz w:val="18"/>
+              </w:rPr>
+              <w:t xml:space="preserve">4</w:t>
+            </w:r>
+          </w:p>
+        </w:tc>
+        <w:tc>
+          <w:tcPr>
+            <w:tcW w:w="1200" w:type="dxa"/>
+            <w:vAlign w:val="center"/>
+          </w:tcPr>
+          <w:p>
+            <w:pPr>
+              <w:spacing w:after="70" w:before="70"/>
+            </w:pPr>
+            <w:r>
+              <w:rPr>
+                <w:rFonts w:ascii="Calibri" w:hAnsi="Calibri"/>
+                <w:sz w:val="18"/>
+              </w:rPr>
+              <w:t xml:space="preserve">5</w:t>
+            </w:r>
+          </w:p>
+        </w:tc>
+      </w:tr>
+      <w:tr>
+        <w:trPr>
+          <w:cantSplit/>
+        </w:trPr>
+        <w:tc>
+          <w:tcPr>
+            <w:tcW w:w="1200" w:type="dxa"/>
+            <w:vAlign w:val="center"/>
+          </w:tcPr>
+          <w:p>
+            <w:pPr>
+              <w:spacing w:after="70" w:before="70"/>
+            </w:pPr>
+            <w:r>
+              <w:rPr>
+                <w:rFonts w:ascii="Calibri" w:hAnsi="Calibri"/>
+                <w:sz w:val="18"/>
+              </w:rPr>
+              <w:t xml:space="preserve">{#pp_prices}{label}</w:t>
+            </w:r>
+          </w:p>
+        </w:tc>
+        <w:tc>
+          <w:tcPr>
+            <w:tcW w:w="1200" w:type="dxa"/>
+            <w:vAlign w:val="center"/>
+          </w:tcPr>
+          <w:p>
+            <w:pPr>
+              <w:spacing w:after="70" w:before="70"/>
+            </w:pPr>
+            <w:r>
+              <w:rPr>
+                <w:rFonts w:ascii="Calibri" w:hAnsi="Calibri"/>
+                <w:sz w:val="18"/>
+              </w:rPr>
+              <w:t xml:space="preserve">{c1}</w:t>
+            </w:r>
+          </w:p>
+        </w:tc>
+        <w:tc>
+          <w:tcPr>
+            <w:tcW w:w="1200" w:type="dxa"/>
+            <w:vAlign w:val="center"/>
+          </w:tcPr>
+          <w:p>
+            <w:pPr>
+              <w:spacing w:after="70" w:before="70"/>
+            </w:pPr>
+            <w:r>
+              <w:rPr>
+                <w:rFonts w:ascii="Calibri" w:hAnsi="Calibri"/>
+                <w:sz w:val="18"/>
+              </w:rPr>
+              <w:t xml:space="preserve">{c2}</w:t>
+            </w:r>
+          </w:p>
+        </w:tc>
+        <w:tc>
+          <w:tcPr>
+            <w:tcW w:w="1200" w:type="dxa"/>
+            <w:vAlign w:val="center"/>
+          </w:tcPr>
+          <w:p>
+            <w:pPr>
+              <w:spacing w:after="70" w:before="70"/>
+            </w:pPr>
+            <w:r>
+              <w:rPr>
+                <w:rFonts w:ascii="Calibri" w:hAnsi="Calibri"/>
+                <w:sz w:val="18"/>
+              </w:rPr>
+              <w:t xml:space="preserve">{c3}</w:t>
+            </w:r>
+          </w:p>
+        </w:tc>
+        <w:tc>
+          <w:tcPr>
+            <w:tcW w:w="1200" w:type="dxa"/>
+            <w:vAlign w:val="center"/>
+          </w:tcPr>
+          <w:p>
+            <w:pPr>
+              <w:spacing w:after="70" w:before="70"/>
+            </w:pPr>
+            <w:r>
+              <w:rPr>
+                <w:rFonts w:ascii="Calibri" w:hAnsi="Calibri"/>
+                <w:sz w:val="18"/>
+              </w:rPr>
+              <w:t xml:space="preserve">{c4}</w:t>
+            </w:r>
+          </w:p>
+        </w:tc>
+        <w:tc>
+          <w:tcPr>
+            <w:tcW w:w="1200" w:type="dxa"/>
+            <w:vAlign w:val="center"/>
+          </w:tcPr>
+          <w:p>
+            <w:pPr>
+              <w:spacing w:after="70" w:before="70"/>
+            </w:pPr>
+            <w:r>
+              <w:rPr>
+                <w:rFonts w:ascii="Calibri" w:hAnsi="Calibri"/>
+                <w:sz w:val="18"/>
+              </w:rPr>
+              <w:t xml:space="preserve">{c5}{/pp_prices}</w:t>
+            </w:r>
+          </w:p>
+        </w:tc>
+      </w:tr>
+    </w:tbl>
+    <w:p>
+      <w:pPr>
+        <w:spacing w:after="100"/>
+      </w:pPr>
+      <w:r>
+        <w:rPr>
+          <w:rFonts w:ascii="Calibri" w:hAnsi="Calibri"/>
+          <w:sz w:val="22"/>
+        </w:rPr>
+        <w:t xml:space="preserve">Średnia arytmetyczna cen skorygowanych: {cena_1m2} zł/m².</w:t>
+      </w:r>
+    </w:p>
+    <w:p>
+      <w:pPr>
+        <w:keepNext/>
+        <w:spacing w:after="100"/>
+      </w:pPr>
+      <w:r>
+        <w:rPr>
+          <w:rFonts w:ascii="Calibri" w:hAnsi="Calibri"/>
+          <w:b/>
+          <w:sz w:val="22"/>
+        </w:rPr>
+        <w:t xml:space="preserve">12.4. Określenie wartości rynkowej {przedmiot_d}</w:t>
+      </w:r>
+    </w:p>
+    <w:p>
+      <w:pPr>
+        <w:keepNext/>
+        <w:spacing w:after="100"/>
+      </w:pPr>
+      <w:r>
+        <w:rPr>
+          <w:rFonts w:ascii="Calibri" w:hAnsi="Calibri"/>
+          <w:b/>
+          <w:sz w:val="22"/>
+        </w:rPr>
+        <w:t xml:space="preserve">Tabela 4. Określenie wartości rynkowej {przedmiot_d}</w:t>
+      </w:r>
+    </w:p>
+    <w:tbl>
+      <w:tblPr>
+        <w:tblCaption w:val="pp-result"/>
+        <w:tblW w:w="9000" w:type="dxa"/>
+        <w:tblLayout w:type="fixed"/>
+        <w:tblBorders>
+          <w:top w:val="single" w:sz="4" w:color="888888"/>
+          <w:left w:val="single" w:sz="4" w:color="888888"/>
+          <w:bottom w:val="single" w:sz="4" w:color="888888"/>
+          <w:right w:val="single" w:sz="4" w:color="888888"/>
+          <w:insideH w:val="single" w:sz="4" w:color="888888"/>
+          <w:insideV w:val="single" w:sz="4" w:color="888888"/>
+        </w:tblBorders>
+      </w:tblPr>
+      <w:tblGrid>
+        <w:gridCol w:w="4500"/>
+        <w:gridCol w:w="4500"/>
+      </w:tblGrid>
+      <w:tr>
+        <w:trPr>
+          <w:cantSplit/>
+          <w:tblHeader/>
+        </w:trPr>
+        <w:tc>
+          <w:tcPr>
+            <w:tcW w:w="4500" w:type="dxa"/>
+            <w:vAlign w:val="center"/>
+          </w:tcPr>
+          <w:p>
+            <w:pPr>
+              <w:spacing w:after="70" w:before="70"/>
+            </w:pPr>
+            <w:r>
+              <w:rPr>
+                <w:rFonts w:ascii="Calibri" w:hAnsi="Calibri"/>
+                <w:sz w:val="18"/>
+              </w:rPr>
+              <w:t xml:space="preserve">Wielkość</w:t>
+            </w:r>
+          </w:p>
+        </w:tc>
+        <w:tc>
+          <w:tcPr>
+            <w:tcW w:w="4500" w:type="dxa"/>
+            <w:vAlign w:val="center"/>
+          </w:tcPr>
+          <w:p>
+            <w:pPr>
+              <w:spacing w:after="70" w:before="70"/>
+            </w:pPr>
+            <w:r>
+              <w:rPr>
+                <w:rFonts w:ascii="Calibri" w:hAnsi="Calibri"/>
+                <w:sz w:val="18"/>
+              </w:rPr>
+              <w:t xml:space="preserve">Wartość</w:t>
+            </w:r>
+          </w:p>
+        </w:tc>
+      </w:tr>
+      <w:tr>
+        <w:trPr>
+          <w:cantSplit/>
+        </w:trPr>
+        <w:tc>
+          <w:tcPr>
+            <w:tcW w:w="4500" w:type="dxa"/>
+            <w:vAlign w:val="center"/>
+          </w:tcPr>
+          <w:p>
+            <w:pPr>
+              <w:spacing w:after="70" w:before="70"/>
+            </w:pPr>
+            <w:r>
+              <w:rPr>
+                <w:rFonts w:ascii="Calibri" w:hAnsi="Calibri"/>
+                <w:sz w:val="18"/>
+              </w:rPr>
+              <w:t xml:space="preserve">Średnia cena skorygowana [zł/m²]</w:t>
+            </w:r>
+          </w:p>
+        </w:tc>
+        <w:tc>
+          <w:tcPr>
+            <w:tcW w:w="4500" w:type="dxa"/>
+            <w:vAlign w:val="center"/>
+          </w:tcPr>
+          <w:p>
+            <w:pPr>
+              <w:spacing w:after="70" w:before="70"/>
+            </w:pPr>
+            <w:r>
+              <w:rPr>
+                <w:rFonts w:ascii="Calibri" w:hAnsi="Calibri"/>
+                <w:sz w:val="18"/>
+              </w:rPr>
+              <w:t xml:space="preserve">{cena_1m2}</w:t>
+            </w:r>
+          </w:p>
+        </w:tc>
+      </w:tr>
+      <w:tr>
+        <w:trPr>
+          <w:cantSplit/>
+        </w:trPr>
+        <w:tc>
+          <w:tcPr>
+            <w:tcW w:w="4500" w:type="dxa"/>
+            <w:vAlign w:val="center"/>
+          </w:tcPr>
+          <w:p>
+            <w:pPr>
+              <w:spacing w:after="70" w:before="70"/>
+            </w:pPr>
+            <w:r>
+              <w:rPr>
+                <w:rFonts w:ascii="Calibri" w:hAnsi="Calibri"/>
+                <w:sz w:val="18"/>
+              </w:rPr>
+              <w:t xml:space="preserve">Powierzchnia użytkowa [m²]</w:t>
+            </w:r>
+          </w:p>
+        </w:tc>
+        <w:tc>
+          <w:tcPr>
+            <w:tcW w:w="4500" w:type="dxa"/>
+            <w:vAlign w:val="center"/>
+          </w:tcPr>
+          <w:p>
+            <w:pPr>
+              <w:spacing w:after="70" w:before="70"/>
+            </w:pPr>
+            <w:r>
+              <w:rPr>
+                <w:rFonts w:ascii="Calibri" w:hAnsi="Calibri"/>
+                <w:sz w:val="18"/>
+              </w:rPr>
+              <w:t xml:space="preserve">{powierzchnia}</w:t>
+            </w:r>
+          </w:p>
+        </w:tc>
+      </w:tr>
+      <w:tr>
+        <w:trPr>
+          <w:cantSplit/>
+        </w:trPr>
+        <w:tc>
+          <w:tcPr>
+            <w:tcW w:w="4500" w:type="dxa"/>
+            <w:vAlign w:val="center"/>
+          </w:tcPr>
+          <w:p>
+            <w:pPr>
+              <w:spacing w:after="70" w:before="70"/>
+            </w:pPr>
+            <w:r>
+              <w:rPr>
+                <w:rFonts w:ascii="Calibri" w:hAnsi="Calibri"/>
+                <w:sz w:val="18"/>
+              </w:rPr>
+              <w:t xml:space="preserve">Wartość przed zaokrągleniem [zł]</w:t>
+            </w:r>
+          </w:p>
+        </w:tc>
+        <w:tc>
+          <w:tcPr>
+            <w:tcW w:w="4500" w:type="dxa"/>
+            <w:vAlign w:val="center"/>
+          </w:tcPr>
+          <w:p>
+            <w:pPr>
+              <w:spacing w:after="70" w:before="70"/>
+            </w:pPr>
+            <w:r>
+              <w:rPr>
+                <w:rFonts w:ascii="Calibri" w:hAnsi="Calibri"/>
+                <w:sz w:val="18"/>
+              </w:rPr>
+              <w:t xml:space="preserve">{wr_dokladna}</w:t>
+            </w:r>
+          </w:p>
+        </w:tc>
+      </w:tr>
+      <w:tr>
+        <w:trPr>
+          <w:cantSplit/>
+        </w:trPr>
+        <w:tc>
+          <w:tcPr>
+            <w:tcW w:w="4500" w:type="dxa"/>
+            <w:vAlign w:val="center"/>
+          </w:tcPr>
+          <w:p>
+            <w:pPr>
+              <w:spacing w:after="70" w:before="70"/>
+            </w:pPr>
+            <w:r>
+              <w:rPr>
+                <w:rFonts w:ascii="Calibri" w:hAnsi="Calibri"/>
+                <w:sz w:val="18"/>
+              </w:rPr>
+              <w:t xml:space="preserve">Wartość po zaokrągleniu [zł]</w:t>
+            </w:r>
+          </w:p>
+        </w:tc>
+        <w:tc>
+          <w:tcPr>
+            <w:tcW w:w="4500" w:type="dxa"/>
+            <w:vAlign w:val="center"/>
+          </w:tcPr>
+          <w:p>
+            <w:pPr>
+              <w:spacing w:after="70" w:before="70"/>
+            </w:pPr>
+            <w:r>
+              <w:rPr>
+                <w:rFonts w:ascii="Calibri" w:hAnsi="Calibri"/>
+                <w:sz w:val="18"/>
+              </w:rPr>
+              <w:t xml:space="preserve">{wr}</w:t>
+            </w:r>
+          </w:p>
+        </w:tc>
+      </w:tr>
+      <w:tr>
+        <w:trPr>
+          <w:cantSplit/>
+        </w:trPr>
+        <w:tc>
+          <w:tcPr>
+            <w:tcW w:w="4500" w:type="dxa"/>
+            <w:vAlign w:val="center"/>
+          </w:tcPr>
+          <w:p>
+            <w:pPr>
+              <w:spacing w:after="70" w:before="70"/>
+            </w:pPr>
+            <w:r>
+              <w:rPr>
+                <w:rFonts w:ascii="Calibri" w:hAnsi="Calibri"/>
+                <w:sz w:val="18"/>
+              </w:rPr>
+              <w:t xml:space="preserve">Słownie</w:t>
+            </w:r>
+          </w:p>
+        </w:tc>
+        <w:tc>
+          <w:tcPr>
+            <w:tcW w:w="4500" w:type="dxa"/>
+            <w:vAlign w:val="center"/>
+          </w:tcPr>
+          <w:p>
+            <w:pPr>
+              <w:spacing w:after="70" w:before="70"/>
+            </w:pPr>
+            <w:r>
+              <w:rPr>
+                <w:rFonts w:ascii="Calibri" w:hAnsi="Calibri"/>
+                <w:sz w:val="18"/>
+              </w:rPr>
+              <w:t xml:space="preserve">{wr_slownie}</w:t>
+            </w:r>
+          </w:p>
+        </w:tc>
+      </w:tr>
+    </w:tbl>
+    <w:p>
+      <w:pPr>
+        <w:spacing w:after="100"/>
+      </w:pPr>
+      <w:r>
+        <w:rPr>
+          <w:rFonts w:ascii="Calibri" w:hAnsi="Calibri"/>
+          <w:sz w:val="22"/>
+        </w:rPr>
+        <w:t xml:space="preserve">Obliczenia wykonano z pełną precyzją; wartości w tabelach przedstawiono do dwóch miejsc po przecinku. Końcową wartość zaokrąglono do 100 zł.</w:t>
+      </w:r>
+    </w:p>
+    <w:p>
+      <w:pPr>
+        <w:spacing w:line="276" w:lineRule="auto"/>
+        <w:jc w:val="both"/>
+        <w:rPr>
+          <w:rFonts w:ascii="Segoe UI" w:hAnsi="Segoe UI" w:cs="Segoe UI"/>
+          <w:b/>
+          <w:i/>
+          <w:color w:val="222222"/>
+          <w:sz w:val="20"/>
+          <w:szCs w:val="20"/>
+          <w:shd w:val="clear" w:color="auto" w:fill="FFFFFF"/>
+        </w:rPr>
+      </w:pPr>
+      <w:r>
+        <w:rPr>
+          <w:rFonts w:ascii="Segoe UI" w:hAnsi="Segoe UI" w:cs="Segoe UI"/>
+          <w:b/>
+          <w:i/>
+          <w:color w:val="222222"/>
+          <w:sz w:val="20"/>
+          <w:szCs w:val="20"/>
+          <w:shd w:val="clear" w:color="auto" w:fill="FFFFFF"/>
+        </w:rPr>
+        <w:lastRenderedPageBreak/>
+        <w:t>Klauzula: W operacie szacunkowym nie ujawnia się danych identyfikujących nieruchomości porównawcze, których ujawnienie wkracza w sferę zastrzeżoną tajemnicą zawodową rzeczoznawcy, zgodnie z wyrokiem SN z dnia 5 kwietnia 2012r. (IICSK 369/11).</w:t>
+      </w:r>
+    </w:p>
+    <w:p>
+      <w:pPr>
+        <w:spacing w:after="100"/>
+      </w:pPr>
+      <w:r>
+        <w:rPr>
+          <w:rFonts w:ascii="Calibri" w:hAnsi="Calibri"/>
+          <w:sz w:val="22"/>
+        </w:rPr>
+        <w:t xml:space="preserve">Źródło: Opracowanie własne.</w:t>
+      </w:r>
+    </w:p>
+    <w:p>
+      <w:pPr>
+        <w:spacing w:after="100"/>
+      </w:pPr>
+      <w:r>
+        <w:rPr>
+          <w:rFonts w:ascii="Calibri" w:hAnsi="Calibri"/>
+          <w:sz w:val="22"/>
+        </w:rPr>
+        <w:t xml:space="preserve">{/metoda_pp}</w:t>
+      </w:r>
     </w:p>
     <w:p>
       <w:pPr>

</xml_diff>

<commit_message>
fix(operat): preserve methodology and current override semantics
</commit_message>
<xml_diff>
--- a/apps/web/templates/operat-szablon.docx
+++ b/apps/web/templates/operat-szablon.docx
@@ -12111,6 +12111,135 @@
     </w:p>
     <w:p>
       <w:pPr>
+        <w:pStyle w:val="Tekstpodstawowy22"/>
+        <w:tabs>
+          <w:tab w:val="left" w:pos="2268"/>
+        </w:tabs>
+        <w:spacing w:after="0" w:line="276" w:lineRule="auto"/>
+        <w:jc w:val="both"/>
+        <w:rPr>
+          <w:rFonts w:ascii="Segoe UI" w:hAnsi="Segoe UI" w:cs="Segoe UI"/>
+          <w:b/>
+          <w:sz w:val="20"/>
+          <w:szCs w:val="20"/>
+        </w:rPr>
+      </w:pPr>
+      <w:r>
+        <w:rPr>
+          <w:rFonts w:ascii="Segoe UI" w:hAnsi="Segoe UI" w:cs="Segoe UI"/>
+          <w:sz w:val="20"/>
+          <w:szCs w:val="20"/>
+        </w:rPr>
+        <w:t>W podejściu porównawczym stosuje się:</w:t>
+      </w:r>
+    </w:p>
+    <w:p>
+      <w:pPr>
+        <w:pStyle w:val="Tekstpodstawowy22"/>
+        <w:numPr>
+          <w:ilvl w:val="0"/>
+          <w:numId w:val="8"/>
+        </w:numPr>
+        <w:tabs>
+          <w:tab w:val="num" w:pos="720"/>
+          <w:tab w:val="left" w:pos="2268"/>
+        </w:tabs>
+        <w:spacing w:after="0" w:line="276" w:lineRule="auto"/>
+        <w:jc w:val="both"/>
+        <w:rPr>
+          <w:rFonts w:ascii="Segoe UI" w:hAnsi="Segoe UI" w:cs="Segoe UI"/>
+          <w:bCs/>
+          <w:sz w:val="20"/>
+          <w:szCs w:val="20"/>
+        </w:rPr>
+      </w:pPr>
+      <w:r>
+        <w:rPr>
+          <w:rFonts w:ascii="Segoe UI" w:hAnsi="Segoe UI" w:cs="Segoe UI"/>
+          <w:bCs/>
+          <w:sz w:val="20"/>
+          <w:szCs w:val="20"/>
+        </w:rPr>
+        <w:t xml:space="preserve">metodę porównywania parami, </w:t>
+      </w:r>
+    </w:p>
+    <w:p>
+      <w:pPr>
+        <w:pStyle w:val="Tekstpodstawowy22"/>
+        <w:numPr>
+          <w:ilvl w:val="0"/>
+          <w:numId w:val="8"/>
+        </w:numPr>
+        <w:tabs>
+          <w:tab w:val="num" w:pos="720"/>
+          <w:tab w:val="left" w:pos="2268"/>
+        </w:tabs>
+        <w:spacing w:after="0" w:line="276" w:lineRule="auto"/>
+        <w:jc w:val="both"/>
+        <w:rPr>
+          <w:rFonts w:ascii="Segoe UI" w:hAnsi="Segoe UI" w:cs="Segoe UI"/>
+          <w:b/>
+          <w:bCs/>
+          <w:sz w:val="20"/>
+          <w:szCs w:val="20"/>
+        </w:rPr>
+      </w:pPr>
+      <w:r>
+        <w:rPr>
+          <w:rFonts w:ascii="Segoe UI" w:hAnsi="Segoe UI" w:cs="Segoe UI"/>
+          <w:b/>
+          <w:bCs/>
+          <w:sz w:val="20"/>
+          <w:szCs w:val="20"/>
+        </w:rPr>
+        <w:t>metodę korygowania ceny średniej,</w:t>
+      </w:r>
+    </w:p>
+    <w:p>
+      <w:pPr>
+        <w:pStyle w:val="Tekstpodstawowy22"/>
+        <w:numPr>
+          <w:ilvl w:val="0"/>
+          <w:numId w:val="8"/>
+        </w:numPr>
+        <w:tabs>
+          <w:tab w:val="num" w:pos="720"/>
+          <w:tab w:val="left" w:pos="2268"/>
+        </w:tabs>
+        <w:spacing w:after="0" w:line="276" w:lineRule="auto"/>
+        <w:jc w:val="both"/>
+        <w:rPr>
+          <w:rFonts w:ascii="Segoe UI" w:hAnsi="Segoe UI" w:cs="Segoe UI"/>
+          <w:sz w:val="20"/>
+          <w:szCs w:val="20"/>
+        </w:rPr>
+      </w:pPr>
+      <w:r>
+        <w:rPr>
+          <w:rFonts w:ascii="Segoe UI" w:hAnsi="Segoe UI" w:cs="Segoe UI"/>
+          <w:sz w:val="20"/>
+          <w:szCs w:val="20"/>
+        </w:rPr>
+        <w:t>metodę analizy statystycznej rynku.</w:t>
+      </w:r>
+    </w:p>
+    <w:p>
+      <w:pPr>
+        <w:pStyle w:val="Tekstpodstawowy22"/>
+        <w:tabs>
+          <w:tab w:val="left" w:pos="2268"/>
+        </w:tabs>
+        <w:spacing w:after="0" w:line="276" w:lineRule="auto"/>
+        <w:jc w:val="both"/>
+        <w:rPr>
+          <w:rFonts w:ascii="Segoe UI" w:hAnsi="Segoe UI" w:cs="Segoe UI"/>
+          <w:sz w:val="20"/>
+          <w:szCs w:val="20"/>
+        </w:rPr>
+      </w:pPr>
+    </w:p>
+    <w:p>
+      <w:pPr>
         <w:spacing w:after="100"/>
       </w:pPr>
       <w:r>
@@ -13090,6 +13219,73 @@
     </w:p>
     <w:p>
       <w:pPr>
+        <w:pStyle w:val="Tekstpodstawowy22"/>
+        <w:tabs>
+          <w:tab w:val="left" w:pos="2268"/>
+        </w:tabs>
+        <w:spacing w:after="0" w:line="276" w:lineRule="auto"/>
+        <w:jc w:val="both"/>
+        <w:rPr>
+          <w:rFonts w:ascii="Segoe UI" w:hAnsi="Segoe UI" w:cs="Segoe UI"/>
+          <w:i/>
+          <w:iCs/>
+          <w:sz w:val="20"/>
+          <w:szCs w:val="20"/>
+        </w:rPr>
+      </w:pPr>
+      <w:r>
+        <w:rPr>
+          <w:rFonts w:ascii="Segoe UI" w:hAnsi="Segoe UI" w:cs="Segoe UI"/>
+          <w:bCs/>
+          <w:sz w:val="20"/>
+          <w:szCs w:val="20"/>
+          <w:u w:val="single"/>
+        </w:rPr>
+        <w:t>Metoda porównywania parami</w:t>
+      </w:r>
+      <w:r>
+        <w:rPr>
+          <w:rFonts w:ascii="Segoe UI" w:hAnsi="Segoe UI" w:cs="Segoe UI"/>
+          <w:b/>
+          <w:i/>
+          <w:iCs/>
+          <w:sz w:val="20"/>
+          <w:szCs w:val="20"/>
+        </w:rPr>
+        <w:t xml:space="preserve"> </w:t>
+      </w:r>
+      <w:r>
+        <w:rPr>
+          <w:rFonts w:ascii="Segoe UI" w:hAnsi="Segoe UI" w:cs="Segoe UI"/>
+          <w:bCs/>
+          <w:i/>
+          <w:iCs/>
+          <w:sz w:val="20"/>
+          <w:szCs w:val="20"/>
+        </w:rPr>
+        <w:t>–</w:t>
+      </w:r>
+      <w:r>
+        <w:rPr>
+          <w:rFonts w:ascii="Segoe UI" w:hAnsi="Segoe UI" w:cs="Segoe UI"/>
+          <w:i/>
+          <w:iCs/>
+          <w:sz w:val="20"/>
+          <w:szCs w:val="20"/>
+        </w:rPr>
+        <w:t xml:space="preserve"> </w:t>
+      </w:r>
+      <w:r>
+        <w:rPr>
+          <w:rFonts w:ascii="Segoe UI" w:hAnsi="Segoe UI" w:cs="Segoe UI"/>
+          <w:sz w:val="20"/>
+          <w:szCs w:val="20"/>
+        </w:rPr>
+        <w:t>porównuje się nieruchomość będącą przedmiotem wyceny, której cechy są znane, kolejno z nieruchomościami podobnymi, które były przedmiotem obrotu rynkowego               i dla których znane są ceny transakcyjne, warunki zawarcia transakcji oraz cechy tych nieruchomości. Do porównań wybiera się co najmniej trzy nieruchomości ze zbioru nieruchomości podobnych stanowiącego podstawę wyceny. Korekty cen transakcyjnych dokonuje się na podstawie różnic ocen cech rynkowych nieruchomości wycenianej i nieruchomości przyjętych do porównań określonych                     w przyjętych skalach.</w:t>
+      </w:r>
+    </w:p>
+    <w:p>
+      <w:pPr>
         <w:spacing w:after="100"/>
       </w:pPr>
       <w:r>
@@ -13109,7 +13305,7 @@
           <w:rFonts w:ascii="Calibri" w:hAnsi="Calibri"/>
           <w:sz w:val="22"/>
         </w:rPr>
-        <w:t xml:space="preserve">Do porównań przyjęto {pp_count} transakcji. Oceniono cechy przedmiotu i każdego porównania na przyjętych skalach. Poprawki kwotowe wynikają z rozstępu cen, wag cech i mnożników przyjętych przez rzeczoznawcę. Dodatnia poprawka oznacza przewagę przedmiotu nad porównaniem. Cenę każdego porównania skorygowano o sumę poprawek; średnią cen skorygowanych pomnożono przez powierzchnię przedmiotu.</w:t>
+        <w:t xml:space="preserve">Liczba transakcji przyjętych do porównań: {pp_count}. Oceniono cechy przedmiotu i każdego porównania na przyjętych skalach. Poprawki kwotowe wynikają z rozstępu cen, wag cech i mnożników przyjętych przez rzeczoznawcę. Dodatnia poprawka oznacza przewagę przedmiotu nad porównaniem. Cenę każdego porównania skorygowano o sumę poprawek; średnią cen skorygowanych pomnożono przez powierzchnię przedmiotu.</w:t>
       </w:r>
     </w:p>
     <w:p>

</xml_diff>

<commit_message>
feat(operat): render pairwise method and preserve legacy signing (#44)
* feat(operat): render pairwise method and preserve legacy signing

* fix(operat): preserve methodology and current override semantics
</commit_message>
<xml_diff>
--- a/apps/web/templates/operat-szablon.docx
+++ b/apps/web/templates/operat-szablon.docx
@@ -12240,6 +12240,18 @@
     </w:p>
     <w:p>
       <w:pPr>
+        <w:spacing w:after="100"/>
+      </w:pPr>
+      <w:r>
+        <w:rPr>
+          <w:rFonts w:ascii="Calibri" w:hAnsi="Calibri"/>
+          <w:sz w:val="22"/>
+        </w:rPr>
+        <w:t xml:space="preserve">{#metoda_kcs}</w:t>
+      </w:r>
+    </w:p>
+    <w:p>
+      <w:pPr>
         <w:pStyle w:val="Tekstpodstawowy22"/>
         <w:tabs>
           <w:tab w:val="left" w:pos="2268"/>
@@ -12248,84 +12260,17 @@
         <w:jc w:val="both"/>
         <w:rPr>
           <w:rFonts w:ascii="Segoe UI" w:hAnsi="Segoe UI" w:cs="Segoe UI"/>
-          <w:i/>
-          <w:iCs/>
-          <w:sz w:val="20"/>
-          <w:szCs w:val="20"/>
-        </w:rPr>
-      </w:pPr>
-      <w:r>
-        <w:rPr>
-          <w:rFonts w:ascii="Segoe UI" w:hAnsi="Segoe UI" w:cs="Segoe UI"/>
-          <w:bCs/>
+          <w:sz w:val="20"/>
+          <w:szCs w:val="20"/>
+        </w:rPr>
+      </w:pPr>
+      <w:r>
+        <w:rPr>
+          <w:rFonts w:ascii="Segoe UI" w:hAnsi="Segoe UI" w:cs="Segoe UI"/>
           <w:sz w:val="20"/>
           <w:szCs w:val="20"/>
           <w:u w:val="single"/>
         </w:rPr>
-        <w:t>Metoda porównywania parami</w:t>
-      </w:r>
-      <w:r>
-        <w:rPr>
-          <w:rFonts w:ascii="Segoe UI" w:hAnsi="Segoe UI" w:cs="Segoe UI"/>
-          <w:b/>
-          <w:i/>
-          <w:iCs/>
-          <w:sz w:val="20"/>
-          <w:szCs w:val="20"/>
-        </w:rPr>
-        <w:t xml:space="preserve"> </w:t>
-      </w:r>
-      <w:r>
-        <w:rPr>
-          <w:rFonts w:ascii="Segoe UI" w:hAnsi="Segoe UI" w:cs="Segoe UI"/>
-          <w:bCs/>
-          <w:i/>
-          <w:iCs/>
-          <w:sz w:val="20"/>
-          <w:szCs w:val="20"/>
-        </w:rPr>
-        <w:t>–</w:t>
-      </w:r>
-      <w:r>
-        <w:rPr>
-          <w:rFonts w:ascii="Segoe UI" w:hAnsi="Segoe UI" w:cs="Segoe UI"/>
-          <w:i/>
-          <w:iCs/>
-          <w:sz w:val="20"/>
-          <w:szCs w:val="20"/>
-        </w:rPr>
-        <w:t xml:space="preserve"> </w:t>
-      </w:r>
-      <w:r>
-        <w:rPr>
-          <w:rFonts w:ascii="Segoe UI" w:hAnsi="Segoe UI" w:cs="Segoe UI"/>
-          <w:sz w:val="20"/>
-          <w:szCs w:val="20"/>
-        </w:rPr>
-        <w:t>porównuje się nieruchomość będącą przedmiotem wyceny, której cechy są znane, kolejno z nieruchomościami podobnymi, które były przedmiotem obrotu rynkowego               i dla których znane są ceny transakcyjne, warunki zawarcia transakcji oraz cechy tych nieruchomości. Do porównań wybiera się co najmniej trzy nieruchomości ze zbioru nieruchomości podobnych stanowiącego podstawę wyceny. Korekty cen transakcyjnych dokonuje się na podstawie różnic ocen cech rynkowych nieruchomości wycenianej i nieruchomości przyjętych do porównań określonych                     w przyjętych skalach.</w:t>
-      </w:r>
-    </w:p>
-    <w:p>
-      <w:pPr>
-        <w:pStyle w:val="Tekstpodstawowy22"/>
-        <w:tabs>
-          <w:tab w:val="left" w:pos="2268"/>
-        </w:tabs>
-        <w:spacing w:after="0" w:line="276" w:lineRule="auto"/>
-        <w:jc w:val="both"/>
-        <w:rPr>
-          <w:rFonts w:ascii="Segoe UI" w:hAnsi="Segoe UI" w:cs="Segoe UI"/>
-          <w:sz w:val="20"/>
-          <w:szCs w:val="20"/>
-        </w:rPr>
-      </w:pPr>
-      <w:r>
-        <w:rPr>
-          <w:rFonts w:ascii="Segoe UI" w:hAnsi="Segoe UI" w:cs="Segoe UI"/>
-          <w:sz w:val="20"/>
-          <w:szCs w:val="20"/>
-          <w:u w:val="single"/>
-        </w:rPr>
         <w:t>Metoda korygowania ceny średniej</w:t>
       </w:r>
       <w:r>
@@ -12336,52 +12281,6 @@
         </w:rPr>
         <w:t xml:space="preserve"> – przyjmuje się co najmniej kilkanaście nieruchomości podobnych, które były przedmiotem obrotu rynkowego i dla których znane są ceny transakcyjne, warunki zawarcia transakcji oraz cechy tych nieruchomości. Wartość nieruchomości określa się w drodze korekty średniej ceny nieruchomości podobnych w zbiorze stanowiącym podstawę wyceny współczynnikami korygującymi wynikającymi z oceny wycenianej nieruchomości w odniesieniu do przyjętej skali ocen poszczególnych cech rynkowych, z uwzględnieniem położenia ceny średniej w przedziale pomiędzy ceną minimalną i ceną maksymalną.</w:t>
       </w:r>
-    </w:p>
-    <w:p>
-      <w:pPr>
-        <w:pStyle w:val="Tekstpodstawowy22"/>
-        <w:tabs>
-          <w:tab w:val="left" w:pos="2268"/>
-        </w:tabs>
-        <w:spacing w:after="0" w:line="276" w:lineRule="auto"/>
-        <w:jc w:val="both"/>
-        <w:rPr>
-          <w:rFonts w:ascii="Segoe UI" w:hAnsi="Segoe UI" w:cs="Segoe UI"/>
-          <w:sz w:val="20"/>
-          <w:szCs w:val="20"/>
-        </w:rPr>
-      </w:pPr>
-      <w:r>
-        <w:rPr>
-          <w:rFonts w:ascii="Segoe UI" w:hAnsi="Segoe UI" w:cs="Segoe UI"/>
-          <w:sz w:val="20"/>
-          <w:szCs w:val="20"/>
-          <w:u w:val="single"/>
-        </w:rPr>
-        <w:t>Metoda analizy statystycznej rynku</w:t>
-      </w:r>
-      <w:r>
-        <w:rPr>
-          <w:rFonts w:ascii="Segoe UI" w:hAnsi="Segoe UI" w:cs="Segoe UI"/>
-          <w:sz w:val="20"/>
-          <w:szCs w:val="20"/>
-        </w:rPr>
-        <w:t xml:space="preserve"> – przyjmuje się zbiór cen transakcyjnych właściwych do określenia wartości nieruchomości reprezentatywnych, o których mowa w art. 161 ust. 2 ustawy. Wartość nieruchomości określa się przy użyciu metod stosowanych do analiz statystycznych. Przy tworzeniu zbioru cen transakcyjnych właściwych do określenia wartości nieruchomości reprezentatywnych przepis § 5 ust. 2 stosuje się odpowiednio.</w:t>
-      </w:r>
-    </w:p>
-    <w:p>
-      <w:pPr>
-        <w:pStyle w:val="Tekstpodstawowywcity2"/>
-        <w:spacing w:after="0" w:line="276" w:lineRule="auto"/>
-        <w:ind w:left="0"/>
-        <w:jc w:val="both"/>
-        <w:rPr>
-          <w:rFonts w:ascii="Segoe UI" w:hAnsi="Segoe UI" w:cs="Segoe UI"/>
-          <w:sz w:val="20"/>
-          <w:szCs w:val="20"/>
-          <w:u w:val="single"/>
-        </w:rPr>
-      </w:pPr>
     </w:p>
     <w:p>
       <w:pPr>
@@ -13296,6 +13195,133 @@
     </w:p>
     <w:p>
       <w:pPr>
+        <w:spacing w:after="100"/>
+      </w:pPr>
+      <w:r>
+        <w:rPr>
+          <w:rFonts w:ascii="Calibri" w:hAnsi="Calibri"/>
+          <w:sz w:val="22"/>
+        </w:rPr>
+        <w:t xml:space="preserve">{/metoda_kcs}</w:t>
+      </w:r>
+    </w:p>
+    <w:p>
+      <w:pPr>
+        <w:spacing w:after="100"/>
+      </w:pPr>
+      <w:r>
+        <w:rPr>
+          <w:rFonts w:ascii="Calibri" w:hAnsi="Calibri"/>
+          <w:sz w:val="22"/>
+        </w:rPr>
+        <w:t xml:space="preserve">{#metoda_pp}</w:t>
+      </w:r>
+    </w:p>
+    <w:p>
+      <w:pPr>
+        <w:pStyle w:val="Tekstpodstawowy22"/>
+        <w:tabs>
+          <w:tab w:val="left" w:pos="2268"/>
+        </w:tabs>
+        <w:spacing w:after="0" w:line="276" w:lineRule="auto"/>
+        <w:jc w:val="both"/>
+        <w:rPr>
+          <w:rFonts w:ascii="Segoe UI" w:hAnsi="Segoe UI" w:cs="Segoe UI"/>
+          <w:i/>
+          <w:iCs/>
+          <w:sz w:val="20"/>
+          <w:szCs w:val="20"/>
+        </w:rPr>
+      </w:pPr>
+      <w:r>
+        <w:rPr>
+          <w:rFonts w:ascii="Segoe UI" w:hAnsi="Segoe UI" w:cs="Segoe UI"/>
+          <w:bCs/>
+          <w:sz w:val="20"/>
+          <w:szCs w:val="20"/>
+          <w:u w:val="single"/>
+        </w:rPr>
+        <w:t>Metoda porównywania parami</w:t>
+      </w:r>
+      <w:r>
+        <w:rPr>
+          <w:rFonts w:ascii="Segoe UI" w:hAnsi="Segoe UI" w:cs="Segoe UI"/>
+          <w:b/>
+          <w:i/>
+          <w:iCs/>
+          <w:sz w:val="20"/>
+          <w:szCs w:val="20"/>
+        </w:rPr>
+        <w:t xml:space="preserve"> </w:t>
+      </w:r>
+      <w:r>
+        <w:rPr>
+          <w:rFonts w:ascii="Segoe UI" w:hAnsi="Segoe UI" w:cs="Segoe UI"/>
+          <w:bCs/>
+          <w:i/>
+          <w:iCs/>
+          <w:sz w:val="20"/>
+          <w:szCs w:val="20"/>
+        </w:rPr>
+        <w:t>–</w:t>
+      </w:r>
+      <w:r>
+        <w:rPr>
+          <w:rFonts w:ascii="Segoe UI" w:hAnsi="Segoe UI" w:cs="Segoe UI"/>
+          <w:i/>
+          <w:iCs/>
+          <w:sz w:val="20"/>
+          <w:szCs w:val="20"/>
+        </w:rPr>
+        <w:t xml:space="preserve"> </w:t>
+      </w:r>
+      <w:r>
+        <w:rPr>
+          <w:rFonts w:ascii="Segoe UI" w:hAnsi="Segoe UI" w:cs="Segoe UI"/>
+          <w:sz w:val="20"/>
+          <w:szCs w:val="20"/>
+        </w:rPr>
+        <w:t>porównuje się nieruchomość będącą przedmiotem wyceny, której cechy są znane, kolejno z nieruchomościami podobnymi, które były przedmiotem obrotu rynkowego               i dla których znane są ceny transakcyjne, warunki zawarcia transakcji oraz cechy tych nieruchomości. Do porównań wybiera się co najmniej trzy nieruchomości ze zbioru nieruchomości podobnych stanowiącego podstawę wyceny. Korekty cen transakcyjnych dokonuje się na podstawie różnic ocen cech rynkowych nieruchomości wycenianej i nieruchomości przyjętych do porównań określonych                     w przyjętych skalach.</w:t>
+      </w:r>
+    </w:p>
+    <w:p>
+      <w:pPr>
+        <w:spacing w:after="100"/>
+      </w:pPr>
+      <w:r>
+        <w:rPr>
+          <w:rFonts w:ascii="Calibri" w:hAnsi="Calibri"/>
+          <w:sz w:val="22"/>
+        </w:rPr>
+        <w:t xml:space="preserve">Dla określenia wartości rynkowej {przedmiot_d} zastosowano podejście porównawcze, metodę porównywania parami.</w:t>
+      </w:r>
+    </w:p>
+    <w:p>
+      <w:pPr>
+        <w:spacing w:after="100"/>
+      </w:pPr>
+      <w:r>
+        <w:rPr>
+          <w:rFonts w:ascii="Calibri" w:hAnsi="Calibri"/>
+          <w:sz w:val="22"/>
+        </w:rPr>
+        <w:t xml:space="preserve">Liczba transakcji przyjętych do porównań: {pp_count}. Oceniono cechy przedmiotu i każdego porównania na przyjętych skalach. Poprawki kwotowe wynikają z rozstępu cen, wag cech i mnożników przyjętych przez rzeczoznawcę. Dodatnia poprawka oznacza przewagę przedmiotu nad porównaniem. Cenę każdego porównania skorygowano o sumę poprawek; średnią cen skorygowanych pomnożono przez powierzchnię przedmiotu.</w:t>
+      </w:r>
+    </w:p>
+    <w:p>
+      <w:pPr>
+        <w:spacing w:after="100"/>
+      </w:pPr>
+      <w:r>
+        <w:rPr>
+          <w:rFonts w:ascii="Calibri" w:hAnsi="Calibri"/>
+          <w:sz w:val="22"/>
+        </w:rPr>
+        <w:t xml:space="preserve">{/metoda_pp}</w:t>
+      </w:r>
+    </w:p>
+    <w:p>
+      <w:pPr>
         <w:spacing w:line="276" w:lineRule="auto"/>
         <w:contextualSpacing/>
         <w:jc w:val="both"/>
@@ -13457,7 +13483,7 @@
           <w:sz w:val="20"/>
           <w:szCs w:val="20"/>
         </w:rPr>
-        <w:t>korygowania ceny średniej</w:t>
+        <w:t>{metoda_nazwa}</w:t>
       </w:r>
       <w:r>
         <w:rPr>
@@ -13745,7 +13771,7 @@
           <w:sz w:val="20"/>
           <w:szCs w:val="20"/>
         </w:rPr>
-        <w:t>korygowania ceny średniej</w:t>
+        <w:t>{metoda_nazwa}</w:t>
       </w:r>
       <w:r>
         <w:rPr>
@@ -14805,6 +14831,18 @@
     </w:p>
     <w:p>
       <w:pPr>
+        <w:spacing w:after="100"/>
+      </w:pPr>
+      <w:r>
+        <w:rPr>
+          <w:rFonts w:ascii="Calibri" w:hAnsi="Calibri"/>
+          <w:sz w:val="22"/>
+        </w:rPr>
+        <w:t xml:space="preserve">{#metoda_kcs}</w:t>
+      </w:r>
+    </w:p>
+    <w:p>
+      <w:pPr>
         <w:spacing w:line="276" w:lineRule="auto"/>
         <w:rPr>
           <w:rFonts w:ascii="Segoe UI" w:hAnsi="Segoe UI" w:cs="Segoe UI"/>
@@ -16825,7 +16863,7 @@
                 <w:sz w:val="18"/>
                 <w:szCs w:val="18"/>
               </w:rPr>
-              <w:t>100</w:t>
+              <w:t>{suma_wag}</w:t>
             </w:r>
           </w:p>
         </w:tc>
@@ -16886,7 +16924,7 @@
                 <w:sz w:val="18"/>
                 <w:szCs w:val="18"/>
               </w:rPr>
-              <w:t>1,000</w:t>
+              <w:t>{suma_ui_sr}</w:t>
             </w:r>
           </w:p>
         </w:tc>
@@ -16964,6 +17002,18 @@
           <w:szCs w:val="18"/>
         </w:rPr>
         <w:t>Źródło: Opracowanie własne</w:t>
+      </w:r>
+    </w:p>
+    <w:p>
+      <w:pPr>
+        <w:spacing w:after="100"/>
+      </w:pPr>
+      <w:r>
+        <w:rPr>
+          <w:rFonts w:ascii="Calibri" w:hAnsi="Calibri"/>
+          <w:sz w:val="22"/>
+        </w:rPr>
+        <w:t xml:space="preserve">{#skala_mieszana}Kreska w kolumnie środkowej oznacza brak oceny pośredniej w skali dwupoziomowej. Suma środkowa nie jest określona dla zestawu zawierającego taką skalę.{/skala_mieszana}</w:t>
       </w:r>
     </w:p>
     <w:p>
@@ -18331,6 +18381,1365 @@
           <w:szCs w:val="20"/>
         </w:rPr>
       </w:pPr>
+    </w:p>
+    <w:p>
+      <w:pPr>
+        <w:spacing w:after="100"/>
+      </w:pPr>
+      <w:r>
+        <w:rPr>
+          <w:rFonts w:ascii="Calibri" w:hAnsi="Calibri"/>
+          <w:sz w:val="22"/>
+        </w:rPr>
+        <w:t xml:space="preserve">{/metoda_kcs}</w:t>
+      </w:r>
+    </w:p>
+    <w:p>
+      <w:pPr>
+        <w:spacing w:after="100"/>
+      </w:pPr>
+      <w:r>
+        <w:rPr>
+          <w:rFonts w:ascii="Calibri" w:hAnsi="Calibri"/>
+          <w:sz w:val="22"/>
+        </w:rPr>
+        <w:t xml:space="preserve">{#metoda_pp}</w:t>
+      </w:r>
+    </w:p>
+    <w:p>
+      <w:pPr>
+        <w:keepNext/>
+        <w:spacing w:after="100"/>
+      </w:pPr>
+      <w:r>
+        <w:rPr>
+          <w:rFonts w:ascii="Calibri" w:hAnsi="Calibri"/>
+          <w:b/>
+          <w:sz w:val="22"/>
+        </w:rPr>
+        <w:t xml:space="preserve">Tabela 1. Charakterystyka wybranych nieruchomości lokalowych o funkcji mieszkalnej</w:t>
+      </w:r>
+    </w:p>
+    <w:tbl>
+      <w:tblPr>
+        <w:tblCaption w:val="pp-dynamic-2"/>
+        <w:tblW w:w="9000" w:type="dxa"/>
+        <w:tblLayout w:type="fixed"/>
+        <w:tblBorders>
+          <w:top w:val="single" w:sz="4" w:color="888888"/>
+          <w:left w:val="single" w:sz="4" w:color="888888"/>
+          <w:bottom w:val="single" w:sz="4" w:color="888888"/>
+          <w:right w:val="single" w:sz="4" w:color="888888"/>
+          <w:insideH w:val="single" w:sz="4" w:color="888888"/>
+          <w:insideV w:val="single" w:sz="4" w:color="888888"/>
+        </w:tblBorders>
+      </w:tblPr>
+      <w:tblGrid>
+        <w:gridCol w:w="1200"/>
+        <w:gridCol w:w="1200"/>
+        <w:gridCol w:w="1200"/>
+        <w:gridCol w:w="1200"/>
+        <w:gridCol w:w="1200"/>
+        <w:gridCol w:w="1200"/>
+        <w:gridCol w:w="1200"/>
+      </w:tblGrid>
+      <w:tr>
+        <w:trPr>
+          <w:cantSplit/>
+          <w:tblHeader/>
+        </w:trPr>
+        <w:tc>
+          <w:tcPr>
+            <w:tcW w:w="1200" w:type="dxa"/>
+            <w:vAlign w:val="center"/>
+          </w:tcPr>
+          <w:p>
+            <w:pPr>
+              <w:spacing w:after="70" w:before="70"/>
+            </w:pPr>
+            <w:r>
+              <w:rPr>
+                <w:rFonts w:ascii="Calibri" w:hAnsi="Calibri"/>
+                <w:sz w:val="18"/>
+              </w:rPr>
+              <w:t xml:space="preserve">Cecha</w:t>
+            </w:r>
+          </w:p>
+        </w:tc>
+        <w:tc>
+          <w:tcPr>
+            <w:tcW w:w="1200" w:type="dxa"/>
+            <w:vAlign w:val="center"/>
+          </w:tcPr>
+          <w:p>
+            <w:pPr>
+              <w:spacing w:after="70" w:before="70"/>
+            </w:pPr>
+            <w:r>
+              <w:rPr>
+                <w:rFonts w:ascii="Calibri" w:hAnsi="Calibri"/>
+                <w:sz w:val="18"/>
+              </w:rPr>
+              <w:t xml:space="preserve">Przedmiot</w:t>
+            </w:r>
+          </w:p>
+        </w:tc>
+        <w:tc>
+          <w:tcPr>
+            <w:tcW w:w="1200" w:type="dxa"/>
+            <w:vAlign w:val="center"/>
+          </w:tcPr>
+          <w:p>
+            <w:pPr>
+              <w:spacing w:after="70" w:before="70"/>
+            </w:pPr>
+            <w:r>
+              <w:rPr>
+                <w:rFonts w:ascii="Calibri" w:hAnsi="Calibri"/>
+                <w:sz w:val="18"/>
+              </w:rPr>
+              <w:t xml:space="preserve">1</w:t>
+            </w:r>
+          </w:p>
+        </w:tc>
+        <w:tc>
+          <w:tcPr>
+            <w:tcW w:w="1200" w:type="dxa"/>
+            <w:vAlign w:val="center"/>
+          </w:tcPr>
+          <w:p>
+            <w:pPr>
+              <w:spacing w:after="70" w:before="70"/>
+            </w:pPr>
+            <w:r>
+              <w:rPr>
+                <w:rFonts w:ascii="Calibri" w:hAnsi="Calibri"/>
+                <w:sz w:val="18"/>
+              </w:rPr>
+              <w:t xml:space="preserve">2</w:t>
+            </w:r>
+          </w:p>
+        </w:tc>
+        <w:tc>
+          <w:tcPr>
+            <w:tcW w:w="1200" w:type="dxa"/>
+            <w:vAlign w:val="center"/>
+          </w:tcPr>
+          <w:p>
+            <w:pPr>
+              <w:spacing w:after="70" w:before="70"/>
+            </w:pPr>
+            <w:r>
+              <w:rPr>
+                <w:rFonts w:ascii="Calibri" w:hAnsi="Calibri"/>
+                <w:sz w:val="18"/>
+              </w:rPr>
+              <w:t xml:space="preserve">3</w:t>
+            </w:r>
+          </w:p>
+        </w:tc>
+        <w:tc>
+          <w:tcPr>
+            <w:tcW w:w="1200" w:type="dxa"/>
+            <w:vAlign w:val="center"/>
+          </w:tcPr>
+          <w:p>
+            <w:pPr>
+              <w:spacing w:after="70" w:before="70"/>
+            </w:pPr>
+            <w:r>
+              <w:rPr>
+                <w:rFonts w:ascii="Calibri" w:hAnsi="Calibri"/>
+                <w:sz w:val="18"/>
+              </w:rPr>
+              <w:t xml:space="preserve">4</w:t>
+            </w:r>
+          </w:p>
+        </w:tc>
+        <w:tc>
+          <w:tcPr>
+            <w:tcW w:w="1200" w:type="dxa"/>
+            <w:vAlign w:val="center"/>
+          </w:tcPr>
+          <w:p>
+            <w:pPr>
+              <w:spacing w:after="70" w:before="70"/>
+            </w:pPr>
+            <w:r>
+              <w:rPr>
+                <w:rFonts w:ascii="Calibri" w:hAnsi="Calibri"/>
+                <w:sz w:val="18"/>
+              </w:rPr>
+              <w:t xml:space="preserve">5</w:t>
+            </w:r>
+          </w:p>
+        </w:tc>
+      </w:tr>
+      <w:tr>
+        <w:trPr>
+          <w:cantSplit/>
+        </w:trPr>
+        <w:tc>
+          <w:tcPr>
+            <w:tcW w:w="1200" w:type="dxa"/>
+            <w:vAlign w:val="center"/>
+          </w:tcPr>
+          <w:p>
+            <w:pPr>
+              <w:spacing w:after="70" w:before="70"/>
+            </w:pPr>
+            <w:r>
+              <w:rPr>
+                <w:rFonts w:ascii="Calibri" w:hAnsi="Calibri"/>
+                <w:sz w:val="18"/>
+              </w:rPr>
+              <w:t xml:space="preserve">{#pp_rows}{label}</w:t>
+            </w:r>
+          </w:p>
+        </w:tc>
+        <w:tc>
+          <w:tcPr>
+            <w:tcW w:w="1200" w:type="dxa"/>
+            <w:vAlign w:val="center"/>
+          </w:tcPr>
+          <w:p>
+            <w:pPr>
+              <w:spacing w:after="70" w:before="70"/>
+            </w:pPr>
+            <w:r>
+              <w:rPr>
+                <w:rFonts w:ascii="Calibri" w:hAnsi="Calibri"/>
+                <w:sz w:val="18"/>
+              </w:rPr>
+              <w:t xml:space="preserve">{subject}</w:t>
+            </w:r>
+          </w:p>
+        </w:tc>
+        <w:tc>
+          <w:tcPr>
+            <w:tcW w:w="1200" w:type="dxa"/>
+            <w:vAlign w:val="center"/>
+          </w:tcPr>
+          <w:p>
+            <w:pPr>
+              <w:spacing w:after="70" w:before="70"/>
+            </w:pPr>
+            <w:r>
+              <w:rPr>
+                <w:rFonts w:ascii="Calibri" w:hAnsi="Calibri"/>
+                <w:sz w:val="18"/>
+              </w:rPr>
+              <w:t xml:space="preserve">{c1}</w:t>
+            </w:r>
+          </w:p>
+        </w:tc>
+        <w:tc>
+          <w:tcPr>
+            <w:tcW w:w="1200" w:type="dxa"/>
+            <w:vAlign w:val="center"/>
+          </w:tcPr>
+          <w:p>
+            <w:pPr>
+              <w:spacing w:after="70" w:before="70"/>
+            </w:pPr>
+            <w:r>
+              <w:rPr>
+                <w:rFonts w:ascii="Calibri" w:hAnsi="Calibri"/>
+                <w:sz w:val="18"/>
+              </w:rPr>
+              <w:t xml:space="preserve">{c2}</w:t>
+            </w:r>
+          </w:p>
+        </w:tc>
+        <w:tc>
+          <w:tcPr>
+            <w:tcW w:w="1200" w:type="dxa"/>
+            <w:vAlign w:val="center"/>
+          </w:tcPr>
+          <w:p>
+            <w:pPr>
+              <w:spacing w:after="70" w:before="70"/>
+            </w:pPr>
+            <w:r>
+              <w:rPr>
+                <w:rFonts w:ascii="Calibri" w:hAnsi="Calibri"/>
+                <w:sz w:val="18"/>
+              </w:rPr>
+              <w:t xml:space="preserve">{c3}</w:t>
+            </w:r>
+          </w:p>
+        </w:tc>
+        <w:tc>
+          <w:tcPr>
+            <w:tcW w:w="1200" w:type="dxa"/>
+            <w:vAlign w:val="center"/>
+          </w:tcPr>
+          <w:p>
+            <w:pPr>
+              <w:spacing w:after="70" w:before="70"/>
+            </w:pPr>
+            <w:r>
+              <w:rPr>
+                <w:rFonts w:ascii="Calibri" w:hAnsi="Calibri"/>
+                <w:sz w:val="18"/>
+              </w:rPr>
+              <w:t xml:space="preserve">{c4}</w:t>
+            </w:r>
+          </w:p>
+        </w:tc>
+        <w:tc>
+          <w:tcPr>
+            <w:tcW w:w="1200" w:type="dxa"/>
+            <w:vAlign w:val="center"/>
+          </w:tcPr>
+          <w:p>
+            <w:pPr>
+              <w:spacing w:after="70" w:before="70"/>
+            </w:pPr>
+            <w:r>
+              <w:rPr>
+                <w:rFonts w:ascii="Calibri" w:hAnsi="Calibri"/>
+                <w:sz w:val="18"/>
+              </w:rPr>
+              <w:t xml:space="preserve">{c5}{/pp_rows}</w:t>
+            </w:r>
+          </w:p>
+        </w:tc>
+      </w:tr>
+    </w:tbl>
+    <w:p>
+      <w:pPr>
+        <w:keepNext/>
+        <w:spacing w:after="100"/>
+      </w:pPr>
+      <w:r>
+        <w:rPr>
+          <w:rFonts w:ascii="Calibri" w:hAnsi="Calibri"/>
+          <w:b/>
+          <w:sz w:val="22"/>
+        </w:rPr>
+        <w:t xml:space="preserve">12.3. Poprawki i ceny skorygowane</w:t>
+      </w:r>
+    </w:p>
+    <w:p>
+      <w:pPr>
+        <w:spacing w:after="100"/>
+      </w:pPr>
+      <w:r>
+        <w:rPr>
+          <w:rFonts w:ascii="Calibri" w:hAnsi="Calibri"/>
+          <w:sz w:val="22"/>
+        </w:rPr>
+        <w:t xml:space="preserve">Rozstęp cen wybranych transakcji ΔC = {pp_spread} zł/m². Zakres kwotowy cechy = ΔC × waga. Poprawka = zakres × przyjęty mnożnik.</w:t>
+      </w:r>
+    </w:p>
+    <w:p>
+      <w:pPr>
+        <w:keepNext/>
+        <w:spacing w:after="100"/>
+      </w:pPr>
+      <w:r>
+        <w:rPr>
+          <w:rFonts w:ascii="Calibri" w:hAnsi="Calibri"/>
+          <w:b/>
+          <w:sz w:val="22"/>
+        </w:rPr>
+        <w:t xml:space="preserve">Tabela 2. Porównanie nieruchomości wycenianej z nieruchomościami podobnymi</w:t>
+      </w:r>
+    </w:p>
+    <w:tbl>
+      <w:tblPr>
+        <w:tblCaption w:val="pp-dynamic-3"/>
+        <w:tblW w:w="9000" w:type="dxa"/>
+        <w:tblLayout w:type="fixed"/>
+        <w:tblBorders>
+          <w:top w:val="single" w:sz="4" w:color="888888"/>
+          <w:left w:val="single" w:sz="4" w:color="888888"/>
+          <w:bottom w:val="single" w:sz="4" w:color="888888"/>
+          <w:right w:val="single" w:sz="4" w:color="888888"/>
+          <w:insideH w:val="single" w:sz="4" w:color="888888"/>
+          <w:insideV w:val="single" w:sz="4" w:color="888888"/>
+        </w:tblBorders>
+      </w:tblPr>
+      <w:tblGrid>
+        <w:gridCol w:w="1200"/>
+        <w:gridCol w:w="1200"/>
+        <w:gridCol w:w="1200"/>
+        <w:gridCol w:w="1200"/>
+        <w:gridCol w:w="1200"/>
+        <w:gridCol w:w="1200"/>
+        <w:gridCol w:w="1200"/>
+        <w:gridCol w:w="1200"/>
+      </w:tblGrid>
+      <w:tr>
+        <w:trPr>
+          <w:cantSplit/>
+          <w:tblHeader/>
+        </w:trPr>
+        <w:tc>
+          <w:tcPr>
+            <w:tcW w:w="1200" w:type="dxa"/>
+            <w:vAlign w:val="center"/>
+          </w:tcPr>
+          <w:p>
+            <w:pPr>
+              <w:spacing w:after="70" w:before="70"/>
+            </w:pPr>
+            <w:r>
+              <w:rPr>
+                <w:rFonts w:ascii="Calibri" w:hAnsi="Calibri"/>
+                <w:sz w:val="18"/>
+              </w:rPr>
+              <w:t xml:space="preserve">Cecha</w:t>
+            </w:r>
+          </w:p>
+        </w:tc>
+        <w:tc>
+          <w:tcPr>
+            <w:tcW w:w="1200" w:type="dxa"/>
+            <w:vAlign w:val="center"/>
+          </w:tcPr>
+          <w:p>
+            <w:pPr>
+              <w:spacing w:after="70" w:before="70"/>
+            </w:pPr>
+            <w:r>
+              <w:rPr>
+                <w:rFonts w:ascii="Calibri" w:hAnsi="Calibri"/>
+                <w:sz w:val="18"/>
+              </w:rPr>
+              <w:t xml:space="preserve">Waga [%]</w:t>
+            </w:r>
+          </w:p>
+        </w:tc>
+        <w:tc>
+          <w:tcPr>
+            <w:tcW w:w="1200" w:type="dxa"/>
+            <w:vAlign w:val="center"/>
+          </w:tcPr>
+          <w:p>
+            <w:pPr>
+              <w:spacing w:after="70" w:before="70"/>
+            </w:pPr>
+            <w:r>
+              <w:rPr>
+                <w:rFonts w:ascii="Calibri" w:hAnsi="Calibri"/>
+                <w:sz w:val="18"/>
+              </w:rPr>
+              <w:t xml:space="preserve">Zakres [zł/m²]</w:t>
+            </w:r>
+          </w:p>
+        </w:tc>
+        <w:tc>
+          <w:tcPr>
+            <w:tcW w:w="1200" w:type="dxa"/>
+            <w:vAlign w:val="center"/>
+          </w:tcPr>
+          <w:p>
+            <w:pPr>
+              <w:spacing w:after="70" w:before="70"/>
+            </w:pPr>
+            <w:r>
+              <w:rPr>
+                <w:rFonts w:ascii="Calibri" w:hAnsi="Calibri"/>
+                <w:sz w:val="18"/>
+              </w:rPr>
+              <w:t xml:space="preserve">1</w:t>
+            </w:r>
+          </w:p>
+        </w:tc>
+        <w:tc>
+          <w:tcPr>
+            <w:tcW w:w="1200" w:type="dxa"/>
+            <w:vAlign w:val="center"/>
+          </w:tcPr>
+          <w:p>
+            <w:pPr>
+              <w:spacing w:after="70" w:before="70"/>
+            </w:pPr>
+            <w:r>
+              <w:rPr>
+                <w:rFonts w:ascii="Calibri" w:hAnsi="Calibri"/>
+                <w:sz w:val="18"/>
+              </w:rPr>
+              <w:t xml:space="preserve">2</w:t>
+            </w:r>
+          </w:p>
+        </w:tc>
+        <w:tc>
+          <w:tcPr>
+            <w:tcW w:w="1200" w:type="dxa"/>
+            <w:vAlign w:val="center"/>
+          </w:tcPr>
+          <w:p>
+            <w:pPr>
+              <w:spacing w:after="70" w:before="70"/>
+            </w:pPr>
+            <w:r>
+              <w:rPr>
+                <w:rFonts w:ascii="Calibri" w:hAnsi="Calibri"/>
+                <w:sz w:val="18"/>
+              </w:rPr>
+              <w:t xml:space="preserve">3</w:t>
+            </w:r>
+          </w:p>
+        </w:tc>
+        <w:tc>
+          <w:tcPr>
+            <w:tcW w:w="1200" w:type="dxa"/>
+            <w:vAlign w:val="center"/>
+          </w:tcPr>
+          <w:p>
+            <w:pPr>
+              <w:spacing w:after="70" w:before="70"/>
+            </w:pPr>
+            <w:r>
+              <w:rPr>
+                <w:rFonts w:ascii="Calibri" w:hAnsi="Calibri"/>
+                <w:sz w:val="18"/>
+              </w:rPr>
+              <w:t xml:space="preserve">4</w:t>
+            </w:r>
+          </w:p>
+        </w:tc>
+        <w:tc>
+          <w:tcPr>
+            <w:tcW w:w="1200" w:type="dxa"/>
+            <w:vAlign w:val="center"/>
+          </w:tcPr>
+          <w:p>
+            <w:pPr>
+              <w:spacing w:after="70" w:before="70"/>
+            </w:pPr>
+            <w:r>
+              <w:rPr>
+                <w:rFonts w:ascii="Calibri" w:hAnsi="Calibri"/>
+                <w:sz w:val="18"/>
+              </w:rPr>
+              <w:t xml:space="preserve">5</w:t>
+            </w:r>
+          </w:p>
+        </w:tc>
+      </w:tr>
+      <w:tr>
+        <w:trPr>
+          <w:cantSplit/>
+        </w:trPr>
+        <w:tc>
+          <w:tcPr>
+            <w:tcW w:w="1200" w:type="dxa"/>
+            <w:vAlign w:val="center"/>
+          </w:tcPr>
+          <w:p>
+            <w:pPr>
+              <w:spacing w:after="70" w:before="70"/>
+            </w:pPr>
+            <w:r>
+              <w:rPr>
+                <w:rFonts w:ascii="Calibri" w:hAnsi="Calibri"/>
+                <w:sz w:val="18"/>
+              </w:rPr>
+              <w:t xml:space="preserve">{#pp_corrections}{label}</w:t>
+            </w:r>
+          </w:p>
+        </w:tc>
+        <w:tc>
+          <w:tcPr>
+            <w:tcW w:w="1200" w:type="dxa"/>
+            <w:vAlign w:val="center"/>
+          </w:tcPr>
+          <w:p>
+            <w:pPr>
+              <w:spacing w:after="70" w:before="70"/>
+            </w:pPr>
+            <w:r>
+              <w:rPr>
+                <w:rFonts w:ascii="Calibri" w:hAnsi="Calibri"/>
+                <w:sz w:val="18"/>
+              </w:rPr>
+              <w:t xml:space="preserve">{weight}</w:t>
+            </w:r>
+          </w:p>
+        </w:tc>
+        <w:tc>
+          <w:tcPr>
+            <w:tcW w:w="1200" w:type="dxa"/>
+            <w:vAlign w:val="center"/>
+          </w:tcPr>
+          <w:p>
+            <w:pPr>
+              <w:spacing w:after="70" w:before="70"/>
+            </w:pPr>
+            <w:r>
+              <w:rPr>
+                <w:rFonts w:ascii="Calibri" w:hAnsi="Calibri"/>
+                <w:sz w:val="18"/>
+              </w:rPr>
+              <w:t xml:space="preserve">{range}</w:t>
+            </w:r>
+          </w:p>
+        </w:tc>
+        <w:tc>
+          <w:tcPr>
+            <w:tcW w:w="1200" w:type="dxa"/>
+            <w:vAlign w:val="center"/>
+          </w:tcPr>
+          <w:p>
+            <w:pPr>
+              <w:spacing w:after="70" w:before="70"/>
+            </w:pPr>
+            <w:r>
+              <w:rPr>
+                <w:rFonts w:ascii="Calibri" w:hAnsi="Calibri"/>
+                <w:sz w:val="18"/>
+              </w:rPr>
+              <w:t xml:space="preserve">{c1}</w:t>
+            </w:r>
+          </w:p>
+        </w:tc>
+        <w:tc>
+          <w:tcPr>
+            <w:tcW w:w="1200" w:type="dxa"/>
+            <w:vAlign w:val="center"/>
+          </w:tcPr>
+          <w:p>
+            <w:pPr>
+              <w:spacing w:after="70" w:before="70"/>
+            </w:pPr>
+            <w:r>
+              <w:rPr>
+                <w:rFonts w:ascii="Calibri" w:hAnsi="Calibri"/>
+                <w:sz w:val="18"/>
+              </w:rPr>
+              <w:t xml:space="preserve">{c2}</w:t>
+            </w:r>
+          </w:p>
+        </w:tc>
+        <w:tc>
+          <w:tcPr>
+            <w:tcW w:w="1200" w:type="dxa"/>
+            <w:vAlign w:val="center"/>
+          </w:tcPr>
+          <w:p>
+            <w:pPr>
+              <w:spacing w:after="70" w:before="70"/>
+            </w:pPr>
+            <w:r>
+              <w:rPr>
+                <w:rFonts w:ascii="Calibri" w:hAnsi="Calibri"/>
+                <w:sz w:val="18"/>
+              </w:rPr>
+              <w:t xml:space="preserve">{c3}</w:t>
+            </w:r>
+          </w:p>
+        </w:tc>
+        <w:tc>
+          <w:tcPr>
+            <w:tcW w:w="1200" w:type="dxa"/>
+            <w:vAlign w:val="center"/>
+          </w:tcPr>
+          <w:p>
+            <w:pPr>
+              <w:spacing w:after="70" w:before="70"/>
+            </w:pPr>
+            <w:r>
+              <w:rPr>
+                <w:rFonts w:ascii="Calibri" w:hAnsi="Calibri"/>
+                <w:sz w:val="18"/>
+              </w:rPr>
+              <w:t xml:space="preserve">{c4}</w:t>
+            </w:r>
+          </w:p>
+        </w:tc>
+        <w:tc>
+          <w:tcPr>
+            <w:tcW w:w="1200" w:type="dxa"/>
+            <w:vAlign w:val="center"/>
+          </w:tcPr>
+          <w:p>
+            <w:pPr>
+              <w:spacing w:after="70" w:before="70"/>
+            </w:pPr>
+            <w:r>
+              <w:rPr>
+                <w:rFonts w:ascii="Calibri" w:hAnsi="Calibri"/>
+                <w:sz w:val="18"/>
+              </w:rPr>
+              <w:t xml:space="preserve">{c5}{/pp_corrections}</w:t>
+            </w:r>
+          </w:p>
+        </w:tc>
+      </w:tr>
+    </w:tbl>
+    <w:p>
+      <w:pPr>
+        <w:spacing w:after="100"/>
+      </w:pPr>
+      <w:r>
+        <w:rPr>
+          <w:rFonts w:ascii="Calibri" w:hAnsi="Calibri"/>
+          <w:sz w:val="22"/>
+        </w:rPr>
+        <w:t xml:space="preserve">{#pp_overrides}</w:t>
+      </w:r>
+    </w:p>
+    <w:p>
+      <w:pPr>
+        <w:spacing w:after="100"/>
+      </w:pPr>
+      <w:r>
+        <w:rPr>
+          <w:rFonts w:ascii="Calibri" w:hAnsi="Calibri"/>
+          <w:sz w:val="22"/>
+        </w:rPr>
+        <w:t xml:space="preserve">{.}</w:t>
+      </w:r>
+    </w:p>
+    <w:p>
+      <w:pPr>
+        <w:spacing w:after="100"/>
+      </w:pPr>
+      <w:r>
+        <w:rPr>
+          <w:rFonts w:ascii="Calibri" w:hAnsi="Calibri"/>
+          <w:sz w:val="22"/>
+        </w:rPr>
+        <w:t xml:space="preserve">{/pp_overrides}</w:t>
+      </w:r>
+    </w:p>
+    <w:p>
+      <w:pPr>
+        <w:keepNext/>
+        <w:spacing w:after="100"/>
+      </w:pPr>
+      <w:r>
+        <w:rPr>
+          <w:rFonts w:ascii="Calibri" w:hAnsi="Calibri"/>
+          <w:b/>
+          <w:sz w:val="22"/>
+        </w:rPr>
+        <w:t xml:space="preserve">Tabela 3. Obliczenie skorygowanej ceny transakcyjnej każdego lokalu mieszkalnego przyjętego do porównań przy użyciu określonych poprawek</w:t>
+      </w:r>
+    </w:p>
+    <w:tbl>
+      <w:tblPr>
+        <w:tblCaption w:val="pp-dynamic-1"/>
+        <w:tblW w:w="9000" w:type="dxa"/>
+        <w:tblLayout w:type="fixed"/>
+        <w:tblBorders>
+          <w:top w:val="single" w:sz="4" w:color="888888"/>
+          <w:left w:val="single" w:sz="4" w:color="888888"/>
+          <w:bottom w:val="single" w:sz="4" w:color="888888"/>
+          <w:right w:val="single" w:sz="4" w:color="888888"/>
+          <w:insideH w:val="single" w:sz="4" w:color="888888"/>
+          <w:insideV w:val="single" w:sz="4" w:color="888888"/>
+        </w:tblBorders>
+      </w:tblPr>
+      <w:tblGrid>
+        <w:gridCol w:w="1200"/>
+        <w:gridCol w:w="1200"/>
+        <w:gridCol w:w="1200"/>
+        <w:gridCol w:w="1200"/>
+        <w:gridCol w:w="1200"/>
+        <w:gridCol w:w="1200"/>
+      </w:tblGrid>
+      <w:tr>
+        <w:trPr>
+          <w:cantSplit/>
+          <w:tblHeader/>
+        </w:trPr>
+        <w:tc>
+          <w:tcPr>
+            <w:tcW w:w="1200" w:type="dxa"/>
+            <w:vAlign w:val="center"/>
+          </w:tcPr>
+          <w:p>
+            <w:pPr>
+              <w:spacing w:after="70" w:before="70"/>
+            </w:pPr>
+            <w:r>
+              <w:rPr>
+                <w:rFonts w:ascii="Calibri" w:hAnsi="Calibri"/>
+                <w:sz w:val="18"/>
+              </w:rPr>
+              <w:t xml:space="preserve">Cena / poprawka</w:t>
+            </w:r>
+          </w:p>
+        </w:tc>
+        <w:tc>
+          <w:tcPr>
+            <w:tcW w:w="1200" w:type="dxa"/>
+            <w:vAlign w:val="center"/>
+          </w:tcPr>
+          <w:p>
+            <w:pPr>
+              <w:spacing w:after="70" w:before="70"/>
+            </w:pPr>
+            <w:r>
+              <w:rPr>
+                <w:rFonts w:ascii="Calibri" w:hAnsi="Calibri"/>
+                <w:sz w:val="18"/>
+              </w:rPr>
+              <w:t xml:space="preserve">1</w:t>
+            </w:r>
+          </w:p>
+        </w:tc>
+        <w:tc>
+          <w:tcPr>
+            <w:tcW w:w="1200" w:type="dxa"/>
+            <w:vAlign w:val="center"/>
+          </w:tcPr>
+          <w:p>
+            <w:pPr>
+              <w:spacing w:after="70" w:before="70"/>
+            </w:pPr>
+            <w:r>
+              <w:rPr>
+                <w:rFonts w:ascii="Calibri" w:hAnsi="Calibri"/>
+                <w:sz w:val="18"/>
+              </w:rPr>
+              <w:t xml:space="preserve">2</w:t>
+            </w:r>
+          </w:p>
+        </w:tc>
+        <w:tc>
+          <w:tcPr>
+            <w:tcW w:w="1200" w:type="dxa"/>
+            <w:vAlign w:val="center"/>
+          </w:tcPr>
+          <w:p>
+            <w:pPr>
+              <w:spacing w:after="70" w:before="70"/>
+            </w:pPr>
+            <w:r>
+              <w:rPr>
+                <w:rFonts w:ascii="Calibri" w:hAnsi="Calibri"/>
+                <w:sz w:val="18"/>
+              </w:rPr>
+              <w:t xml:space="preserve">3</w:t>
+            </w:r>
+          </w:p>
+        </w:tc>
+        <w:tc>
+          <w:tcPr>
+            <w:tcW w:w="1200" w:type="dxa"/>
+            <w:vAlign w:val="center"/>
+          </w:tcPr>
+          <w:p>
+            <w:pPr>
+              <w:spacing w:after="70" w:before="70"/>
+            </w:pPr>
+            <w:r>
+              <w:rPr>
+                <w:rFonts w:ascii="Calibri" w:hAnsi="Calibri"/>
+                <w:sz w:val="18"/>
+              </w:rPr>
+              <w:t xml:space="preserve">4</w:t>
+            </w:r>
+          </w:p>
+        </w:tc>
+        <w:tc>
+          <w:tcPr>
+            <w:tcW w:w="1200" w:type="dxa"/>
+            <w:vAlign w:val="center"/>
+          </w:tcPr>
+          <w:p>
+            <w:pPr>
+              <w:spacing w:after="70" w:before="70"/>
+            </w:pPr>
+            <w:r>
+              <w:rPr>
+                <w:rFonts w:ascii="Calibri" w:hAnsi="Calibri"/>
+                <w:sz w:val="18"/>
+              </w:rPr>
+              <w:t xml:space="preserve">5</w:t>
+            </w:r>
+          </w:p>
+        </w:tc>
+      </w:tr>
+      <w:tr>
+        <w:trPr>
+          <w:cantSplit/>
+        </w:trPr>
+        <w:tc>
+          <w:tcPr>
+            <w:tcW w:w="1200" w:type="dxa"/>
+            <w:vAlign w:val="center"/>
+          </w:tcPr>
+          <w:p>
+            <w:pPr>
+              <w:spacing w:after="70" w:before="70"/>
+            </w:pPr>
+            <w:r>
+              <w:rPr>
+                <w:rFonts w:ascii="Calibri" w:hAnsi="Calibri"/>
+                <w:sz w:val="18"/>
+              </w:rPr>
+              <w:t xml:space="preserve">{#pp_prices}{label}</w:t>
+            </w:r>
+          </w:p>
+        </w:tc>
+        <w:tc>
+          <w:tcPr>
+            <w:tcW w:w="1200" w:type="dxa"/>
+            <w:vAlign w:val="center"/>
+          </w:tcPr>
+          <w:p>
+            <w:pPr>
+              <w:spacing w:after="70" w:before="70"/>
+            </w:pPr>
+            <w:r>
+              <w:rPr>
+                <w:rFonts w:ascii="Calibri" w:hAnsi="Calibri"/>
+                <w:sz w:val="18"/>
+              </w:rPr>
+              <w:t xml:space="preserve">{c1}</w:t>
+            </w:r>
+          </w:p>
+        </w:tc>
+        <w:tc>
+          <w:tcPr>
+            <w:tcW w:w="1200" w:type="dxa"/>
+            <w:vAlign w:val="center"/>
+          </w:tcPr>
+          <w:p>
+            <w:pPr>
+              <w:spacing w:after="70" w:before="70"/>
+            </w:pPr>
+            <w:r>
+              <w:rPr>
+                <w:rFonts w:ascii="Calibri" w:hAnsi="Calibri"/>
+                <w:sz w:val="18"/>
+              </w:rPr>
+              <w:t xml:space="preserve">{c2}</w:t>
+            </w:r>
+          </w:p>
+        </w:tc>
+        <w:tc>
+          <w:tcPr>
+            <w:tcW w:w="1200" w:type="dxa"/>
+            <w:vAlign w:val="center"/>
+          </w:tcPr>
+          <w:p>
+            <w:pPr>
+              <w:spacing w:after="70" w:before="70"/>
+            </w:pPr>
+            <w:r>
+              <w:rPr>
+                <w:rFonts w:ascii="Calibri" w:hAnsi="Calibri"/>
+                <w:sz w:val="18"/>
+              </w:rPr>
+              <w:t xml:space="preserve">{c3}</w:t>
+            </w:r>
+          </w:p>
+        </w:tc>
+        <w:tc>
+          <w:tcPr>
+            <w:tcW w:w="1200" w:type="dxa"/>
+            <w:vAlign w:val="center"/>
+          </w:tcPr>
+          <w:p>
+            <w:pPr>
+              <w:spacing w:after="70" w:before="70"/>
+            </w:pPr>
+            <w:r>
+              <w:rPr>
+                <w:rFonts w:ascii="Calibri" w:hAnsi="Calibri"/>
+                <w:sz w:val="18"/>
+              </w:rPr>
+              <w:t xml:space="preserve">{c4}</w:t>
+            </w:r>
+          </w:p>
+        </w:tc>
+        <w:tc>
+          <w:tcPr>
+            <w:tcW w:w="1200" w:type="dxa"/>
+            <w:vAlign w:val="center"/>
+          </w:tcPr>
+          <w:p>
+            <w:pPr>
+              <w:spacing w:after="70" w:before="70"/>
+            </w:pPr>
+            <w:r>
+              <w:rPr>
+                <w:rFonts w:ascii="Calibri" w:hAnsi="Calibri"/>
+                <w:sz w:val="18"/>
+              </w:rPr>
+              <w:t xml:space="preserve">{c5}{/pp_prices}</w:t>
+            </w:r>
+          </w:p>
+        </w:tc>
+      </w:tr>
+    </w:tbl>
+    <w:p>
+      <w:pPr>
+        <w:spacing w:after="100"/>
+      </w:pPr>
+      <w:r>
+        <w:rPr>
+          <w:rFonts w:ascii="Calibri" w:hAnsi="Calibri"/>
+          <w:sz w:val="22"/>
+        </w:rPr>
+        <w:t xml:space="preserve">Średnia arytmetyczna cen skorygowanych: {cena_1m2} zł/m².</w:t>
+      </w:r>
+    </w:p>
+    <w:p>
+      <w:pPr>
+        <w:keepNext/>
+        <w:spacing w:after="100"/>
+      </w:pPr>
+      <w:r>
+        <w:rPr>
+          <w:rFonts w:ascii="Calibri" w:hAnsi="Calibri"/>
+          <w:b/>
+          <w:sz w:val="22"/>
+        </w:rPr>
+        <w:t xml:space="preserve">12.4. Określenie wartości rynkowej {przedmiot_d}</w:t>
+      </w:r>
+    </w:p>
+    <w:p>
+      <w:pPr>
+        <w:keepNext/>
+        <w:spacing w:after="100"/>
+      </w:pPr>
+      <w:r>
+        <w:rPr>
+          <w:rFonts w:ascii="Calibri" w:hAnsi="Calibri"/>
+          <w:b/>
+          <w:sz w:val="22"/>
+        </w:rPr>
+        <w:t xml:space="preserve">Tabela 4. Określenie wartości rynkowej {przedmiot_d}</w:t>
+      </w:r>
+    </w:p>
+    <w:tbl>
+      <w:tblPr>
+        <w:tblCaption w:val="pp-result"/>
+        <w:tblW w:w="9000" w:type="dxa"/>
+        <w:tblLayout w:type="fixed"/>
+        <w:tblBorders>
+          <w:top w:val="single" w:sz="4" w:color="888888"/>
+          <w:left w:val="single" w:sz="4" w:color="888888"/>
+          <w:bottom w:val="single" w:sz="4" w:color="888888"/>
+          <w:right w:val="single" w:sz="4" w:color="888888"/>
+          <w:insideH w:val="single" w:sz="4" w:color="888888"/>
+          <w:insideV w:val="single" w:sz="4" w:color="888888"/>
+        </w:tblBorders>
+      </w:tblPr>
+      <w:tblGrid>
+        <w:gridCol w:w="4500"/>
+        <w:gridCol w:w="4500"/>
+      </w:tblGrid>
+      <w:tr>
+        <w:trPr>
+          <w:cantSplit/>
+          <w:tblHeader/>
+        </w:trPr>
+        <w:tc>
+          <w:tcPr>
+            <w:tcW w:w="4500" w:type="dxa"/>
+            <w:vAlign w:val="center"/>
+          </w:tcPr>
+          <w:p>
+            <w:pPr>
+              <w:spacing w:after="70" w:before="70"/>
+            </w:pPr>
+            <w:r>
+              <w:rPr>
+                <w:rFonts w:ascii="Calibri" w:hAnsi="Calibri"/>
+                <w:sz w:val="18"/>
+              </w:rPr>
+              <w:t xml:space="preserve">Wielkość</w:t>
+            </w:r>
+          </w:p>
+        </w:tc>
+        <w:tc>
+          <w:tcPr>
+            <w:tcW w:w="4500" w:type="dxa"/>
+            <w:vAlign w:val="center"/>
+          </w:tcPr>
+          <w:p>
+            <w:pPr>
+              <w:spacing w:after="70" w:before="70"/>
+            </w:pPr>
+            <w:r>
+              <w:rPr>
+                <w:rFonts w:ascii="Calibri" w:hAnsi="Calibri"/>
+                <w:sz w:val="18"/>
+              </w:rPr>
+              <w:t xml:space="preserve">Wartość</w:t>
+            </w:r>
+          </w:p>
+        </w:tc>
+      </w:tr>
+      <w:tr>
+        <w:trPr>
+          <w:cantSplit/>
+        </w:trPr>
+        <w:tc>
+          <w:tcPr>
+            <w:tcW w:w="4500" w:type="dxa"/>
+            <w:vAlign w:val="center"/>
+          </w:tcPr>
+          <w:p>
+            <w:pPr>
+              <w:spacing w:after="70" w:before="70"/>
+            </w:pPr>
+            <w:r>
+              <w:rPr>
+                <w:rFonts w:ascii="Calibri" w:hAnsi="Calibri"/>
+                <w:sz w:val="18"/>
+              </w:rPr>
+              <w:t xml:space="preserve">Średnia cena skorygowana [zł/m²]</w:t>
+            </w:r>
+          </w:p>
+        </w:tc>
+        <w:tc>
+          <w:tcPr>
+            <w:tcW w:w="4500" w:type="dxa"/>
+            <w:vAlign w:val="center"/>
+          </w:tcPr>
+          <w:p>
+            <w:pPr>
+              <w:spacing w:after="70" w:before="70"/>
+            </w:pPr>
+            <w:r>
+              <w:rPr>
+                <w:rFonts w:ascii="Calibri" w:hAnsi="Calibri"/>
+                <w:sz w:val="18"/>
+              </w:rPr>
+              <w:t xml:space="preserve">{cena_1m2}</w:t>
+            </w:r>
+          </w:p>
+        </w:tc>
+      </w:tr>
+      <w:tr>
+        <w:trPr>
+          <w:cantSplit/>
+        </w:trPr>
+        <w:tc>
+          <w:tcPr>
+            <w:tcW w:w="4500" w:type="dxa"/>
+            <w:vAlign w:val="center"/>
+          </w:tcPr>
+          <w:p>
+            <w:pPr>
+              <w:spacing w:after="70" w:before="70"/>
+            </w:pPr>
+            <w:r>
+              <w:rPr>
+                <w:rFonts w:ascii="Calibri" w:hAnsi="Calibri"/>
+                <w:sz w:val="18"/>
+              </w:rPr>
+              <w:t xml:space="preserve">Powierzchnia użytkowa [m²]</w:t>
+            </w:r>
+          </w:p>
+        </w:tc>
+        <w:tc>
+          <w:tcPr>
+            <w:tcW w:w="4500" w:type="dxa"/>
+            <w:vAlign w:val="center"/>
+          </w:tcPr>
+          <w:p>
+            <w:pPr>
+              <w:spacing w:after="70" w:before="70"/>
+            </w:pPr>
+            <w:r>
+              <w:rPr>
+                <w:rFonts w:ascii="Calibri" w:hAnsi="Calibri"/>
+                <w:sz w:val="18"/>
+              </w:rPr>
+              <w:t xml:space="preserve">{powierzchnia}</w:t>
+            </w:r>
+          </w:p>
+        </w:tc>
+      </w:tr>
+      <w:tr>
+        <w:trPr>
+          <w:cantSplit/>
+        </w:trPr>
+        <w:tc>
+          <w:tcPr>
+            <w:tcW w:w="4500" w:type="dxa"/>
+            <w:vAlign w:val="center"/>
+          </w:tcPr>
+          <w:p>
+            <w:pPr>
+              <w:spacing w:after="70" w:before="70"/>
+            </w:pPr>
+            <w:r>
+              <w:rPr>
+                <w:rFonts w:ascii="Calibri" w:hAnsi="Calibri"/>
+                <w:sz w:val="18"/>
+              </w:rPr>
+              <w:t xml:space="preserve">Wartość przed zaokrągleniem [zł]</w:t>
+            </w:r>
+          </w:p>
+        </w:tc>
+        <w:tc>
+          <w:tcPr>
+            <w:tcW w:w="4500" w:type="dxa"/>
+            <w:vAlign w:val="center"/>
+          </w:tcPr>
+          <w:p>
+            <w:pPr>
+              <w:spacing w:after="70" w:before="70"/>
+            </w:pPr>
+            <w:r>
+              <w:rPr>
+                <w:rFonts w:ascii="Calibri" w:hAnsi="Calibri"/>
+                <w:sz w:val="18"/>
+              </w:rPr>
+              <w:t xml:space="preserve">{wr_dokladna}</w:t>
+            </w:r>
+          </w:p>
+        </w:tc>
+      </w:tr>
+      <w:tr>
+        <w:trPr>
+          <w:cantSplit/>
+        </w:trPr>
+        <w:tc>
+          <w:tcPr>
+            <w:tcW w:w="4500" w:type="dxa"/>
+            <w:vAlign w:val="center"/>
+          </w:tcPr>
+          <w:p>
+            <w:pPr>
+              <w:spacing w:after="70" w:before="70"/>
+            </w:pPr>
+            <w:r>
+              <w:rPr>
+                <w:rFonts w:ascii="Calibri" w:hAnsi="Calibri"/>
+                <w:sz w:val="18"/>
+              </w:rPr>
+              <w:t xml:space="preserve">Wartość po zaokrągleniu [zł]</w:t>
+            </w:r>
+          </w:p>
+        </w:tc>
+        <w:tc>
+          <w:tcPr>
+            <w:tcW w:w="4500" w:type="dxa"/>
+            <w:vAlign w:val="center"/>
+          </w:tcPr>
+          <w:p>
+            <w:pPr>
+              <w:spacing w:after="70" w:before="70"/>
+            </w:pPr>
+            <w:r>
+              <w:rPr>
+                <w:rFonts w:ascii="Calibri" w:hAnsi="Calibri"/>
+                <w:sz w:val="18"/>
+              </w:rPr>
+              <w:t xml:space="preserve">{wr}</w:t>
+            </w:r>
+          </w:p>
+        </w:tc>
+      </w:tr>
+      <w:tr>
+        <w:trPr>
+          <w:cantSplit/>
+        </w:trPr>
+        <w:tc>
+          <w:tcPr>
+            <w:tcW w:w="4500" w:type="dxa"/>
+            <w:vAlign w:val="center"/>
+          </w:tcPr>
+          <w:p>
+            <w:pPr>
+              <w:spacing w:after="70" w:before="70"/>
+            </w:pPr>
+            <w:r>
+              <w:rPr>
+                <w:rFonts w:ascii="Calibri" w:hAnsi="Calibri"/>
+                <w:sz w:val="18"/>
+              </w:rPr>
+              <w:t xml:space="preserve">Słownie</w:t>
+            </w:r>
+          </w:p>
+        </w:tc>
+        <w:tc>
+          <w:tcPr>
+            <w:tcW w:w="4500" w:type="dxa"/>
+            <w:vAlign w:val="center"/>
+          </w:tcPr>
+          <w:p>
+            <w:pPr>
+              <w:spacing w:after="70" w:before="70"/>
+            </w:pPr>
+            <w:r>
+              <w:rPr>
+                <w:rFonts w:ascii="Calibri" w:hAnsi="Calibri"/>
+                <w:sz w:val="18"/>
+              </w:rPr>
+              <w:t xml:space="preserve">{wr_slownie}</w:t>
+            </w:r>
+          </w:p>
+        </w:tc>
+      </w:tr>
+    </w:tbl>
+    <w:p>
+      <w:pPr>
+        <w:spacing w:after="100"/>
+      </w:pPr>
+      <w:r>
+        <w:rPr>
+          <w:rFonts w:ascii="Calibri" w:hAnsi="Calibri"/>
+          <w:sz w:val="22"/>
+        </w:rPr>
+        <w:t xml:space="preserve">Obliczenia wykonano z pełną precyzją; wartości w tabelach przedstawiono do dwóch miejsc po przecinku. Końcową wartość zaokrąglono do 100 zł.</w:t>
+      </w:r>
+    </w:p>
+    <w:p>
+      <w:pPr>
+        <w:spacing w:line="276" w:lineRule="auto"/>
+        <w:jc w:val="both"/>
+        <w:rPr>
+          <w:rFonts w:ascii="Segoe UI" w:hAnsi="Segoe UI" w:cs="Segoe UI"/>
+          <w:b/>
+          <w:i/>
+          <w:color w:val="222222"/>
+          <w:sz w:val="20"/>
+          <w:szCs w:val="20"/>
+          <w:shd w:val="clear" w:color="auto" w:fill="FFFFFF"/>
+        </w:rPr>
+      </w:pPr>
+      <w:r>
+        <w:rPr>
+          <w:rFonts w:ascii="Segoe UI" w:hAnsi="Segoe UI" w:cs="Segoe UI"/>
+          <w:b/>
+          <w:i/>
+          <w:color w:val="222222"/>
+          <w:sz w:val="20"/>
+          <w:szCs w:val="20"/>
+          <w:shd w:val="clear" w:color="auto" w:fill="FFFFFF"/>
+        </w:rPr>
+        <w:lastRenderedPageBreak/>
+        <w:t>Klauzula: W operacie szacunkowym nie ujawnia się danych identyfikujących nieruchomości porównawcze, których ujawnienie wkracza w sferę zastrzeżoną tajemnicą zawodową rzeczoznawcy, zgodnie z wyrokiem SN z dnia 5 kwietnia 2012r. (IICSK 369/11).</w:t>
+      </w:r>
+    </w:p>
+    <w:p>
+      <w:pPr>
+        <w:spacing w:after="100"/>
+      </w:pPr>
+      <w:r>
+        <w:rPr>
+          <w:rFonts w:ascii="Calibri" w:hAnsi="Calibri"/>
+          <w:sz w:val="22"/>
+        </w:rPr>
+        <w:t xml:space="preserve">Źródło: Opracowanie własne.</w:t>
+      </w:r>
+    </w:p>
+    <w:p>
+      <w:pPr>
+        <w:spacing w:after="100"/>
+      </w:pPr>
+      <w:r>
+        <w:rPr>
+          <w:rFonts w:ascii="Calibri" w:hAnsi="Calibri"/>
+          <w:sz w:val="22"/>
+        </w:rPr>
+        <w:t xml:space="preserve">{/metoda_pp}</w:t>
+      </w:r>
     </w:p>
     <w:p>
       <w:pPr>

</xml_diff>

<commit_message>
fix(report): keep KCS percentage weights readable in Linux PDF
</commit_message>
<xml_diff>
--- a/apps/web/templates/operat-szablon.docx
+++ b/apps/web/templates/operat-szablon.docx
@@ -16285,10 +16285,10 @@
       </w:tblPr>
       <w:tblGrid>
         <w:gridCol w:w="2339"/>
-        <w:gridCol w:w="716"/>
-        <w:gridCol w:w="1489"/>
-        <w:gridCol w:w="1347"/>
-        <w:gridCol w:w="1358"/>
+        <w:gridCol w:w="1200"/>
+        <w:gridCol w:w="1300"/>
+        <w:gridCol w:w="1200"/>
+        <w:gridCol w:w="1210"/>
         <w:gridCol w:w="1712"/>
       </w:tblGrid>
       <w:tr>
@@ -16327,7 +16327,7 @@
         </w:tc>
         <w:tc>
           <w:tcPr>
-            <w:tcW w:w="716" w:type="dxa"/>
+            <w:tcW w:w="1200" w:type="dxa"/>
             <w:vMerge w:val="restart"/>
           </w:tcPr>
           <w:p>
@@ -16369,7 +16369,7 @@
         </w:tc>
         <w:tc>
           <w:tcPr>
-            <w:tcW w:w="5906" w:type="dxa"/>
+            <w:tcW w:w="5422" w:type="dxa"/>
             <w:gridSpan w:val="4"/>
           </w:tcPr>
           <w:p>
@@ -16422,7 +16422,7 @@
         </w:tc>
         <w:tc>
           <w:tcPr>
-            <w:tcW w:w="716" w:type="dxa"/>
+            <w:tcW w:w="1200" w:type="dxa"/>
             <w:vMerge/>
           </w:tcPr>
           <w:p>
@@ -16439,7 +16439,7 @@
         </w:tc>
         <w:tc>
           <w:tcPr>
-            <w:tcW w:w="1489" w:type="dxa"/>
+            <w:tcW w:w="1300" w:type="dxa"/>
           </w:tcPr>
           <w:p>
             <w:pPr>
@@ -16488,7 +16488,7 @@
         </w:tc>
         <w:tc>
           <w:tcPr>
-            <w:tcW w:w="1347" w:type="dxa"/>
+            <w:tcW w:w="1200" w:type="dxa"/>
           </w:tcPr>
           <w:p>
             <w:pPr>
@@ -16548,7 +16548,7 @@
         </w:tc>
         <w:tc>
           <w:tcPr>
-            <w:tcW w:w="1358" w:type="dxa"/>
+            <w:tcW w:w="1210" w:type="dxa"/>
           </w:tcPr>
           <w:p>
             <w:pPr>
@@ -16681,7 +16681,7 @@
         </w:tc>
         <w:tc>
           <w:tcPr>
-            <w:tcW w:w="716" w:type="dxa"/>
+            <w:tcW w:w="1200" w:type="dxa"/>
             <w:vAlign w:val="bottom"/>
           </w:tcPr>
           <w:p>
@@ -16708,7 +16708,7 @@
         </w:tc>
         <w:tc>
           <w:tcPr>
-            <w:tcW w:w="1489" w:type="dxa"/>
+            <w:tcW w:w="1300" w:type="dxa"/>
             <w:vAlign w:val="bottom"/>
           </w:tcPr>
           <w:p>
@@ -16734,7 +16734,7 @@
         </w:tc>
         <w:tc>
           <w:tcPr>
-            <w:tcW w:w="1347" w:type="dxa"/>
+            <w:tcW w:w="1200" w:type="dxa"/>
           </w:tcPr>
           <w:p>
             <w:pPr>
@@ -16758,7 +16758,7 @@
         </w:tc>
         <w:tc>
           <w:tcPr>
-            <w:tcW w:w="1358" w:type="dxa"/>
+            <w:tcW w:w="1210" w:type="dxa"/>
             <w:vAlign w:val="bottom"/>
           </w:tcPr>
           <w:p>
@@ -16843,7 +16843,7 @@
         </w:tc>
         <w:tc>
           <w:tcPr>
-            <w:tcW w:w="716" w:type="dxa"/>
+            <w:tcW w:w="1200" w:type="dxa"/>
           </w:tcPr>
           <w:p>
             <w:pPr>
@@ -16869,7 +16869,7 @@
         </w:tc>
         <w:tc>
           <w:tcPr>
-            <w:tcW w:w="1489" w:type="dxa"/>
+            <w:tcW w:w="1300" w:type="dxa"/>
           </w:tcPr>
           <w:p>
             <w:pPr>
@@ -16904,7 +16904,7 @@
         </w:tc>
         <w:tc>
           <w:tcPr>
-            <w:tcW w:w="1347" w:type="dxa"/>
+            <w:tcW w:w="1200" w:type="dxa"/>
           </w:tcPr>
           <w:p>
             <w:pPr>
@@ -16930,7 +16930,7 @@
         </w:tc>
         <w:tc>
           <w:tcPr>
-            <w:tcW w:w="1358" w:type="dxa"/>
+            <w:tcW w:w="1210" w:type="dxa"/>
           </w:tcPr>
           <w:p>
             <w:pPr>

</xml_diff>

<commit_message>
fix(report): prevent fractional KCS weights wrapping in Linux PDF (#46)
* feat(operat): render pairwise method and preserve legacy signing

* fix(operat): preserve methodology and current override semantics

* fix(report): keep KCS percentage weights readable in Linux PDF
</commit_message>
<xml_diff>
--- a/apps/web/templates/operat-szablon.docx
+++ b/apps/web/templates/operat-szablon.docx
@@ -16285,10 +16285,10 @@
       </w:tblPr>
       <w:tblGrid>
         <w:gridCol w:w="2339"/>
-        <w:gridCol w:w="716"/>
-        <w:gridCol w:w="1489"/>
-        <w:gridCol w:w="1347"/>
-        <w:gridCol w:w="1358"/>
+        <w:gridCol w:w="1200"/>
+        <w:gridCol w:w="1300"/>
+        <w:gridCol w:w="1200"/>
+        <w:gridCol w:w="1210"/>
         <w:gridCol w:w="1712"/>
       </w:tblGrid>
       <w:tr>
@@ -16327,7 +16327,7 @@
         </w:tc>
         <w:tc>
           <w:tcPr>
-            <w:tcW w:w="716" w:type="dxa"/>
+            <w:tcW w:w="1200" w:type="dxa"/>
             <w:vMerge w:val="restart"/>
           </w:tcPr>
           <w:p>
@@ -16369,7 +16369,7 @@
         </w:tc>
         <w:tc>
           <w:tcPr>
-            <w:tcW w:w="5906" w:type="dxa"/>
+            <w:tcW w:w="5422" w:type="dxa"/>
             <w:gridSpan w:val="4"/>
           </w:tcPr>
           <w:p>
@@ -16422,7 +16422,7 @@
         </w:tc>
         <w:tc>
           <w:tcPr>
-            <w:tcW w:w="716" w:type="dxa"/>
+            <w:tcW w:w="1200" w:type="dxa"/>
             <w:vMerge/>
           </w:tcPr>
           <w:p>
@@ -16439,7 +16439,7 @@
         </w:tc>
         <w:tc>
           <w:tcPr>
-            <w:tcW w:w="1489" w:type="dxa"/>
+            <w:tcW w:w="1300" w:type="dxa"/>
           </w:tcPr>
           <w:p>
             <w:pPr>
@@ -16488,7 +16488,7 @@
         </w:tc>
         <w:tc>
           <w:tcPr>
-            <w:tcW w:w="1347" w:type="dxa"/>
+            <w:tcW w:w="1200" w:type="dxa"/>
           </w:tcPr>
           <w:p>
             <w:pPr>
@@ -16548,7 +16548,7 @@
         </w:tc>
         <w:tc>
           <w:tcPr>
-            <w:tcW w:w="1358" w:type="dxa"/>
+            <w:tcW w:w="1210" w:type="dxa"/>
           </w:tcPr>
           <w:p>
             <w:pPr>
@@ -16681,7 +16681,7 @@
         </w:tc>
         <w:tc>
           <w:tcPr>
-            <w:tcW w:w="716" w:type="dxa"/>
+            <w:tcW w:w="1200" w:type="dxa"/>
             <w:vAlign w:val="bottom"/>
           </w:tcPr>
           <w:p>
@@ -16708,7 +16708,7 @@
         </w:tc>
         <w:tc>
           <w:tcPr>
-            <w:tcW w:w="1489" w:type="dxa"/>
+            <w:tcW w:w="1300" w:type="dxa"/>
             <w:vAlign w:val="bottom"/>
           </w:tcPr>
           <w:p>
@@ -16734,7 +16734,7 @@
         </w:tc>
         <w:tc>
           <w:tcPr>
-            <w:tcW w:w="1347" w:type="dxa"/>
+            <w:tcW w:w="1200" w:type="dxa"/>
           </w:tcPr>
           <w:p>
             <w:pPr>
@@ -16758,7 +16758,7 @@
         </w:tc>
         <w:tc>
           <w:tcPr>
-            <w:tcW w:w="1358" w:type="dxa"/>
+            <w:tcW w:w="1210" w:type="dxa"/>
             <w:vAlign w:val="bottom"/>
           </w:tcPr>
           <w:p>
@@ -16843,7 +16843,7 @@
         </w:tc>
         <w:tc>
           <w:tcPr>
-            <w:tcW w:w="716" w:type="dxa"/>
+            <w:tcW w:w="1200" w:type="dxa"/>
           </w:tcPr>
           <w:p>
             <w:pPr>
@@ -16869,7 +16869,7 @@
         </w:tc>
         <w:tc>
           <w:tcPr>
-            <w:tcW w:w="1489" w:type="dxa"/>
+            <w:tcW w:w="1300" w:type="dxa"/>
           </w:tcPr>
           <w:p>
             <w:pPr>
@@ -16904,7 +16904,7 @@
         </w:tc>
         <w:tc>
           <w:tcPr>
-            <w:tcW w:w="1347" w:type="dxa"/>
+            <w:tcW w:w="1200" w:type="dxa"/>
           </w:tcPr>
           <w:p>
             <w:pPr>
@@ -16930,7 +16930,7 @@
         </w:tc>
         <w:tc>
           <w:tcPr>
-            <w:tcW w:w="1358" w:type="dxa"/>
+            <w:tcW w:w="1210" w:type="dxa"/>
           </w:tcPr>
           <w:p>
             <w:pPr>

</xml_diff>

<commit_message>
fix(web): section 10 keeps all three comparative method definitions
Every client operat (16 of 16) lists and defines parami, KCS and the
statistical method, then names the one used and gives only its procedure.
The PP patch dropped the unused definitions; restore them for both methods.
</commit_message>
<xml_diff>
--- a/apps/web/templates/operat-szablon.docx
+++ b/apps/web/templates/operat-szablon.docx
@@ -12240,18 +12240,6 @@
     </w:p>
     <w:p>
       <w:pPr>
-        <w:spacing w:after="100"/>
-      </w:pPr>
-      <w:r>
-        <w:rPr>
-          <w:rFonts w:ascii="Calibri" w:hAnsi="Calibri"/>
-          <w:sz w:val="22"/>
-        </w:rPr>
-        <w:t xml:space="preserve">{#metoda_kcs}</w:t>
-      </w:r>
-    </w:p>
-    <w:p>
-      <w:pPr>
         <w:pStyle w:val="Tekstpodstawowy22"/>
         <w:tabs>
           <w:tab w:val="left" w:pos="2268"/>
@@ -12260,17 +12248,84 @@
         <w:jc w:val="both"/>
         <w:rPr>
           <w:rFonts w:ascii="Segoe UI" w:hAnsi="Segoe UI" w:cs="Segoe UI"/>
-          <w:sz w:val="20"/>
-          <w:szCs w:val="20"/>
-        </w:rPr>
-      </w:pPr>
-      <w:r>
-        <w:rPr>
-          <w:rFonts w:ascii="Segoe UI" w:hAnsi="Segoe UI" w:cs="Segoe UI"/>
+          <w:i/>
+          <w:iCs/>
+          <w:sz w:val="20"/>
+          <w:szCs w:val="20"/>
+        </w:rPr>
+      </w:pPr>
+      <w:r>
+        <w:rPr>
+          <w:rFonts w:ascii="Segoe UI" w:hAnsi="Segoe UI" w:cs="Segoe UI"/>
+          <w:bCs/>
           <w:sz w:val="20"/>
           <w:szCs w:val="20"/>
           <w:u w:val="single"/>
         </w:rPr>
+        <w:t>Metoda porównywania parami</w:t>
+      </w:r>
+      <w:r>
+        <w:rPr>
+          <w:rFonts w:ascii="Segoe UI" w:hAnsi="Segoe UI" w:cs="Segoe UI"/>
+          <w:b/>
+          <w:i/>
+          <w:iCs/>
+          <w:sz w:val="20"/>
+          <w:szCs w:val="20"/>
+        </w:rPr>
+        <w:t xml:space="preserve"> </w:t>
+      </w:r>
+      <w:r>
+        <w:rPr>
+          <w:rFonts w:ascii="Segoe UI" w:hAnsi="Segoe UI" w:cs="Segoe UI"/>
+          <w:bCs/>
+          <w:i/>
+          <w:iCs/>
+          <w:sz w:val="20"/>
+          <w:szCs w:val="20"/>
+        </w:rPr>
+        <w:t>–</w:t>
+      </w:r>
+      <w:r>
+        <w:rPr>
+          <w:rFonts w:ascii="Segoe UI" w:hAnsi="Segoe UI" w:cs="Segoe UI"/>
+          <w:i/>
+          <w:iCs/>
+          <w:sz w:val="20"/>
+          <w:szCs w:val="20"/>
+        </w:rPr>
+        <w:t xml:space="preserve"> </w:t>
+      </w:r>
+      <w:r>
+        <w:rPr>
+          <w:rFonts w:ascii="Segoe UI" w:hAnsi="Segoe UI" w:cs="Segoe UI"/>
+          <w:sz w:val="20"/>
+          <w:szCs w:val="20"/>
+        </w:rPr>
+        <w:t>porównuje się nieruchomość będącą przedmiotem wyceny, której cechy są znane, kolejno z nieruchomościami podobnymi, które były przedmiotem obrotu rynkowego               i dla których znane są ceny transakcyjne, warunki zawarcia transakcji oraz cechy tych nieruchomości. Do porównań wybiera się co najmniej trzy nieruchomości ze zbioru nieruchomości podobnych stanowiącego podstawę wyceny. Korekty cen transakcyjnych dokonuje się na podstawie różnic ocen cech rynkowych nieruchomości wycenianej i nieruchomości przyjętych do porównań określonych                     w przyjętych skalach.</w:t>
+      </w:r>
+    </w:p>
+    <w:p>
+      <w:pPr>
+        <w:pStyle w:val="Tekstpodstawowy22"/>
+        <w:tabs>
+          <w:tab w:val="left" w:pos="2268"/>
+        </w:tabs>
+        <w:spacing w:after="0" w:line="276" w:lineRule="auto"/>
+        <w:jc w:val="both"/>
+        <w:rPr>
+          <w:rFonts w:ascii="Segoe UI" w:hAnsi="Segoe UI" w:cs="Segoe UI"/>
+          <w:sz w:val="20"/>
+          <w:szCs w:val="20"/>
+        </w:rPr>
+      </w:pPr>
+      <w:r>
+        <w:rPr>
+          <w:rFonts w:ascii="Segoe UI" w:hAnsi="Segoe UI" w:cs="Segoe UI"/>
+          <w:sz w:val="20"/>
+          <w:szCs w:val="20"/>
+          <w:u w:val="single"/>
+        </w:rPr>
         <w:t>Metoda korygowania ceny średniej</w:t>
       </w:r>
       <w:r>
@@ -12280,6 +12335,64 @@
           <w:szCs w:val="20"/>
         </w:rPr>
         <w:t xml:space="preserve"> – przyjmuje się co najmniej kilkanaście nieruchomości podobnych, które były przedmiotem obrotu rynkowego i dla których znane są ceny transakcyjne, warunki zawarcia transakcji oraz cechy tych nieruchomości. Wartość nieruchomości określa się w drodze korekty średniej ceny nieruchomości podobnych w zbiorze stanowiącym podstawę wyceny współczynnikami korygującymi wynikającymi z oceny wycenianej nieruchomości w odniesieniu do przyjętej skali ocen poszczególnych cech rynkowych, z uwzględnieniem położenia ceny średniej w przedziale pomiędzy ceną minimalną i ceną maksymalną.</w:t>
+      </w:r>
+    </w:p>
+    <w:p>
+      <w:pPr>
+        <w:pStyle w:val="Tekstpodstawowy22"/>
+        <w:tabs>
+          <w:tab w:val="left" w:pos="2268"/>
+        </w:tabs>
+        <w:spacing w:after="0" w:line="276" w:lineRule="auto"/>
+        <w:jc w:val="both"/>
+        <w:rPr>
+          <w:rFonts w:ascii="Segoe UI" w:hAnsi="Segoe UI" w:cs="Segoe UI"/>
+          <w:sz w:val="20"/>
+          <w:szCs w:val="20"/>
+        </w:rPr>
+      </w:pPr>
+      <w:r>
+        <w:rPr>
+          <w:rFonts w:ascii="Segoe UI" w:hAnsi="Segoe UI" w:cs="Segoe UI"/>
+          <w:sz w:val="20"/>
+          <w:szCs w:val="20"/>
+          <w:u w:val="single"/>
+        </w:rPr>
+        <w:t>Metoda analizy statystycznej rynku</w:t>
+      </w:r>
+      <w:r>
+        <w:rPr>
+          <w:rFonts w:ascii="Segoe UI" w:hAnsi="Segoe UI" w:cs="Segoe UI"/>
+          <w:sz w:val="20"/>
+          <w:szCs w:val="20"/>
+        </w:rPr>
+        <w:t xml:space="preserve"> – przyjmuje się zbiór cen transakcyjnych właściwych do określenia wartości nieruchomości reprezentatywnych, o których mowa w art. 161 ust. 2 ustawy. Wartość nieruchomości określa się przy użyciu metod stosowanych do analiz statystycznych. Przy tworzeniu zbioru cen transakcyjnych właściwych do określenia wartości nieruchomości reprezentatywnych przepis § 5 ust. 2 stosuje się odpowiednio.</w:t>
+      </w:r>
+    </w:p>
+    <w:p>
+      <w:pPr>
+        <w:pStyle w:val="Tekstpodstawowywcity2"/>
+        <w:spacing w:after="0" w:line="276" w:lineRule="auto"/>
+        <w:ind w:left="0"/>
+        <w:jc w:val="both"/>
+        <w:rPr>
+          <w:rFonts w:ascii="Segoe UI" w:hAnsi="Segoe UI" w:cs="Segoe UI"/>
+          <w:sz w:val="20"/>
+          <w:szCs w:val="20"/>
+          <w:u w:val="single"/>
+        </w:rPr>
+      </w:pPr>
+    </w:p>
+    <w:p>
+      <w:pPr>
+        <w:spacing w:after="100"/>
+      </w:pPr>
+      <w:r>
+        <w:rPr>
+          <w:rFonts w:ascii="Calibri" w:hAnsi="Calibri"/>
+          <w:sz w:val="22"/>
+        </w:rPr>
+        <w:t xml:space="preserve">{#metoda_kcs}</w:t>
       </w:r>
     </w:p>
     <w:p>
@@ -13215,73 +13328,6 @@
           <w:sz w:val="22"/>
         </w:rPr>
         <w:t xml:space="preserve">{#metoda_pp}</w:t>
-      </w:r>
-    </w:p>
-    <w:p>
-      <w:pPr>
-        <w:pStyle w:val="Tekstpodstawowy22"/>
-        <w:tabs>
-          <w:tab w:val="left" w:pos="2268"/>
-        </w:tabs>
-        <w:spacing w:after="0" w:line="276" w:lineRule="auto"/>
-        <w:jc w:val="both"/>
-        <w:rPr>
-          <w:rFonts w:ascii="Segoe UI" w:hAnsi="Segoe UI" w:cs="Segoe UI"/>
-          <w:i/>
-          <w:iCs/>
-          <w:sz w:val="20"/>
-          <w:szCs w:val="20"/>
-        </w:rPr>
-      </w:pPr>
-      <w:r>
-        <w:rPr>
-          <w:rFonts w:ascii="Segoe UI" w:hAnsi="Segoe UI" w:cs="Segoe UI"/>
-          <w:bCs/>
-          <w:sz w:val="20"/>
-          <w:szCs w:val="20"/>
-          <w:u w:val="single"/>
-        </w:rPr>
-        <w:t>Metoda porównywania parami</w:t>
-      </w:r>
-      <w:r>
-        <w:rPr>
-          <w:rFonts w:ascii="Segoe UI" w:hAnsi="Segoe UI" w:cs="Segoe UI"/>
-          <w:b/>
-          <w:i/>
-          <w:iCs/>
-          <w:sz w:val="20"/>
-          <w:szCs w:val="20"/>
-        </w:rPr>
-        <w:t xml:space="preserve"> </w:t>
-      </w:r>
-      <w:r>
-        <w:rPr>
-          <w:rFonts w:ascii="Segoe UI" w:hAnsi="Segoe UI" w:cs="Segoe UI"/>
-          <w:bCs/>
-          <w:i/>
-          <w:iCs/>
-          <w:sz w:val="20"/>
-          <w:szCs w:val="20"/>
-        </w:rPr>
-        <w:t>–</w:t>
-      </w:r>
-      <w:r>
-        <w:rPr>
-          <w:rFonts w:ascii="Segoe UI" w:hAnsi="Segoe UI" w:cs="Segoe UI"/>
-          <w:i/>
-          <w:iCs/>
-          <w:sz w:val="20"/>
-          <w:szCs w:val="20"/>
-        </w:rPr>
-        <w:t xml:space="preserve"> </w:t>
-      </w:r>
-      <w:r>
-        <w:rPr>
-          <w:rFonts w:ascii="Segoe UI" w:hAnsi="Segoe UI" w:cs="Segoe UI"/>
-          <w:sz w:val="20"/>
-          <w:szCs w:val="20"/>
-        </w:rPr>
-        <w:t>porównuje się nieruchomość będącą przedmiotem wyceny, której cechy są znane, kolejno z nieruchomościami podobnymi, które były przedmiotem obrotu rynkowego               i dla których znane są ceny transakcyjne, warunki zawarcia transakcji oraz cechy tych nieruchomości. Do porównań wybiera się co najmniej trzy nieruchomości ze zbioru nieruchomości podobnych stanowiącego podstawę wyceny. Korekty cen transakcyjnych dokonuje się na podstawie różnic ocen cech rynkowych nieruchomości wycenianej i nieruchomości przyjętych do porównań określonych                     w przyjętych skalach.</w:t>
       </w:r>
     </w:p>
     <w:p>

</xml_diff>

<commit_message>
fix(web): pairwise section 10 uses the procedure from client operats
Common choice sentence with the method name, then the eleven-step PKZW
Nota Interpretacyjna nr 1 procedure for porownywanie parami, replacing the
app-written summary paragraph.
</commit_message>
<xml_diff>
--- a/apps/web/templates/operat-szablon.docx
+++ b/apps/web/templates/operat-szablon.docx
@@ -12385,18 +12385,6 @@
     </w:p>
     <w:p>
       <w:pPr>
-        <w:spacing w:after="100"/>
-      </w:pPr>
-      <w:r>
-        <w:rPr>
-          <w:rFonts w:ascii="Calibri" w:hAnsi="Calibri"/>
-          <w:sz w:val="22"/>
-        </w:rPr>
-        <w:t xml:space="preserve">{#metoda_kcs}</w:t>
-      </w:r>
-    </w:p>
-    <w:p>
-      <w:pPr>
         <w:pStyle w:val="Tekstpodstawowywcity2"/>
         <w:suppressAutoHyphens w:val="0"/>
         <w:spacing w:after="0" w:line="276" w:lineRule="auto"/>
@@ -12425,7 +12413,7 @@
           <w:szCs w:val="20"/>
           <w:u w:val="single"/>
         </w:rPr>
-        <w:t>korygowania ceny średniej</w:t>
+        <w:t>{metoda_nazwa}</w:t>
       </w:r>
       <w:r>
         <w:rPr>
@@ -12451,6 +12439,18 @@
           <w:u w:val="single"/>
         </w:rPr>
       </w:pPr>
+    </w:p>
+    <w:p>
+      <w:pPr>
+        <w:spacing w:after="100"/>
+      </w:pPr>
+      <w:r>
+        <w:rPr>
+          <w:rFonts w:ascii="Calibri" w:hAnsi="Calibri"/>
+          <w:sz w:val="22"/>
+        </w:rPr>
+        <w:t xml:space="preserve">{#metoda_kcs}</w:t>
+      </w:r>
     </w:p>
     <w:p>
       <w:pPr>
@@ -13332,26 +13332,314 @@
     </w:p>
     <w:p>
       <w:pPr>
-        <w:spacing w:after="100"/>
-      </w:pPr>
-      <w:r>
-        <w:rPr>
-          <w:rFonts w:ascii="Calibri" w:hAnsi="Calibri"/>
-          <w:sz w:val="22"/>
-        </w:rPr>
-        <w:t xml:space="preserve">Dla określenia wartości rynkowej {przedmiot_d} zastosowano podejście porównawcze, metodę porównywania parami.</w:t>
-      </w:r>
-    </w:p>
-    <w:p>
-      <w:pPr>
-        <w:spacing w:after="100"/>
-      </w:pPr>
-      <w:r>
-        <w:rPr>
-          <w:rFonts w:ascii="Calibri" w:hAnsi="Calibri"/>
-          <w:sz w:val="22"/>
-        </w:rPr>
-        <w:t xml:space="preserve">Liczba transakcji przyjętych do porównań: {pp_count}. Oceniono cechy przedmiotu i każdego porównania na przyjętych skalach. Poprawki kwotowe wynikają z rozstępu cen, wag cech i mnożników przyjętych przez rzeczoznawcę. Dodatnia poprawka oznacza przewagę przedmiotu nad porównaniem. Cenę każdego porównania skorygowano o sumę poprawek; średnią cen skorygowanych pomnożono przez powierzchnię przedmiotu.</w:t>
+        <w:spacing w:line="276" w:lineRule="auto"/>
+        <w:jc w:val="both"/>
+        <w:rPr>
+          <w:rFonts w:ascii="Segoe UI" w:hAnsi="Segoe UI" w:cs="Segoe UI"/>
+          <w:sz w:val="20"/>
+          <w:szCs w:val="20"/>
+        </w:rPr>
+      </w:pPr>
+      <w:r>
+        <w:rPr>
+          <w:rFonts w:ascii="Segoe UI" w:hAnsi="Segoe UI" w:cs="Segoe UI"/>
+          <w:b/>
+          <w:sz w:val="20"/>
+          <w:szCs w:val="20"/>
+        </w:rPr>
+        <w:t>Procedura metody porównywania parami</w:t>
+      </w:r>
+      <w:r>
+        <w:rPr>
+          <w:rFonts w:ascii="Segoe UI" w:hAnsi="Segoe UI" w:cs="Segoe UI"/>
+          <w:bCs/>
+          <w:sz w:val="20"/>
+          <w:szCs w:val="20"/>
+        </w:rPr>
+        <w:t xml:space="preserve"> stosownie do założeń Powszechnych Krajowych</w:t>
+      </w:r>
+      <w:r>
+        <w:rPr>
+          <w:rFonts w:ascii="Segoe UI" w:hAnsi="Segoe UI" w:cs="Segoe UI"/>
+          <w:sz w:val="20"/>
+          <w:szCs w:val="20"/>
+        </w:rPr>
+        <w:t xml:space="preserve"> Zasad Wyceny (PKZW) – Noty Interpretacyjnej nr 1 pt. Zastosowanie podejścia porównawczego w wycenie nieruchomości, wygląda następująco:</w:t>
+      </w:r>
+    </w:p>
+    <w:p>
+      <w:pPr>
+        <w:numPr>
+          <w:ilvl w:val="0"/>
+          <w:numId w:val="20"/>
+        </w:numPr>
+        <w:suppressAutoHyphens w:val="0"/>
+        <w:spacing w:line="276" w:lineRule="auto"/>
+        <w:contextualSpacing/>
+        <w:jc w:val="both"/>
+        <w:rPr>
+          <w:rFonts w:ascii="Segoe UI" w:hAnsi="Segoe UI" w:cs="Segoe UI"/>
+          <w:sz w:val="20"/>
+          <w:szCs w:val="20"/>
+        </w:rPr>
+      </w:pPr>
+      <w:r>
+        <w:rPr>
+          <w:rFonts w:ascii="Segoe UI" w:hAnsi="Segoe UI" w:cs="Segoe UI"/>
+          <w:sz w:val="20"/>
+          <w:szCs w:val="20"/>
+        </w:rPr>
+        <w:t>Utworzenie zbioru nieruchomości podobnych, o znanych cenach transakcyjnych i cechach, stanowiącego podstawę wyceny,</w:t>
+      </w:r>
+    </w:p>
+    <w:p>
+      <w:pPr>
+        <w:numPr>
+          <w:ilvl w:val="0"/>
+          <w:numId w:val="20"/>
+        </w:numPr>
+        <w:suppressAutoHyphens w:val="0"/>
+        <w:spacing w:line="276" w:lineRule="auto"/>
+        <w:contextualSpacing/>
+        <w:jc w:val="both"/>
+        <w:rPr>
+          <w:rFonts w:ascii="Segoe UI" w:hAnsi="Segoe UI" w:cs="Segoe UI"/>
+          <w:sz w:val="20"/>
+          <w:szCs w:val="20"/>
+        </w:rPr>
+      </w:pPr>
+      <w:r>
+        <w:rPr>
+          <w:rFonts w:ascii="Segoe UI" w:hAnsi="Segoe UI" w:cs="Segoe UI"/>
+          <w:sz w:val="20"/>
+          <w:szCs w:val="20"/>
+        </w:rPr>
+        <w:t>Aktualizacja cen transakcyjnych na datę wyceny,</w:t>
+      </w:r>
+    </w:p>
+    <w:p>
+      <w:pPr>
+        <w:numPr>
+          <w:ilvl w:val="0"/>
+          <w:numId w:val="20"/>
+        </w:numPr>
+        <w:suppressAutoHyphens w:val="0"/>
+        <w:spacing w:line="276" w:lineRule="auto"/>
+        <w:contextualSpacing/>
+        <w:jc w:val="both"/>
+        <w:rPr>
+          <w:rFonts w:ascii="Segoe UI" w:hAnsi="Segoe UI" w:cs="Segoe UI"/>
+          <w:sz w:val="20"/>
+          <w:szCs w:val="20"/>
+        </w:rPr>
+      </w:pPr>
+      <w:r>
+        <w:rPr>
+          <w:rFonts w:ascii="Segoe UI" w:hAnsi="Segoe UI" w:cs="Segoe UI"/>
+          <w:sz w:val="20"/>
+          <w:szCs w:val="20"/>
+        </w:rPr>
+        <w:t>Ustalenie cech rynkowych wpływających w sposób zasadniczy na zróżnicowanie cen na rynku nieruchomości,</w:t>
+      </w:r>
+    </w:p>
+    <w:p>
+      <w:pPr>
+        <w:numPr>
+          <w:ilvl w:val="0"/>
+          <w:numId w:val="20"/>
+        </w:numPr>
+        <w:suppressAutoHyphens w:val="0"/>
+        <w:spacing w:line="276" w:lineRule="auto"/>
+        <w:contextualSpacing/>
+        <w:jc w:val="both"/>
+        <w:rPr>
+          <w:rFonts w:ascii="Segoe UI" w:hAnsi="Segoe UI" w:cs="Segoe UI"/>
+          <w:sz w:val="20"/>
+          <w:szCs w:val="20"/>
+        </w:rPr>
+      </w:pPr>
+      <w:r>
+        <w:rPr>
+          <w:rFonts w:ascii="Segoe UI" w:hAnsi="Segoe UI" w:cs="Segoe UI"/>
+          <w:sz w:val="20"/>
+          <w:szCs w:val="20"/>
+        </w:rPr>
+        <w:t>Ocena wielkości wpływu cech rynkowych na zróżnicowanie cen transakcyjnych,</w:t>
+      </w:r>
+    </w:p>
+    <w:p>
+      <w:pPr>
+        <w:numPr>
+          <w:ilvl w:val="0"/>
+          <w:numId w:val="20"/>
+        </w:numPr>
+        <w:suppressAutoHyphens w:val="0"/>
+        <w:spacing w:line="276" w:lineRule="auto"/>
+        <w:contextualSpacing/>
+        <w:jc w:val="both"/>
+        <w:rPr>
+          <w:rFonts w:ascii="Segoe UI" w:hAnsi="Segoe UI" w:cs="Segoe UI"/>
+          <w:sz w:val="20"/>
+          <w:szCs w:val="20"/>
+        </w:rPr>
+      </w:pPr>
+      <w:r>
+        <w:rPr>
+          <w:rFonts w:ascii="Segoe UI" w:hAnsi="Segoe UI" w:cs="Segoe UI"/>
+          <w:sz w:val="20"/>
+          <w:szCs w:val="20"/>
+        </w:rPr>
+        <w:t>Ustalenie zakresu skali dla każdej z przyjętych cech rynkowych,</w:t>
+      </w:r>
+    </w:p>
+    <w:p>
+      <w:pPr>
+        <w:numPr>
+          <w:ilvl w:val="0"/>
+          <w:numId w:val="20"/>
+        </w:numPr>
+        <w:suppressAutoHyphens w:val="0"/>
+        <w:spacing w:line="276" w:lineRule="auto"/>
+        <w:contextualSpacing/>
+        <w:jc w:val="both"/>
+        <w:rPr>
+          <w:rFonts w:ascii="Segoe UI" w:hAnsi="Segoe UI" w:cs="Segoe UI"/>
+          <w:sz w:val="20"/>
+          <w:szCs w:val="20"/>
+        </w:rPr>
+      </w:pPr>
+      <w:r>
+        <w:rPr>
+          <w:rFonts w:ascii="Segoe UI" w:hAnsi="Segoe UI" w:cs="Segoe UI"/>
+          <w:sz w:val="20"/>
+          <w:szCs w:val="20"/>
+        </w:rPr>
+        <w:t>Wybór do porównań z utworzonego zbioru nieruchomości, co najmniej trzech nieruchomości najbardziej podobnych pod względem cech rynkowych do nieruchomości stanowiącej przedmiot wyceny, z ich niezbędną charakterystyką,</w:t>
+      </w:r>
+    </w:p>
+    <w:p>
+      <w:pPr>
+        <w:numPr>
+          <w:ilvl w:val="0"/>
+          <w:numId w:val="20"/>
+        </w:numPr>
+        <w:suppressAutoHyphens w:val="0"/>
+        <w:spacing w:line="276" w:lineRule="auto"/>
+        <w:contextualSpacing/>
+        <w:jc w:val="both"/>
+        <w:rPr>
+          <w:rFonts w:ascii="Segoe UI" w:hAnsi="Segoe UI" w:cs="Segoe UI"/>
+          <w:sz w:val="20"/>
+          <w:szCs w:val="20"/>
+        </w:rPr>
+      </w:pPr>
+      <w:r>
+        <w:rPr>
+          <w:rFonts w:ascii="Segoe UI" w:hAnsi="Segoe UI" w:cs="Segoe UI"/>
+          <w:sz w:val="20"/>
+          <w:szCs w:val="20"/>
+        </w:rPr>
+        <w:t>Charakterystyka wycenianej nieruchomości z przedstawieniem jej ocen w odniesieniu do przyjętej skali cech rynkowych,</w:t>
+      </w:r>
+    </w:p>
+    <w:p>
+      <w:pPr>
+        <w:numPr>
+          <w:ilvl w:val="0"/>
+          <w:numId w:val="20"/>
+        </w:numPr>
+        <w:suppressAutoHyphens w:val="0"/>
+        <w:spacing w:line="276" w:lineRule="auto"/>
+        <w:contextualSpacing/>
+        <w:jc w:val="both"/>
+        <w:rPr>
+          <w:rFonts w:ascii="Segoe UI" w:hAnsi="Segoe UI" w:cs="Segoe UI"/>
+          <w:sz w:val="20"/>
+          <w:szCs w:val="20"/>
+        </w:rPr>
+      </w:pPr>
+      <w:r>
+        <w:rPr>
+          <w:rFonts w:ascii="Segoe UI" w:hAnsi="Segoe UI" w:cs="Segoe UI"/>
+          <w:sz w:val="20"/>
+          <w:szCs w:val="20"/>
+        </w:rPr>
+        <w:t>Przeprowadzenie porównań nieruchomości wycenianej kolejno z nieruchomościami wybranymi do wyceny i określenie wielkości poprawek wynikających z różnicy ocen nieruchomości wycenianej i nieruchomości wybranych do porównań,</w:t>
+      </w:r>
+    </w:p>
+    <w:p>
+      <w:pPr>
+        <w:numPr>
+          <w:ilvl w:val="0"/>
+          <w:numId w:val="20"/>
+        </w:numPr>
+        <w:suppressAutoHyphens w:val="0"/>
+        <w:spacing w:line="276" w:lineRule="auto"/>
+        <w:contextualSpacing/>
+        <w:jc w:val="both"/>
+        <w:rPr>
+          <w:rFonts w:ascii="Segoe UI" w:hAnsi="Segoe UI" w:cs="Segoe UI"/>
+          <w:sz w:val="20"/>
+          <w:szCs w:val="20"/>
+        </w:rPr>
+      </w:pPr>
+      <w:r>
+        <w:rPr>
+          <w:rFonts w:ascii="Segoe UI" w:hAnsi="Segoe UI" w:cs="Segoe UI"/>
+          <w:sz w:val="20"/>
+          <w:szCs w:val="20"/>
+        </w:rPr>
+        <w:t>Obliczenie skorygowanej ceny transakcyjnej każdej nieruchomości przyjętej do porównań przy użyciu określonych poprawek,</w:t>
+      </w:r>
+    </w:p>
+    <w:p>
+      <w:pPr>
+        <w:numPr>
+          <w:ilvl w:val="0"/>
+          <w:numId w:val="20"/>
+        </w:numPr>
+        <w:suppressAutoHyphens w:val="0"/>
+        <w:spacing w:line="276" w:lineRule="auto"/>
+        <w:contextualSpacing/>
+        <w:jc w:val="both"/>
+        <w:rPr>
+          <w:rFonts w:ascii="Segoe UI" w:hAnsi="Segoe UI" w:cs="Segoe UI"/>
+          <w:sz w:val="20"/>
+          <w:szCs w:val="20"/>
+        </w:rPr>
+      </w:pPr>
+      <w:r>
+        <w:rPr>
+          <w:rFonts w:ascii="Segoe UI" w:hAnsi="Segoe UI" w:cs="Segoe UI"/>
+          <w:sz w:val="20"/>
+          <w:szCs w:val="20"/>
+        </w:rPr>
+        <w:t>Obliczenie wartości jednostkowej wycenianej nieruchomości jako średniej arytmetycznej z cen transakcyjnych skorygowanych, uzyskanych z porównań w poszczególnych parach, lub średniej ważonej, jeśli wiarygodność otrzymanych wyników jest zróżnicowana,</w:t>
+      </w:r>
+    </w:p>
+    <w:p>
+      <w:pPr>
+        <w:numPr>
+          <w:ilvl w:val="0"/>
+          <w:numId w:val="20"/>
+        </w:numPr>
+        <w:suppressAutoHyphens w:val="0"/>
+        <w:spacing w:line="276" w:lineRule="auto"/>
+        <w:contextualSpacing/>
+        <w:jc w:val="both"/>
+        <w:rPr>
+          <w:rFonts w:ascii="Segoe UI" w:hAnsi="Segoe UI" w:cs="Segoe UI"/>
+          <w:sz w:val="20"/>
+          <w:szCs w:val="20"/>
+        </w:rPr>
+      </w:pPr>
+      <w:r>
+        <w:rPr>
+          <w:rFonts w:ascii="Segoe UI" w:hAnsi="Segoe UI" w:cs="Segoe UI"/>
+          <w:sz w:val="20"/>
+          <w:szCs w:val="20"/>
+        </w:rPr>
+        <w:t>Określenie wartości wycenianej nieruchomości na podstawie iloczynu wartości jednostkowej i liczby jednostek porównawczych (np. m2 powierzchni gruntu, budynku czy lokalu).</w:t>
       </w:r>
     </w:p>
     <w:p>

</xml_diff>

<commit_message>
fix: findings from the 13.09 browser E2E of pairwise valuation (#48)
- step 7 approval card renders only with blockers or approve feedback
- stale prose section reads do weryfikacji, plainer stale hint
- step 5 unavailable message points at the listed blockers
- operat section 10: all three method definitions, used method's
  choice sentence and PKZW procedure (as in client operats)
- PP area rating starts unrated with a suggestion; zero-weight rows do
  not block save or preview; domain refuses an undefined middle rating
- method card spacing, register row provenance, Polish area format,
  definition and custom name hints
- help pages and screenshots for both methods; E2E assertions
</commit_message>
<xml_diff>
--- a/apps/web/templates/operat-szablon.docx
+++ b/apps/web/templates/operat-szablon.docx
@@ -12240,18 +12240,6 @@
     </w:p>
     <w:p>
       <w:pPr>
-        <w:spacing w:after="100"/>
-      </w:pPr>
-      <w:r>
-        <w:rPr>
-          <w:rFonts w:ascii="Calibri" w:hAnsi="Calibri"/>
-          <w:sz w:val="22"/>
-        </w:rPr>
-        <w:t xml:space="preserve">{#metoda_kcs}</w:t>
-      </w:r>
-    </w:p>
-    <w:p>
-      <w:pPr>
         <w:pStyle w:val="Tekstpodstawowy22"/>
         <w:tabs>
           <w:tab w:val="left" w:pos="2268"/>
@@ -12260,17 +12248,84 @@
         <w:jc w:val="both"/>
         <w:rPr>
           <w:rFonts w:ascii="Segoe UI" w:hAnsi="Segoe UI" w:cs="Segoe UI"/>
-          <w:sz w:val="20"/>
-          <w:szCs w:val="20"/>
-        </w:rPr>
-      </w:pPr>
-      <w:r>
-        <w:rPr>
-          <w:rFonts w:ascii="Segoe UI" w:hAnsi="Segoe UI" w:cs="Segoe UI"/>
+          <w:i/>
+          <w:iCs/>
+          <w:sz w:val="20"/>
+          <w:szCs w:val="20"/>
+        </w:rPr>
+      </w:pPr>
+      <w:r>
+        <w:rPr>
+          <w:rFonts w:ascii="Segoe UI" w:hAnsi="Segoe UI" w:cs="Segoe UI"/>
+          <w:bCs/>
           <w:sz w:val="20"/>
           <w:szCs w:val="20"/>
           <w:u w:val="single"/>
         </w:rPr>
+        <w:t>Metoda porównywania parami</w:t>
+      </w:r>
+      <w:r>
+        <w:rPr>
+          <w:rFonts w:ascii="Segoe UI" w:hAnsi="Segoe UI" w:cs="Segoe UI"/>
+          <w:b/>
+          <w:i/>
+          <w:iCs/>
+          <w:sz w:val="20"/>
+          <w:szCs w:val="20"/>
+        </w:rPr>
+        <w:t xml:space="preserve"> </w:t>
+      </w:r>
+      <w:r>
+        <w:rPr>
+          <w:rFonts w:ascii="Segoe UI" w:hAnsi="Segoe UI" w:cs="Segoe UI"/>
+          <w:bCs/>
+          <w:i/>
+          <w:iCs/>
+          <w:sz w:val="20"/>
+          <w:szCs w:val="20"/>
+        </w:rPr>
+        <w:t>–</w:t>
+      </w:r>
+      <w:r>
+        <w:rPr>
+          <w:rFonts w:ascii="Segoe UI" w:hAnsi="Segoe UI" w:cs="Segoe UI"/>
+          <w:i/>
+          <w:iCs/>
+          <w:sz w:val="20"/>
+          <w:szCs w:val="20"/>
+        </w:rPr>
+        <w:t xml:space="preserve"> </w:t>
+      </w:r>
+      <w:r>
+        <w:rPr>
+          <w:rFonts w:ascii="Segoe UI" w:hAnsi="Segoe UI" w:cs="Segoe UI"/>
+          <w:sz w:val="20"/>
+          <w:szCs w:val="20"/>
+        </w:rPr>
+        <w:t>porównuje się nieruchomość będącą przedmiotem wyceny, której cechy są znane, kolejno z nieruchomościami podobnymi, które były przedmiotem obrotu rynkowego               i dla których znane są ceny transakcyjne, warunki zawarcia transakcji oraz cechy tych nieruchomości. Do porównań wybiera się co najmniej trzy nieruchomości ze zbioru nieruchomości podobnych stanowiącego podstawę wyceny. Korekty cen transakcyjnych dokonuje się na podstawie różnic ocen cech rynkowych nieruchomości wycenianej i nieruchomości przyjętych do porównań określonych                     w przyjętych skalach.</w:t>
+      </w:r>
+    </w:p>
+    <w:p>
+      <w:pPr>
+        <w:pStyle w:val="Tekstpodstawowy22"/>
+        <w:tabs>
+          <w:tab w:val="left" w:pos="2268"/>
+        </w:tabs>
+        <w:spacing w:after="0" w:line="276" w:lineRule="auto"/>
+        <w:jc w:val="both"/>
+        <w:rPr>
+          <w:rFonts w:ascii="Segoe UI" w:hAnsi="Segoe UI" w:cs="Segoe UI"/>
+          <w:sz w:val="20"/>
+          <w:szCs w:val="20"/>
+        </w:rPr>
+      </w:pPr>
+      <w:r>
+        <w:rPr>
+          <w:rFonts w:ascii="Segoe UI" w:hAnsi="Segoe UI" w:cs="Segoe UI"/>
+          <w:sz w:val="20"/>
+          <w:szCs w:val="20"/>
+          <w:u w:val="single"/>
+        </w:rPr>
         <w:t>Metoda korygowania ceny średniej</w:t>
       </w:r>
       <w:r>
@@ -12281,6 +12336,52 @@
         </w:rPr>
         <w:t xml:space="preserve"> – przyjmuje się co najmniej kilkanaście nieruchomości podobnych, które były przedmiotem obrotu rynkowego i dla których znane są ceny transakcyjne, warunki zawarcia transakcji oraz cechy tych nieruchomości. Wartość nieruchomości określa się w drodze korekty średniej ceny nieruchomości podobnych w zbiorze stanowiącym podstawę wyceny współczynnikami korygującymi wynikającymi z oceny wycenianej nieruchomości w odniesieniu do przyjętej skali ocen poszczególnych cech rynkowych, z uwzględnieniem położenia ceny średniej w przedziale pomiędzy ceną minimalną i ceną maksymalną.</w:t>
       </w:r>
+    </w:p>
+    <w:p>
+      <w:pPr>
+        <w:pStyle w:val="Tekstpodstawowy22"/>
+        <w:tabs>
+          <w:tab w:val="left" w:pos="2268"/>
+        </w:tabs>
+        <w:spacing w:after="0" w:line="276" w:lineRule="auto"/>
+        <w:jc w:val="both"/>
+        <w:rPr>
+          <w:rFonts w:ascii="Segoe UI" w:hAnsi="Segoe UI" w:cs="Segoe UI"/>
+          <w:sz w:val="20"/>
+          <w:szCs w:val="20"/>
+        </w:rPr>
+      </w:pPr>
+      <w:r>
+        <w:rPr>
+          <w:rFonts w:ascii="Segoe UI" w:hAnsi="Segoe UI" w:cs="Segoe UI"/>
+          <w:sz w:val="20"/>
+          <w:szCs w:val="20"/>
+          <w:u w:val="single"/>
+        </w:rPr>
+        <w:t>Metoda analizy statystycznej rynku</w:t>
+      </w:r>
+      <w:r>
+        <w:rPr>
+          <w:rFonts w:ascii="Segoe UI" w:hAnsi="Segoe UI" w:cs="Segoe UI"/>
+          <w:sz w:val="20"/>
+          <w:szCs w:val="20"/>
+        </w:rPr>
+        <w:t xml:space="preserve"> – przyjmuje się zbiór cen transakcyjnych właściwych do określenia wartości nieruchomości reprezentatywnych, o których mowa w art. 161 ust. 2 ustawy. Wartość nieruchomości określa się przy użyciu metod stosowanych do analiz statystycznych. Przy tworzeniu zbioru cen transakcyjnych właściwych do określenia wartości nieruchomości reprezentatywnych przepis § 5 ust. 2 stosuje się odpowiednio.</w:t>
+      </w:r>
+    </w:p>
+    <w:p>
+      <w:pPr>
+        <w:pStyle w:val="Tekstpodstawowywcity2"/>
+        <w:spacing w:after="0" w:line="276" w:lineRule="auto"/>
+        <w:ind w:left="0"/>
+        <w:jc w:val="both"/>
+        <w:rPr>
+          <w:rFonts w:ascii="Segoe UI" w:hAnsi="Segoe UI" w:cs="Segoe UI"/>
+          <w:sz w:val="20"/>
+          <w:szCs w:val="20"/>
+          <w:u w:val="single"/>
+        </w:rPr>
+      </w:pPr>
     </w:p>
     <w:p>
       <w:pPr>
@@ -12312,7 +12413,7 @@
           <w:szCs w:val="20"/>
           <w:u w:val="single"/>
         </w:rPr>
-        <w:t>korygowania ceny średniej</w:t>
+        <w:t>{metoda_nazwa}</w:t>
       </w:r>
       <w:r>
         <w:rPr>
@@ -12338,6 +12439,18 @@
           <w:u w:val="single"/>
         </w:rPr>
       </w:pPr>
+    </w:p>
+    <w:p>
+      <w:pPr>
+        <w:spacing w:after="100"/>
+      </w:pPr>
+      <w:r>
+        <w:rPr>
+          <w:rFonts w:ascii="Calibri" w:hAnsi="Calibri"/>
+          <w:sz w:val="22"/>
+        </w:rPr>
+        <w:t xml:space="preserve">{#metoda_kcs}</w:t>
+      </w:r>
     </w:p>
     <w:p>
       <w:pPr>
@@ -13219,93 +13332,314 @@
     </w:p>
     <w:p>
       <w:pPr>
-        <w:pStyle w:val="Tekstpodstawowy22"/>
-        <w:tabs>
-          <w:tab w:val="left" w:pos="2268"/>
-        </w:tabs>
-        <w:spacing w:after="0" w:line="276" w:lineRule="auto"/>
+        <w:spacing w:line="276" w:lineRule="auto"/>
         <w:jc w:val="both"/>
         <w:rPr>
           <w:rFonts w:ascii="Segoe UI" w:hAnsi="Segoe UI" w:cs="Segoe UI"/>
-          <w:i/>
-          <w:iCs/>
-          <w:sz w:val="20"/>
-          <w:szCs w:val="20"/>
-        </w:rPr>
-      </w:pPr>
+          <w:sz w:val="20"/>
+          <w:szCs w:val="20"/>
+        </w:rPr>
+      </w:pPr>
+      <w:r>
+        <w:rPr>
+          <w:rFonts w:ascii="Segoe UI" w:hAnsi="Segoe UI" w:cs="Segoe UI"/>
+          <w:b/>
+          <w:sz w:val="20"/>
+          <w:szCs w:val="20"/>
+        </w:rPr>
+        <w:t>Procedura metody porównywania parami</w:t>
+      </w:r>
       <w:r>
         <w:rPr>
           <w:rFonts w:ascii="Segoe UI" w:hAnsi="Segoe UI" w:cs="Segoe UI"/>
           <w:bCs/>
           <w:sz w:val="20"/>
           <w:szCs w:val="20"/>
-          <w:u w:val="single"/>
-        </w:rPr>
-        <w:t>Metoda porównywania parami</w:t>
-      </w:r>
-      <w:r>
-        <w:rPr>
-          <w:rFonts w:ascii="Segoe UI" w:hAnsi="Segoe UI" w:cs="Segoe UI"/>
-          <w:b/>
-          <w:i/>
-          <w:iCs/>
-          <w:sz w:val="20"/>
-          <w:szCs w:val="20"/>
-        </w:rPr>
-        <w:t xml:space="preserve"> </w:t>
-      </w:r>
-      <w:r>
-        <w:rPr>
-          <w:rFonts w:ascii="Segoe UI" w:hAnsi="Segoe UI" w:cs="Segoe UI"/>
-          <w:bCs/>
-          <w:i/>
-          <w:iCs/>
-          <w:sz w:val="20"/>
-          <w:szCs w:val="20"/>
-        </w:rPr>
-        <w:t>–</w:t>
-      </w:r>
-      <w:r>
-        <w:rPr>
-          <w:rFonts w:ascii="Segoe UI" w:hAnsi="Segoe UI" w:cs="Segoe UI"/>
-          <w:i/>
-          <w:iCs/>
-          <w:sz w:val="20"/>
-          <w:szCs w:val="20"/>
-        </w:rPr>
-        <w:t xml:space="preserve"> </w:t>
-      </w:r>
-      <w:r>
-        <w:rPr>
-          <w:rFonts w:ascii="Segoe UI" w:hAnsi="Segoe UI" w:cs="Segoe UI"/>
-          <w:sz w:val="20"/>
-          <w:szCs w:val="20"/>
-        </w:rPr>
-        <w:t>porównuje się nieruchomość będącą przedmiotem wyceny, której cechy są znane, kolejno z nieruchomościami podobnymi, które były przedmiotem obrotu rynkowego               i dla których znane są ceny transakcyjne, warunki zawarcia transakcji oraz cechy tych nieruchomości. Do porównań wybiera się co najmniej trzy nieruchomości ze zbioru nieruchomości podobnych stanowiącego podstawę wyceny. Korekty cen transakcyjnych dokonuje się na podstawie różnic ocen cech rynkowych nieruchomości wycenianej i nieruchomości przyjętych do porównań określonych                     w przyjętych skalach.</w:t>
-      </w:r>
-    </w:p>
-    <w:p>
-      <w:pPr>
-        <w:spacing w:after="100"/>
-      </w:pPr>
-      <w:r>
-        <w:rPr>
-          <w:rFonts w:ascii="Calibri" w:hAnsi="Calibri"/>
-          <w:sz w:val="22"/>
-        </w:rPr>
-        <w:t xml:space="preserve">Dla określenia wartości rynkowej {przedmiot_d} zastosowano podejście porównawcze, metodę porównywania parami.</w:t>
-      </w:r>
-    </w:p>
-    <w:p>
-      <w:pPr>
-        <w:spacing w:after="100"/>
-      </w:pPr>
-      <w:r>
-        <w:rPr>
-          <w:rFonts w:ascii="Calibri" w:hAnsi="Calibri"/>
-          <w:sz w:val="22"/>
-        </w:rPr>
-        <w:t xml:space="preserve">Liczba transakcji przyjętych do porównań: {pp_count}. Oceniono cechy przedmiotu i każdego porównania na przyjętych skalach. Poprawki kwotowe wynikają z rozstępu cen, wag cech i mnożników przyjętych przez rzeczoznawcę. Dodatnia poprawka oznacza przewagę przedmiotu nad porównaniem. Cenę każdego porównania skorygowano o sumę poprawek; średnią cen skorygowanych pomnożono przez powierzchnię przedmiotu.</w:t>
+        </w:rPr>
+        <w:t xml:space="preserve"> stosownie do założeń Powszechnych Krajowych</w:t>
+      </w:r>
+      <w:r>
+        <w:rPr>
+          <w:rFonts w:ascii="Segoe UI" w:hAnsi="Segoe UI" w:cs="Segoe UI"/>
+          <w:sz w:val="20"/>
+          <w:szCs w:val="20"/>
+        </w:rPr>
+        <w:t xml:space="preserve"> Zasad Wyceny (PKZW) – Noty Interpretacyjnej nr 1 pt. Zastosowanie podejścia porównawczego w wycenie nieruchomości, wygląda następująco:</w:t>
+      </w:r>
+    </w:p>
+    <w:p>
+      <w:pPr>
+        <w:numPr>
+          <w:ilvl w:val="0"/>
+          <w:numId w:val="20"/>
+        </w:numPr>
+        <w:suppressAutoHyphens w:val="0"/>
+        <w:spacing w:line="276" w:lineRule="auto"/>
+        <w:contextualSpacing/>
+        <w:jc w:val="both"/>
+        <w:rPr>
+          <w:rFonts w:ascii="Segoe UI" w:hAnsi="Segoe UI" w:cs="Segoe UI"/>
+          <w:sz w:val="20"/>
+          <w:szCs w:val="20"/>
+        </w:rPr>
+      </w:pPr>
+      <w:r>
+        <w:rPr>
+          <w:rFonts w:ascii="Segoe UI" w:hAnsi="Segoe UI" w:cs="Segoe UI"/>
+          <w:sz w:val="20"/>
+          <w:szCs w:val="20"/>
+        </w:rPr>
+        <w:t>Utworzenie zbioru nieruchomości podobnych, o znanych cenach transakcyjnych i cechach, stanowiącego podstawę wyceny,</w:t>
+      </w:r>
+    </w:p>
+    <w:p>
+      <w:pPr>
+        <w:numPr>
+          <w:ilvl w:val="0"/>
+          <w:numId w:val="20"/>
+        </w:numPr>
+        <w:suppressAutoHyphens w:val="0"/>
+        <w:spacing w:line="276" w:lineRule="auto"/>
+        <w:contextualSpacing/>
+        <w:jc w:val="both"/>
+        <w:rPr>
+          <w:rFonts w:ascii="Segoe UI" w:hAnsi="Segoe UI" w:cs="Segoe UI"/>
+          <w:sz w:val="20"/>
+          <w:szCs w:val="20"/>
+        </w:rPr>
+      </w:pPr>
+      <w:r>
+        <w:rPr>
+          <w:rFonts w:ascii="Segoe UI" w:hAnsi="Segoe UI" w:cs="Segoe UI"/>
+          <w:sz w:val="20"/>
+          <w:szCs w:val="20"/>
+        </w:rPr>
+        <w:t>Aktualizacja cen transakcyjnych na datę wyceny,</w:t>
+      </w:r>
+    </w:p>
+    <w:p>
+      <w:pPr>
+        <w:numPr>
+          <w:ilvl w:val="0"/>
+          <w:numId w:val="20"/>
+        </w:numPr>
+        <w:suppressAutoHyphens w:val="0"/>
+        <w:spacing w:line="276" w:lineRule="auto"/>
+        <w:contextualSpacing/>
+        <w:jc w:val="both"/>
+        <w:rPr>
+          <w:rFonts w:ascii="Segoe UI" w:hAnsi="Segoe UI" w:cs="Segoe UI"/>
+          <w:sz w:val="20"/>
+          <w:szCs w:val="20"/>
+        </w:rPr>
+      </w:pPr>
+      <w:r>
+        <w:rPr>
+          <w:rFonts w:ascii="Segoe UI" w:hAnsi="Segoe UI" w:cs="Segoe UI"/>
+          <w:sz w:val="20"/>
+          <w:szCs w:val="20"/>
+        </w:rPr>
+        <w:t>Ustalenie cech rynkowych wpływających w sposób zasadniczy na zróżnicowanie cen na rynku nieruchomości,</w:t>
+      </w:r>
+    </w:p>
+    <w:p>
+      <w:pPr>
+        <w:numPr>
+          <w:ilvl w:val="0"/>
+          <w:numId w:val="20"/>
+        </w:numPr>
+        <w:suppressAutoHyphens w:val="0"/>
+        <w:spacing w:line="276" w:lineRule="auto"/>
+        <w:contextualSpacing/>
+        <w:jc w:val="both"/>
+        <w:rPr>
+          <w:rFonts w:ascii="Segoe UI" w:hAnsi="Segoe UI" w:cs="Segoe UI"/>
+          <w:sz w:val="20"/>
+          <w:szCs w:val="20"/>
+        </w:rPr>
+      </w:pPr>
+      <w:r>
+        <w:rPr>
+          <w:rFonts w:ascii="Segoe UI" w:hAnsi="Segoe UI" w:cs="Segoe UI"/>
+          <w:sz w:val="20"/>
+          <w:szCs w:val="20"/>
+        </w:rPr>
+        <w:t>Ocena wielkości wpływu cech rynkowych na zróżnicowanie cen transakcyjnych,</w:t>
+      </w:r>
+    </w:p>
+    <w:p>
+      <w:pPr>
+        <w:numPr>
+          <w:ilvl w:val="0"/>
+          <w:numId w:val="20"/>
+        </w:numPr>
+        <w:suppressAutoHyphens w:val="0"/>
+        <w:spacing w:line="276" w:lineRule="auto"/>
+        <w:contextualSpacing/>
+        <w:jc w:val="both"/>
+        <w:rPr>
+          <w:rFonts w:ascii="Segoe UI" w:hAnsi="Segoe UI" w:cs="Segoe UI"/>
+          <w:sz w:val="20"/>
+          <w:szCs w:val="20"/>
+        </w:rPr>
+      </w:pPr>
+      <w:r>
+        <w:rPr>
+          <w:rFonts w:ascii="Segoe UI" w:hAnsi="Segoe UI" w:cs="Segoe UI"/>
+          <w:sz w:val="20"/>
+          <w:szCs w:val="20"/>
+        </w:rPr>
+        <w:t>Ustalenie zakresu skali dla każdej z przyjętych cech rynkowych,</w:t>
+      </w:r>
+    </w:p>
+    <w:p>
+      <w:pPr>
+        <w:numPr>
+          <w:ilvl w:val="0"/>
+          <w:numId w:val="20"/>
+        </w:numPr>
+        <w:suppressAutoHyphens w:val="0"/>
+        <w:spacing w:line="276" w:lineRule="auto"/>
+        <w:contextualSpacing/>
+        <w:jc w:val="both"/>
+        <w:rPr>
+          <w:rFonts w:ascii="Segoe UI" w:hAnsi="Segoe UI" w:cs="Segoe UI"/>
+          <w:sz w:val="20"/>
+          <w:szCs w:val="20"/>
+        </w:rPr>
+      </w:pPr>
+      <w:r>
+        <w:rPr>
+          <w:rFonts w:ascii="Segoe UI" w:hAnsi="Segoe UI" w:cs="Segoe UI"/>
+          <w:sz w:val="20"/>
+          <w:szCs w:val="20"/>
+        </w:rPr>
+        <w:t>Wybór do porównań z utworzonego zbioru nieruchomości, co najmniej trzech nieruchomości najbardziej podobnych pod względem cech rynkowych do nieruchomości stanowiącej przedmiot wyceny, z ich niezbędną charakterystyką,</w:t>
+      </w:r>
+    </w:p>
+    <w:p>
+      <w:pPr>
+        <w:numPr>
+          <w:ilvl w:val="0"/>
+          <w:numId w:val="20"/>
+        </w:numPr>
+        <w:suppressAutoHyphens w:val="0"/>
+        <w:spacing w:line="276" w:lineRule="auto"/>
+        <w:contextualSpacing/>
+        <w:jc w:val="both"/>
+        <w:rPr>
+          <w:rFonts w:ascii="Segoe UI" w:hAnsi="Segoe UI" w:cs="Segoe UI"/>
+          <w:sz w:val="20"/>
+          <w:szCs w:val="20"/>
+        </w:rPr>
+      </w:pPr>
+      <w:r>
+        <w:rPr>
+          <w:rFonts w:ascii="Segoe UI" w:hAnsi="Segoe UI" w:cs="Segoe UI"/>
+          <w:sz w:val="20"/>
+          <w:szCs w:val="20"/>
+        </w:rPr>
+        <w:t>Charakterystyka wycenianej nieruchomości z przedstawieniem jej ocen w odniesieniu do przyjętej skali cech rynkowych,</w:t>
+      </w:r>
+    </w:p>
+    <w:p>
+      <w:pPr>
+        <w:numPr>
+          <w:ilvl w:val="0"/>
+          <w:numId w:val="20"/>
+        </w:numPr>
+        <w:suppressAutoHyphens w:val="0"/>
+        <w:spacing w:line="276" w:lineRule="auto"/>
+        <w:contextualSpacing/>
+        <w:jc w:val="both"/>
+        <w:rPr>
+          <w:rFonts w:ascii="Segoe UI" w:hAnsi="Segoe UI" w:cs="Segoe UI"/>
+          <w:sz w:val="20"/>
+          <w:szCs w:val="20"/>
+        </w:rPr>
+      </w:pPr>
+      <w:r>
+        <w:rPr>
+          <w:rFonts w:ascii="Segoe UI" w:hAnsi="Segoe UI" w:cs="Segoe UI"/>
+          <w:sz w:val="20"/>
+          <w:szCs w:val="20"/>
+        </w:rPr>
+        <w:t>Przeprowadzenie porównań nieruchomości wycenianej kolejno z nieruchomościami wybranymi do wyceny i określenie wielkości poprawek wynikających z różnicy ocen nieruchomości wycenianej i nieruchomości wybranych do porównań,</w:t>
+      </w:r>
+    </w:p>
+    <w:p>
+      <w:pPr>
+        <w:numPr>
+          <w:ilvl w:val="0"/>
+          <w:numId w:val="20"/>
+        </w:numPr>
+        <w:suppressAutoHyphens w:val="0"/>
+        <w:spacing w:line="276" w:lineRule="auto"/>
+        <w:contextualSpacing/>
+        <w:jc w:val="both"/>
+        <w:rPr>
+          <w:rFonts w:ascii="Segoe UI" w:hAnsi="Segoe UI" w:cs="Segoe UI"/>
+          <w:sz w:val="20"/>
+          <w:szCs w:val="20"/>
+        </w:rPr>
+      </w:pPr>
+      <w:r>
+        <w:rPr>
+          <w:rFonts w:ascii="Segoe UI" w:hAnsi="Segoe UI" w:cs="Segoe UI"/>
+          <w:sz w:val="20"/>
+          <w:szCs w:val="20"/>
+        </w:rPr>
+        <w:t>Obliczenie skorygowanej ceny transakcyjnej każdej nieruchomości przyjętej do porównań przy użyciu określonych poprawek,</w:t>
+      </w:r>
+    </w:p>
+    <w:p>
+      <w:pPr>
+        <w:numPr>
+          <w:ilvl w:val="0"/>
+          <w:numId w:val="20"/>
+        </w:numPr>
+        <w:suppressAutoHyphens w:val="0"/>
+        <w:spacing w:line="276" w:lineRule="auto"/>
+        <w:contextualSpacing/>
+        <w:jc w:val="both"/>
+        <w:rPr>
+          <w:rFonts w:ascii="Segoe UI" w:hAnsi="Segoe UI" w:cs="Segoe UI"/>
+          <w:sz w:val="20"/>
+          <w:szCs w:val="20"/>
+        </w:rPr>
+      </w:pPr>
+      <w:r>
+        <w:rPr>
+          <w:rFonts w:ascii="Segoe UI" w:hAnsi="Segoe UI" w:cs="Segoe UI"/>
+          <w:sz w:val="20"/>
+          <w:szCs w:val="20"/>
+        </w:rPr>
+        <w:t>Obliczenie wartości jednostkowej wycenianej nieruchomości jako średniej arytmetycznej z cen transakcyjnych skorygowanych, uzyskanych z porównań w poszczególnych parach, lub średniej ważonej, jeśli wiarygodność otrzymanych wyników jest zróżnicowana,</w:t>
+      </w:r>
+    </w:p>
+    <w:p>
+      <w:pPr>
+        <w:numPr>
+          <w:ilvl w:val="0"/>
+          <w:numId w:val="20"/>
+        </w:numPr>
+        <w:suppressAutoHyphens w:val="0"/>
+        <w:spacing w:line="276" w:lineRule="auto"/>
+        <w:contextualSpacing/>
+        <w:jc w:val="both"/>
+        <w:rPr>
+          <w:rFonts w:ascii="Segoe UI" w:hAnsi="Segoe UI" w:cs="Segoe UI"/>
+          <w:sz w:val="20"/>
+          <w:szCs w:val="20"/>
+        </w:rPr>
+      </w:pPr>
+      <w:r>
+        <w:rPr>
+          <w:rFonts w:ascii="Segoe UI" w:hAnsi="Segoe UI" w:cs="Segoe UI"/>
+          <w:sz w:val="20"/>
+          <w:szCs w:val="20"/>
+        </w:rPr>
+        <w:t>Określenie wartości wycenianej nieruchomości na podstawie iloczynu wartości jednostkowej i liczby jednostek porównawczych (np. m2 powierzchni gruntu, budynku czy lokalu).</w:t>
       </w:r>
     </w:p>
     <w:p>

</xml_diff>

<commit_message>
fix(web): geometria paska kontaktowego i §4 w szablonie, z niezmiennikami
</commit_message>
<xml_diff>
--- a/apps/web/templates/operat-szablon.docx
+++ b/apps/web/templates/operat-szablon.docx
@@ -30,7 +30,7 @@
                 <wp:positionV relativeFrom="paragraph">
                   <wp:posOffset>127000</wp:posOffset>
                 </wp:positionV>
-                <wp:extent cx="5305425" cy="1064895"/>
+                <wp:extent cx="5305425" cy="1117600"/>
                 <wp:effectExtent l="0" t="0" r="9525" b="1905"/>
                 <wp:wrapTight wrapText="bothSides">
                   <wp:wrapPolygon edited="0">
@@ -54,7 +54,7 @@
                       <wps:spPr bwMode="auto">
                         <a:xfrm>
                           <a:off x="0" y="0"/>
-                          <a:ext cx="5305425" cy="1064895"/>
+                          <a:ext cx="5305425" cy="1117600"/>
                         </a:xfrm>
                         <a:prstGeom prst="rect">
                           <a:avLst/>
@@ -134,23 +134,6 @@
                           </w:p>
                           <w:p>
                             <w:pPr>
-                              <w:jc w:val="center"/>
-                              <w:rPr>
-                                <w:sz w:val="16"/>
-                              </w:rPr>
-                            </w:pPr>
-                          </w:p>
-                          <w:p>
-                            <w:pPr>
-                              <w:rPr>
-                                <w:rFonts w:ascii="Calibri" w:hAnsi="Calibri" w:cs="Calibri"/>
-                                <w:sz w:val="21"/>
-                                <w:szCs w:val="21"/>
-                              </w:rPr>
-                            </w:pPr>
-                          </w:p>
-                          <w:p>
-                            <w:pPr>
                               <w:rPr>
                                 <w:rFonts w:ascii="Segoe UI" w:hAnsi="Segoe UI" w:cs="Segoe UI"/>
                                 <w:b/>
@@ -215,225 +198,10 @@
                               <w:t xml:space="preserve"/>
                             </w:r>
                           </w:p>
-                          <w:p>
-                            <w:pPr>
-                              <w:rPr>
-                                <w:rFonts w:ascii="Calibri" w:hAnsi="Calibri" w:cs="Calibri"/>
-                                <w:b/>
-                                <w:sz w:val="21"/>
-                                <w:szCs w:val="21"/>
-                                <w:lang w:val="en-US"/>
-                              </w:rPr>
-                            </w:pPr>
-                            <w:r>
-                              <w:rPr>
-                                <w:rFonts w:ascii="Segoe UI" w:hAnsi="Segoe UI" w:cs="Segoe UI"/>
-                                <w:b/>
-                                <w:sz w:val="19"/>
-                                <w:szCs w:val="19"/>
-                                <w:lang w:val="en-US"/>
-                              </w:rPr>
-                              <w:tab/>
-                            </w:r>
-                            <w:r>
-                              <w:rPr>
-                                <w:rFonts w:ascii="Segoe UI" w:hAnsi="Segoe UI" w:cs="Segoe UI"/>
-                                <w:b/>
-                                <w:color w:val="5F5F5F"/>
-                                <w:sz w:val="19"/>
-                                <w:szCs w:val="19"/>
-                                <w:lang w:val="en-US"/>
-                              </w:rPr>
-                              <w:tab/>
-                            </w:r>
-                            <w:r>
-                              <w:rPr>
-                                <w:rFonts w:ascii="Segoe UI" w:hAnsi="Segoe UI" w:cs="Segoe UI"/>
-                                <w:b/>
-                                <w:color w:val="5F5F5F"/>
-                                <w:sz w:val="19"/>
-                                <w:szCs w:val="19"/>
-                                <w:lang w:val="en-US"/>
-                              </w:rPr>
-                              <w:tab/>
-                            </w:r>
-                            <w:r>
-                              <w:rPr>
-                                <w:rFonts w:ascii="Segoe UI" w:hAnsi="Segoe UI" w:cs="Segoe UI"/>
-                                <w:b/>
-                                <w:color w:val="5F5F5F"/>
-                                <w:sz w:val="19"/>
-                                <w:szCs w:val="19"/>
-                                <w:lang w:val="en-US"/>
-                              </w:rPr>
-                              <w:tab/>
-                            </w:r>
-                            <w:r>
-                              <w:rPr>
-                                <w:rFonts w:ascii="Segoe UI" w:hAnsi="Segoe UI" w:cs="Segoe UI"/>
-                                <w:b/>
-                                <w:color w:val="5F5F5F"/>
-                                <w:sz w:val="19"/>
-                                <w:szCs w:val="19"/>
-                                <w:lang w:val="en-US"/>
-                              </w:rPr>
-                              <w:tab/>
-                              <w:t xml:space="preserve">  </w:t>
-                            </w:r>
-                          </w:p>
-                          <w:p>
-                            <w:pPr>
-                              <w:rPr>
-                                <w:rFonts w:ascii="Calibri" w:hAnsi="Calibri" w:cs="Calibri"/>
-                                <w:b/>
-                                <w:sz w:val="21"/>
-                                <w:szCs w:val="21"/>
-                                <w:lang w:val="en-US"/>
-                              </w:rPr>
-                            </w:pPr>
-                            <w:r>
-                              <w:rPr>
-                                <w:rFonts w:ascii="Calibri" w:hAnsi="Calibri" w:cs="Calibri"/>
-                                <w:b/>
-                                <w:sz w:val="21"/>
-                                <w:szCs w:val="21"/>
-                                <w:lang w:val="en-US"/>
-                              </w:rPr>
-                              <w:tab/>
-                            </w:r>
-                            <w:r>
-                              <w:rPr>
-                                <w:rFonts w:ascii="Calibri" w:hAnsi="Calibri" w:cs="Calibri"/>
-                                <w:b/>
-                                <w:sz w:val="21"/>
-                                <w:szCs w:val="21"/>
-                                <w:lang w:val="en-US"/>
-                              </w:rPr>
-                              <w:tab/>
-                            </w:r>
-                            <w:r>
-                              <w:rPr>
-                                <w:rFonts w:ascii="Calibri" w:hAnsi="Calibri" w:cs="Calibri"/>
-                                <w:b/>
-                                <w:sz w:val="21"/>
-                                <w:szCs w:val="21"/>
-                                <w:lang w:val="en-US"/>
-                              </w:rPr>
-                              <w:tab/>
-                            </w:r>
-                            <w:r>
-                              <w:rPr>
-                                <w:rFonts w:ascii="Calibri" w:hAnsi="Calibri" w:cs="Calibri"/>
-                                <w:b/>
-                                <w:sz w:val="21"/>
-                                <w:szCs w:val="21"/>
-                                <w:lang w:val="en-US"/>
-                              </w:rPr>
-                              <w:tab/>
-                            </w:r>
-                            <w:r>
-                              <w:rPr>
-                                <w:rFonts w:ascii="Calibri" w:hAnsi="Calibri" w:cs="Calibri"/>
-                                <w:b/>
-                                <w:sz w:val="21"/>
-                                <w:szCs w:val="21"/>
-                                <w:lang w:val="en-US"/>
-                              </w:rPr>
-                              <w:tab/>
-                            </w:r>
-                            <w:r>
-                              <w:rPr>
-                                <w:rFonts w:ascii="Calibri" w:hAnsi="Calibri" w:cs="Calibri"/>
-                                <w:b/>
-                                <w:sz w:val="21"/>
-                                <w:szCs w:val="21"/>
-                                <w:lang w:val="en-US"/>
-                              </w:rPr>
-                              <w:tab/>
-                            </w:r>
-                            <w:r>
-                              <w:rPr>
-                                <w:rFonts w:ascii="Calibri" w:hAnsi="Calibri" w:cs="Calibri"/>
-                                <w:b/>
-                                <w:sz w:val="21"/>
-                                <w:szCs w:val="21"/>
-                                <w:lang w:val="en-US"/>
-                              </w:rPr>
-                              <w:tab/>
-                            </w:r>
-                          </w:p>
-                          <w:p>
-                            <w:pPr>
-                              <w:rPr>
-                                <w:lang w:val="en-US"/>
-                              </w:rPr>
-                            </w:pPr>
-                            <w:r>
-                              <w:rPr>
-                                <w:rFonts w:ascii="Calibri" w:hAnsi="Calibri" w:cs="Calibri"/>
-                                <w:b/>
-                                <w:sz w:val="21"/>
-                                <w:szCs w:val="21"/>
-                                <w:lang w:val="en-US"/>
-                              </w:rPr>
-                              <w:tab/>
-                            </w:r>
-                            <w:r>
-                              <w:rPr>
-                                <w:rFonts w:ascii="Calibri" w:hAnsi="Calibri" w:cs="Calibri"/>
-                                <w:b/>
-                                <w:sz w:val="21"/>
-                                <w:szCs w:val="21"/>
-                                <w:lang w:val="en-US"/>
-                              </w:rPr>
-                              <w:tab/>
-                            </w:r>
-                            <w:r>
-                              <w:rPr>
-                                <w:rFonts w:ascii="Calibri" w:hAnsi="Calibri" w:cs="Calibri"/>
-                                <w:b/>
-                                <w:sz w:val="21"/>
-                                <w:szCs w:val="21"/>
-                                <w:lang w:val="en-US"/>
-                              </w:rPr>
-                              <w:tab/>
-                            </w:r>
-                            <w:r>
-                              <w:rPr>
-                                <w:rFonts w:ascii="Calibri" w:hAnsi="Calibri" w:cs="Calibri"/>
-                                <w:b/>
-                                <w:sz w:val="21"/>
-                                <w:szCs w:val="21"/>
-                                <w:lang w:val="en-US"/>
-                              </w:rPr>
-                              <w:tab/>
-                            </w:r>
-                            <w:r>
-                              <w:rPr>
-                                <w:rFonts w:ascii="Calibri" w:hAnsi="Calibri" w:cs="Calibri"/>
-                                <w:b/>
-                                <w:sz w:val="21"/>
-                                <w:szCs w:val="21"/>
-                                <w:lang w:val="en-US"/>
-                              </w:rPr>
-                              <w:tab/>
-                            </w:r>
-                            <w:r>
-                              <w:rPr>
-                                <w:rFonts w:ascii="Calibri" w:hAnsi="Calibri" w:cs="Calibri"/>
-                                <w:b/>
-                                <w:sz w:val="21"/>
-                                <w:szCs w:val="21"/>
-                                <w:lang w:val="en-US"/>
-                              </w:rPr>
-                              <w:tab/>
-                              <w:t xml:space="preserve">       </w:t>
-                            </w:r>
-                          </w:p>
                         </w:txbxContent>
                       </wps:txbx>
                       <wps:bodyPr rot="0" vert="horz" wrap="square" lIns="0" tIns="0" rIns="0" bIns="0" anchor="t" anchorCtr="0" upright="1">
-                        <a:noAutofit/>
+                        <a:spAutoFit/>
                       </wps:bodyPr>
                     </wps:wsp>
                   </a:graphicData>
@@ -453,8 +221,8 @@
                 <v:stroke joinstyle="miter"/>
                 <v:path gradientshapeok="t" o:connecttype="rect"/>
               </v:shapetype>
-              <v:shape id="Pole tekstowe 31" o:spid="_x0000_s1026" type="#_x0000_t202" style="position:absolute;margin-left:38.65pt;margin-top:10pt;width:417.75pt;height:83.85pt;z-index:-251658238;visibility:visible;mso-wrap-style:square;mso-width-percent:0;mso-height-percent:0;mso-wrap-distance-left:9.05pt;mso-wrap-distance-top:0;mso-wrap-distance-right:9.05pt;mso-wrap-distance-bottom:0;mso-position-horizontal:absolute;mso-position-horizontal-relative:text;mso-position-vertical:absolute;mso-position-vertical-relative:text;mso-width-percent:0;mso-height-percent:0;mso-width-relative:page;mso-height-relative:page;v-text-anchor:top" o:gfxdata="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" stroked="f">
-                <v:textbox inset="0,0,0,0">
+              <v:shape id="Pole tekstowe 31" o:spid="_x0000_s1026" type="#_x0000_t202" style="position:absolute;margin-left:38.65pt;margin-top:10pt;width:417.75pt;height:88.0pt;z-index:-251658238;visibility:visible;mso-wrap-style:square;mso-width-percent:0;mso-height-percent:0;mso-wrap-distance-left:9.05pt;mso-wrap-distance-top:0;mso-wrap-distance-right:9.05pt;mso-wrap-distance-bottom:0;mso-position-horizontal:absolute;mso-position-horizontal-relative:text;mso-position-vertical:absolute;mso-position-vertical-relative:text;mso-width-percent:0;mso-height-percent:0;mso-width-relative:page;mso-height-relative:page;v-text-anchor:top" o:gfxdata="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" stroked="f">
+                <v:textbox inset="0,0,0,0" style="mso-fit-shape-to-text:t">
                   <w:txbxContent>
                     <w:p>
                       <w:pPr>
@@ -522,23 +290,6 @@
                     </w:p>
                     <w:p>
                       <w:pPr>
-                        <w:jc w:val="center"/>
-                        <w:rPr>
-                          <w:sz w:val="16"/>
-                        </w:rPr>
-                      </w:pPr>
-                    </w:p>
-                    <w:p>
-                      <w:pPr>
-                        <w:rPr>
-                          <w:rFonts w:ascii="Calibri" w:hAnsi="Calibri" w:cs="Calibri"/>
-                          <w:sz w:val="21"/>
-                          <w:szCs w:val="21"/>
-                        </w:rPr>
-                      </w:pPr>
-                    </w:p>
-                    <w:p>
-                      <w:pPr>
                         <w:rPr>
                           <w:rFonts w:ascii="Segoe UI" w:hAnsi="Segoe UI" w:cs="Segoe UI"/>
                           <w:b/>
@@ -601,221 +352,6 @@
                           <w:lang w:val="en-US"/>
                         </w:rPr>
                         <w:t xml:space="preserve"/>
-                      </w:r>
-                    </w:p>
-                    <w:p>
-                      <w:pPr>
-                        <w:rPr>
-                          <w:rFonts w:ascii="Calibri" w:hAnsi="Calibri" w:cs="Calibri"/>
-                          <w:b/>
-                          <w:sz w:val="21"/>
-                          <w:szCs w:val="21"/>
-                          <w:lang w:val="en-US"/>
-                        </w:rPr>
-                      </w:pPr>
-                      <w:r>
-                        <w:rPr>
-                          <w:rFonts w:ascii="Segoe UI" w:hAnsi="Segoe UI" w:cs="Segoe UI"/>
-                          <w:b/>
-                          <w:sz w:val="19"/>
-                          <w:szCs w:val="19"/>
-                          <w:lang w:val="en-US"/>
-                        </w:rPr>
-                        <w:tab/>
-                      </w:r>
-                      <w:r>
-                        <w:rPr>
-                          <w:rFonts w:ascii="Segoe UI" w:hAnsi="Segoe UI" w:cs="Segoe UI"/>
-                          <w:b/>
-                          <w:color w:val="5F5F5F"/>
-                          <w:sz w:val="19"/>
-                          <w:szCs w:val="19"/>
-                          <w:lang w:val="en-US"/>
-                        </w:rPr>
-                        <w:tab/>
-                      </w:r>
-                      <w:r>
-                        <w:rPr>
-                          <w:rFonts w:ascii="Segoe UI" w:hAnsi="Segoe UI" w:cs="Segoe UI"/>
-                          <w:b/>
-                          <w:color w:val="5F5F5F"/>
-                          <w:sz w:val="19"/>
-                          <w:szCs w:val="19"/>
-                          <w:lang w:val="en-US"/>
-                        </w:rPr>
-                        <w:tab/>
-                      </w:r>
-                      <w:r>
-                        <w:rPr>
-                          <w:rFonts w:ascii="Segoe UI" w:hAnsi="Segoe UI" w:cs="Segoe UI"/>
-                          <w:b/>
-                          <w:color w:val="5F5F5F"/>
-                          <w:sz w:val="19"/>
-                          <w:szCs w:val="19"/>
-                          <w:lang w:val="en-US"/>
-                        </w:rPr>
-                        <w:tab/>
-                      </w:r>
-                      <w:r>
-                        <w:rPr>
-                          <w:rFonts w:ascii="Segoe UI" w:hAnsi="Segoe UI" w:cs="Segoe UI"/>
-                          <w:b/>
-                          <w:color w:val="5F5F5F"/>
-                          <w:sz w:val="19"/>
-                          <w:szCs w:val="19"/>
-                          <w:lang w:val="en-US"/>
-                        </w:rPr>
-                        <w:tab/>
-                        <w:t xml:space="preserve">  </w:t>
-                      </w:r>
-                    </w:p>
-                    <w:p>
-                      <w:pPr>
-                        <w:rPr>
-                          <w:rFonts w:ascii="Calibri" w:hAnsi="Calibri" w:cs="Calibri"/>
-                          <w:b/>
-                          <w:sz w:val="21"/>
-                          <w:szCs w:val="21"/>
-                          <w:lang w:val="en-US"/>
-                        </w:rPr>
-                      </w:pPr>
-                      <w:r>
-                        <w:rPr>
-                          <w:rFonts w:ascii="Calibri" w:hAnsi="Calibri" w:cs="Calibri"/>
-                          <w:b/>
-                          <w:sz w:val="21"/>
-                          <w:szCs w:val="21"/>
-                          <w:lang w:val="en-US"/>
-                        </w:rPr>
-                        <w:tab/>
-                      </w:r>
-                      <w:r>
-                        <w:rPr>
-                          <w:rFonts w:ascii="Calibri" w:hAnsi="Calibri" w:cs="Calibri"/>
-                          <w:b/>
-                          <w:sz w:val="21"/>
-                          <w:szCs w:val="21"/>
-                          <w:lang w:val="en-US"/>
-                        </w:rPr>
-                        <w:tab/>
-                      </w:r>
-                      <w:r>
-                        <w:rPr>
-                          <w:rFonts w:ascii="Calibri" w:hAnsi="Calibri" w:cs="Calibri"/>
-                          <w:b/>
-                          <w:sz w:val="21"/>
-                          <w:szCs w:val="21"/>
-                          <w:lang w:val="en-US"/>
-                        </w:rPr>
-                        <w:tab/>
-                      </w:r>
-                      <w:r>
-                        <w:rPr>
-                          <w:rFonts w:ascii="Calibri" w:hAnsi="Calibri" w:cs="Calibri"/>
-                          <w:b/>
-                          <w:sz w:val="21"/>
-                          <w:szCs w:val="21"/>
-                          <w:lang w:val="en-US"/>
-                        </w:rPr>
-                        <w:tab/>
-                      </w:r>
-                      <w:r>
-                        <w:rPr>
-                          <w:rFonts w:ascii="Calibri" w:hAnsi="Calibri" w:cs="Calibri"/>
-                          <w:b/>
-                          <w:sz w:val="21"/>
-                          <w:szCs w:val="21"/>
-                          <w:lang w:val="en-US"/>
-                        </w:rPr>
-                        <w:tab/>
-                      </w:r>
-                      <w:r>
-                        <w:rPr>
-                          <w:rFonts w:ascii="Calibri" w:hAnsi="Calibri" w:cs="Calibri"/>
-                          <w:b/>
-                          <w:sz w:val="21"/>
-                          <w:szCs w:val="21"/>
-                          <w:lang w:val="en-US"/>
-                        </w:rPr>
-                        <w:tab/>
-                      </w:r>
-                      <w:r>
-                        <w:rPr>
-                          <w:rFonts w:ascii="Calibri" w:hAnsi="Calibri" w:cs="Calibri"/>
-                          <w:b/>
-                          <w:sz w:val="21"/>
-                          <w:szCs w:val="21"/>
-                          <w:lang w:val="en-US"/>
-                        </w:rPr>
-                        <w:tab/>
-                      </w:r>
-                    </w:p>
-                    <w:p>
-                      <w:pPr>
-                        <w:rPr>
-                          <w:lang w:val="en-US"/>
-                        </w:rPr>
-                      </w:pPr>
-                      <w:r>
-                        <w:rPr>
-                          <w:rFonts w:ascii="Calibri" w:hAnsi="Calibri" w:cs="Calibri"/>
-                          <w:b/>
-                          <w:sz w:val="21"/>
-                          <w:szCs w:val="21"/>
-                          <w:lang w:val="en-US"/>
-                        </w:rPr>
-                        <w:tab/>
-                      </w:r>
-                      <w:r>
-                        <w:rPr>
-                          <w:rFonts w:ascii="Calibri" w:hAnsi="Calibri" w:cs="Calibri"/>
-                          <w:b/>
-                          <w:sz w:val="21"/>
-                          <w:szCs w:val="21"/>
-                          <w:lang w:val="en-US"/>
-                        </w:rPr>
-                        <w:tab/>
-                      </w:r>
-                      <w:r>
-                        <w:rPr>
-                          <w:rFonts w:ascii="Calibri" w:hAnsi="Calibri" w:cs="Calibri"/>
-                          <w:b/>
-                          <w:sz w:val="21"/>
-                          <w:szCs w:val="21"/>
-                          <w:lang w:val="en-US"/>
-                        </w:rPr>
-                        <w:tab/>
-                      </w:r>
-                      <w:r>
-                        <w:rPr>
-                          <w:rFonts w:ascii="Calibri" w:hAnsi="Calibri" w:cs="Calibri"/>
-                          <w:b/>
-                          <w:sz w:val="21"/>
-                          <w:szCs w:val="21"/>
-                          <w:lang w:val="en-US"/>
-                        </w:rPr>
-                        <w:tab/>
-                      </w:r>
-                      <w:r>
-                        <w:rPr>
-                          <w:rFonts w:ascii="Calibri" w:hAnsi="Calibri" w:cs="Calibri"/>
-                          <w:b/>
-                          <w:sz w:val="21"/>
-                          <w:szCs w:val="21"/>
-                          <w:lang w:val="en-US"/>
-                        </w:rPr>
-                        <w:tab/>
-                      </w:r>
-                      <w:r>
-                        <w:rPr>
-                          <w:rFonts w:ascii="Calibri" w:hAnsi="Calibri" w:cs="Calibri"/>
-                          <w:b/>
-                          <w:sz w:val="21"/>
-                          <w:szCs w:val="21"/>
-                          <w:lang w:val="en-US"/>
-                        </w:rPr>
-                        <w:tab/>
-                        <w:t xml:space="preserve">       </w:t>
                       </w:r>
                     </w:p>
                   </w:txbxContent>
@@ -6826,6 +6362,7 @@
     <w:p>
       <w:pPr>
         <w:pStyle w:val="Iza1"/>
+        <w:keepNext w:val="true"/>
         <w:spacing w:line="276" w:lineRule="auto"/>
         <w:outlineLvl w:val="0"/>
         <w:rPr>
@@ -6858,6 +6395,7 @@
     </w:p>
     <w:p>
       <w:pPr>
+        <w:keepNext w:val="true"/>
         <w:spacing w:line="276" w:lineRule="auto"/>
         <w:jc w:val="both"/>
         <w:rPr>
@@ -6869,6 +6407,7 @@
     </w:p>
     <w:p>
       <w:pPr>
+        <w:keepNext w:val="true"/>
         <w:spacing w:line="276" w:lineRule="auto"/>
         <w:jc w:val="both"/>
         <w:rPr>
@@ -7002,6 +6541,7 @@
     <w:p>
       <w:pPr>
         <w:pStyle w:val="Tekstpodstawowy22"/>
+        <w:spacing w:before="0" w:after="0" w:line="240" w:lineRule="auto"/>
       </w:pPr>
       <w:r>
         <w:t xml:space="preserve">{biuro}</w:t>

</xml_diff>

<commit_message>
feat(operat): szablon z tabelą działów księgi gruntu w §8.2; nowy pin szablonu (ADR-021)
</commit_message>
<xml_diff>
--- a/apps/web/templates/operat-szablon.docx
+++ b/apps/web/templates/operat-szablon.docx
@@ -9523,6 +9523,213 @@
         <w:pStyle w:val="Tekstpodstawowy22"/>
       </w:pPr>
       <w:r>
+        <w:t xml:space="preserve">{#ma_tresc_gruntu}</w:t>
+      </w:r>
+    </w:p>
+    <w:tbl>
+      <w:tblPr>
+        <w:tblW w:w="8961" w:type="dxa"/>
+        <w:tblBorders>
+          <w:top w:val="single" w:sz="4" w:space="0" w:color="BFBFBF"/>
+          <w:left w:val="single" w:sz="4" w:space="0" w:color="BFBFBF"/>
+          <w:bottom w:val="single" w:sz="4" w:space="0" w:color="BFBFBF"/>
+          <w:right w:val="single" w:sz="4" w:space="0" w:color="BFBFBF"/>
+          <w:insideH w:val="single" w:sz="4" w:space="0" w:color="BFBFBF"/>
+          <w:insideV w:val="single" w:sz="4" w:space="0" w:color="BFBFBF"/>
+        </w:tblBorders>
+      </w:tblPr>
+      <w:tblGrid>
+        <w:gridCol w:w="3400"/>
+        <w:gridCol w:w="600"/>
+        <w:gridCol w:w="4961"/>
+      </w:tblGrid>
+      <w:tr>
+        <w:tc>
+          <w:tcPr>
+            <w:tcW w:w="3400" w:type="dxa"/>
+          </w:tcPr>
+          <w:p>
+            <w:pPr>
+              <w:pStyle w:val="Tekstpodstawowy"/>
+            </w:pPr>
+            <w:r>
+              <w:rPr>
+                <w:b/>
+                <w:sz w:val="16"/>
+                <w:szCs w:val="16"/>
+              </w:rPr>
+              <w:t xml:space="preserve">{#ksiega_gruntu_wiersze}{#typ == 'dzial'}{kol1}</w:t>
+            </w:r>
+          </w:p>
+        </w:tc>
+        <w:tc>
+          <w:tcPr>
+            <w:tcW w:w="600" w:type="dxa"/>
+          </w:tcPr>
+          <w:p>
+            <w:pPr>
+              <w:pStyle w:val="Tekstpodstawowy"/>
+            </w:pPr>
+            <w:r>
+              <w:rPr>
+                <w:b/>
+                <w:sz w:val="16"/>
+                <w:szCs w:val="16"/>
+              </w:rPr>
+              <w:t xml:space="preserve"/>
+            </w:r>
+          </w:p>
+        </w:tc>
+        <w:tc>
+          <w:tcPr>
+            <w:tcW w:w="4961" w:type="dxa"/>
+          </w:tcPr>
+          <w:p>
+            <w:pPr>
+              <w:pStyle w:val="Tekstpodstawowy"/>
+            </w:pPr>
+            <w:r>
+              <w:rPr>
+                <w:b/>
+                <w:sz w:val="16"/>
+                <w:szCs w:val="16"/>
+              </w:rPr>
+              <w:t xml:space="preserve">{/}</w:t>
+            </w:r>
+          </w:p>
+        </w:tc>
+      </w:tr>
+      <w:tr>
+        <w:tc>
+          <w:tcPr>
+            <w:tcW w:w="3400" w:type="dxa"/>
+          </w:tcPr>
+          <w:p>
+            <w:pPr>
+              <w:pStyle w:val="Tekstpodstawowy"/>
+            </w:pPr>
+            <w:r>
+              <w:rPr>
+                <w:i/>
+                <w:sz w:val="16"/>
+                <w:szCs w:val="16"/>
+              </w:rPr>
+              <w:t xml:space="preserve">{#typ == 'tabela'}{kol1}</w:t>
+            </w:r>
+          </w:p>
+        </w:tc>
+        <w:tc>
+          <w:tcPr>
+            <w:tcW w:w="600" w:type="dxa"/>
+          </w:tcPr>
+          <w:p>
+            <w:pPr>
+              <w:pStyle w:val="Tekstpodstawowy"/>
+            </w:pPr>
+            <w:r>
+              <w:rPr>
+                <w:i/>
+                <w:sz w:val="16"/>
+                <w:szCs w:val="16"/>
+              </w:rPr>
+              <w:t xml:space="preserve"/>
+            </w:r>
+          </w:p>
+        </w:tc>
+        <w:tc>
+          <w:tcPr>
+            <w:tcW w:w="4961" w:type="dxa"/>
+          </w:tcPr>
+          <w:p>
+            <w:pPr>
+              <w:pStyle w:val="Tekstpodstawowy"/>
+            </w:pPr>
+            <w:r>
+              <w:rPr>
+                <w:i/>
+                <w:sz w:val="16"/>
+                <w:szCs w:val="16"/>
+              </w:rPr>
+              <w:t xml:space="preserve">{/}</w:t>
+            </w:r>
+          </w:p>
+        </w:tc>
+      </w:tr>
+      <w:tr>
+        <w:tc>
+          <w:tcPr>
+            <w:tcW w:w="3400" w:type="dxa"/>
+          </w:tcPr>
+          <w:p>
+            <w:pPr>
+              <w:pStyle w:val="Tekstpodstawowy"/>
+            </w:pPr>
+            <w:r>
+              <w:rPr>
+                <w:sz w:val="16"/>
+                <w:szCs w:val="16"/>
+              </w:rPr>
+              <w:t xml:space="preserve">{^typ == 'dzial'}{^typ == 'tabela'}{kol1}</w:t>
+            </w:r>
+          </w:p>
+        </w:tc>
+        <w:tc>
+          <w:tcPr>
+            <w:tcW w:w="600" w:type="dxa"/>
+          </w:tcPr>
+          <w:p>
+            <w:pPr>
+              <w:pStyle w:val="Tekstpodstawowy"/>
+            </w:pPr>
+            <w:r>
+              <w:rPr>
+                <w:sz w:val="16"/>
+                <w:szCs w:val="16"/>
+              </w:rPr>
+              <w:t xml:space="preserve">{kol2}</w:t>
+            </w:r>
+          </w:p>
+        </w:tc>
+        <w:tc>
+          <w:tcPr>
+            <w:tcW w:w="4961" w:type="dxa"/>
+          </w:tcPr>
+          <w:p>
+            <w:pPr>
+              <w:pStyle w:val="Tekstpodstawowy"/>
+            </w:pPr>
+            <w:r>
+              <w:rPr>
+                <w:sz w:val="16"/>
+                <w:szCs w:val="16"/>
+              </w:rPr>
+              <w:t xml:space="preserve">{kol3}{/}{/}{/ksiega_gruntu_wiersze}</w:t>
+            </w:r>
+          </w:p>
+        </w:tc>
+      </w:tr>
+    </w:tbl>
+    <w:p>
+      <w:pPr>
+        <w:pStyle w:val="Tekstpodstawowy22"/>
+      </w:pPr>
+      <w:r>
+        <w:t xml:space="preserve">{/ma_tresc_gruntu}</w:t>
+      </w:r>
+    </w:p>
+    <w:p>
+      <w:pPr>
+        <w:pStyle w:val="Tekstpodstawowy22"/>
+      </w:pPr>
+      <w:r>
+        <w:t xml:space="preserve">{^ma_tresc_gruntu}</w:t>
+      </w:r>
+    </w:p>
+    <w:p>
+      <w:pPr>
+        <w:pStyle w:val="Tekstpodstawowy22"/>
+      </w:pPr>
+      <w:r>
         <w:t xml:space="preserve">{#dzial3_opis_gruntu}</w:t>
       </w:r>
     </w:p>
@@ -9564,6 +9771,14 @@
       </w:pPr>
       <w:r>
         <w:t xml:space="preserve">{/dzial4_opis_gruntu}</w:t>
+      </w:r>
+    </w:p>
+    <w:p>
+      <w:pPr>
+        <w:pStyle w:val="Tekstpodstawowy22"/>
+      </w:pPr>
+      <w:r>
+        <w:t xml:space="preserve">{/ma_tresc_gruntu}</w:t>
       </w:r>
     </w:p>
     <w:p>

</xml_diff>

<commit_message>
feat(operat): szablon ze zdaniem o zakresie księgi gruntu (wiki a23642e)
Binarka z pnpm --filter web template:build, generator z wiki a23642e (gałąź PR #98, decyzja
koordynatora 26.09). Nowy pin TEMPLATE_SHA256 6dbdd2e3…aac9, tagi zakres_ograniczony_gruntu
w liście F-12. Rozpakowany word/document.xml różni się od poprzedniej binarki wyłącznie
trzema wstawionymi akapitami (T7 między protokołem a tabelą księgi gruntu).
</commit_message>
<xml_diff>
--- a/apps/web/templates/operat-szablon.docx
+++ b/apps/web/templates/operat-szablon.docx
@@ -9516,6 +9516,30 @@
       </w:pPr>
       <w:r>
         <w:t xml:space="preserve">{protokol_ksiegi_gruntu}</w:t>
+      </w:r>
+    </w:p>
+    <w:p>
+      <w:pPr>
+        <w:pStyle w:val="Tekstpodstawowy22"/>
+      </w:pPr>
+      <w:r>
+        <w:t xml:space="preserve">{#zakres_ograniczony_gruntu}</w:t>
+      </w:r>
+    </w:p>
+    <w:p>
+      <w:pPr>
+        <w:pStyle w:val="Tekstpodstawowy22"/>
+      </w:pPr>
+      <w:r>
+        <w:t xml:space="preserve">Z uwagi na obszerność zapisów księgi wieczystej w protokole zawarto wpisy dotyczące jedynie przedmiotowej nieruchomości.</w:t>
+      </w:r>
+    </w:p>
+    <w:p>
+      <w:pPr>
+        <w:pStyle w:val="Tekstpodstawowy22"/>
+      </w:pPr>
+      <w:r>
+        <w:t xml:space="preserve">{/zakres_ograniczony_gruntu}</w:t>
       </w:r>
     </w:p>
     <w:p>

</xml_diff>